<commit_message>
Minuta Francisco: inclui Banco Bradesco S.A. e Banco do Brasil S.A. no polo passivo
Co-Authored-By: Claude Opus 5.5 <noreply@anthropic.com>
Claude-Session: https://claude.ai/code/session_01EVatDVNz5NJ1N9yNUnzyHx
</commit_message>
<xml_diff>
--- a/Francisco Bernardo Sousa Santos - Superendividamento/Inicial - Repactuação de dívidas - Francisco Bernardo Sousa Santos (minuta).docx
+++ b/Francisco Bernardo Sousa Santos - Superendividamento/Inicial - Repactuação de dívidas - Francisco Bernardo Sousa Santos (minuta).docx
@@ -128,16 +128,15 @@
         <w:rPr>
           <w:b/>
           <w:i w:val="0"/>
-          <w:highlight w:val="yellow"/>
         </w:rPr>
-        <w:t>[NOME DO CREDOR 1]</w:t>
+        <w:t>BANCO BRADESCO S.A.</w:t>
       </w:r>
       <w:r>
         <w:rPr>
           <w:b w:val="0"/>
           <w:i w:val="0"/>
         </w:rPr>
-        <w:t xml:space="preserve">, pessoa jurídica de direito privado, inscrita no CNPJ nº </w:t>
+        <w:t xml:space="preserve">, pessoa jurídica de direito privado, inscrita no CNPJ nº 60.746.948/0001-12, com sede no Núcleo Cidade de Deus, s/n, Vila Yara, Osasco – SP, CEP 06029-900, </w:t>
       </w:r>
       <w:r>
         <w:rPr>
@@ -145,22 +144,7 @@
           <w:i w:val="0"/>
           <w:highlight w:val="yellow"/>
         </w:rPr>
-        <w:t>[__]</w:t>
-      </w:r>
-      <w:r>
-        <w:rPr>
-          <w:b w:val="0"/>
-          <w:i w:val="0"/>
-        </w:rPr>
-        <w:t xml:space="preserve">, com endereço à </w:t>
-      </w:r>
-      <w:r>
-        <w:rPr>
-          <w:b w:val="0"/>
-          <w:i w:val="0"/>
-          <w:highlight w:val="yellow"/>
-        </w:rPr>
-        <w:t>[__]</w:t>
+        <w:t>[endereço eletrônico para citação]</w:t>
       </w:r>
       <w:r>
         <w:rPr>
@@ -179,16 +163,15 @@
         <w:rPr>
           <w:b/>
           <w:i w:val="0"/>
-          <w:highlight w:val="yellow"/>
         </w:rPr>
-        <w:t>[NOME DO CREDOR 2]</w:t>
+        <w:t>BANCO DO BRASIL S.A.</w:t>
       </w:r>
       <w:r>
         <w:rPr>
           <w:b w:val="0"/>
           <w:i w:val="0"/>
         </w:rPr>
-        <w:t xml:space="preserve">, pessoa jurídica de direito privado, inscrita no CNPJ nº </w:t>
+        <w:t xml:space="preserve">, sociedade de economia mista, inscrita no CNPJ nº 00.000.000/0001-91, com sede no SAUN, Quadra 5, Lote B, Torre I, Edifício Banco do Brasil, Asa Norte, Brasília – DF, CEP 70040-912, </w:t>
       </w:r>
       <w:r>
         <w:rPr>
@@ -196,73 +179,7 @@
           <w:i w:val="0"/>
           <w:highlight w:val="yellow"/>
         </w:rPr>
-        <w:t>[__]</w:t>
-      </w:r>
-      <w:r>
-        <w:rPr>
-          <w:b w:val="0"/>
-          <w:i w:val="0"/>
-        </w:rPr>
-        <w:t xml:space="preserve">, com endereço à </w:t>
-      </w:r>
-      <w:r>
-        <w:rPr>
-          <w:b w:val="0"/>
-          <w:i w:val="0"/>
-          <w:highlight w:val="yellow"/>
-        </w:rPr>
-        <w:t>[__]</w:t>
-      </w:r>
-      <w:r>
-        <w:rPr>
-          <w:b w:val="0"/>
-          <w:i w:val="0"/>
-        </w:rPr>
-        <w:t>;</w:t>
-      </w:r>
-    </w:p>
-    <w:p>
-      <w:pPr>
-        <w:ind w:firstLine="1417"/>
-        <w:jc w:val="both"/>
-      </w:pPr>
-      <w:r>
-        <w:rPr>
-          <w:b/>
-          <w:i w:val="0"/>
-          <w:highlight w:val="yellow"/>
-        </w:rPr>
-        <w:t>[NOME DO CREDOR 3]</w:t>
-      </w:r>
-      <w:r>
-        <w:rPr>
-          <w:b w:val="0"/>
-          <w:i w:val="0"/>
-        </w:rPr>
-        <w:t xml:space="preserve">, pessoa jurídica de direito privado, inscrita no CNPJ nº </w:t>
-      </w:r>
-      <w:r>
-        <w:rPr>
-          <w:b w:val="0"/>
-          <w:i w:val="0"/>
-          <w:highlight w:val="yellow"/>
-        </w:rPr>
-        <w:t>[__]</w:t>
-      </w:r>
-      <w:r>
-        <w:rPr>
-          <w:b w:val="0"/>
-          <w:i w:val="0"/>
-        </w:rPr>
-        <w:t xml:space="preserve">, com endereço à </w:t>
-      </w:r>
-      <w:r>
-        <w:rPr>
-          <w:b w:val="0"/>
-          <w:i w:val="0"/>
-          <w:highlight w:val="yellow"/>
-        </w:rPr>
-        <w:t>[__]</w:t>
+        <w:t>[endereço eletrônico para citação]</w:t>
       </w:r>
       <w:r>
         <w:rPr>
@@ -467,9 +384,8 @@
                 <w:b w:val="0"/>
                 <w:i w:val="0"/>
                 <w:sz w:val="20"/>
-                <w:highlight w:val="yellow"/>
               </w:rPr>
-              <w:t>[credor 1]</w:t>
+              <w:t>Banco Bradesco S.A.</w:t>
             </w:r>
           </w:p>
         </w:tc>
@@ -488,7 +404,7 @@
                 <w:sz w:val="20"/>
                 <w:highlight w:val="yellow"/>
               </w:rPr>
-              <w:t>[empréstimo/cartão/consignado]</w:t>
+              <w:t>[contrato nº __ – empréstimo/cartão/consignado]</w:t>
             </w:r>
           </w:p>
         </w:tc>
@@ -588,9 +504,8 @@
                 <w:b w:val="0"/>
                 <w:i w:val="0"/>
                 <w:sz w:val="20"/>
-                <w:highlight w:val="yellow"/>
               </w:rPr>
-              <w:t>[credor 2]</w:t>
+              <w:t>Banco do Brasil S.A.</w:t>
             </w:r>
           </w:p>
         </w:tc>
@@ -609,128 +524,7 @@
                 <w:sz w:val="20"/>
                 <w:highlight w:val="yellow"/>
               </w:rPr>
-              <w:t>[__]</w:t>
-            </w:r>
-          </w:p>
-        </w:tc>
-        <w:tc>
-          <w:tcPr>
-            <w:tcW w:type="dxa" w:w="1814"/>
-          </w:tcPr>
-          <w:p>
-            <w:pPr>
-              <w:spacing w:line="240" w:lineRule="auto"/>
-            </w:pPr>
-            <w:r>
-              <w:rPr>
-                <w:b w:val="0"/>
-                <w:i w:val="0"/>
-                <w:sz w:val="20"/>
-              </w:rPr>
-              <w:t xml:space="preserve">R$ </w:t>
-            </w:r>
-            <w:r>
-              <w:rPr>
-                <w:b w:val="0"/>
-                <w:i w:val="0"/>
-                <w:sz w:val="20"/>
-                <w:highlight w:val="yellow"/>
-              </w:rPr>
-              <w:t>[__]</w:t>
-            </w:r>
-          </w:p>
-        </w:tc>
-        <w:tc>
-          <w:tcPr>
-            <w:tcW w:type="dxa" w:w="1814"/>
-          </w:tcPr>
-          <w:p>
-            <w:pPr>
-              <w:spacing w:line="240" w:lineRule="auto"/>
-            </w:pPr>
-            <w:r>
-              <w:rPr>
-                <w:b w:val="0"/>
-                <w:i w:val="0"/>
-                <w:sz w:val="20"/>
-              </w:rPr>
-              <w:t xml:space="preserve">R$ </w:t>
-            </w:r>
-            <w:r>
-              <w:rPr>
-                <w:b w:val="0"/>
-                <w:i w:val="0"/>
-                <w:sz w:val="20"/>
-                <w:highlight w:val="yellow"/>
-              </w:rPr>
-              <w:t>[__]</w:t>
-            </w:r>
-          </w:p>
-        </w:tc>
-        <w:tc>
-          <w:tcPr>
-            <w:tcW w:type="dxa" w:w="1814"/>
-          </w:tcPr>
-          <w:p>
-            <w:pPr>
-              <w:spacing w:line="240" w:lineRule="auto"/>
-            </w:pPr>
-            <w:r>
-              <w:rPr>
-                <w:b w:val="0"/>
-                <w:i w:val="0"/>
-                <w:sz w:val="20"/>
-              </w:rPr>
-              <w:t xml:space="preserve">R$ </w:t>
-            </w:r>
-            <w:r>
-              <w:rPr>
-                <w:b w:val="0"/>
-                <w:i w:val="0"/>
-                <w:sz w:val="20"/>
-                <w:highlight w:val="yellow"/>
-              </w:rPr>
-              <w:t>[__]</w:t>
-            </w:r>
-          </w:p>
-        </w:tc>
-      </w:tr>
-      <w:tr>
-        <w:tc>
-          <w:tcPr>
-            <w:tcW w:type="dxa" w:w="1814"/>
-          </w:tcPr>
-          <w:p>
-            <w:pPr>
-              <w:spacing w:line="240" w:lineRule="auto"/>
-            </w:pPr>
-            <w:r>
-              <w:rPr>
-                <w:b w:val="0"/>
-                <w:i w:val="0"/>
-                <w:sz w:val="20"/>
-                <w:highlight w:val="yellow"/>
-              </w:rPr>
-              <w:t>[credor 3]</w:t>
-            </w:r>
-          </w:p>
-        </w:tc>
-        <w:tc>
-          <w:tcPr>
-            <w:tcW w:type="dxa" w:w="1814"/>
-          </w:tcPr>
-          <w:p>
-            <w:pPr>
-              <w:spacing w:line="240" w:lineRule="auto"/>
-            </w:pPr>
-            <w:r>
-              <w:rPr>
-                <w:b w:val="0"/>
-                <w:i w:val="0"/>
-                <w:sz w:val="20"/>
-                <w:highlight w:val="yellow"/>
-              </w:rPr>
-              <w:t>[__]</w:t>
+              <w:t>[contrato nº __ – empréstimo/cartão/consignado]</w:t>
             </w:r>
           </w:p>
         </w:tc>
@@ -2077,9 +1871,8 @@
                 <w:b w:val="0"/>
                 <w:i w:val="0"/>
                 <w:sz w:val="20"/>
-                <w:highlight w:val="yellow"/>
               </w:rPr>
-              <w:t>[credor 1]</w:t>
+              <w:t>Banco Bradesco S.A.</w:t>
             </w:r>
           </w:p>
         </w:tc>
@@ -2179,111 +1972,8 @@
                 <w:b w:val="0"/>
                 <w:i w:val="0"/>
                 <w:sz w:val="20"/>
-                <w:highlight w:val="yellow"/>
               </w:rPr>
-              <w:t>[credor 2]</w:t>
-            </w:r>
-          </w:p>
-        </w:tc>
-        <w:tc>
-          <w:tcPr>
-            <w:tcW w:type="dxa" w:w="2268"/>
-          </w:tcPr>
-          <w:p>
-            <w:pPr>
-              <w:spacing w:line="240" w:lineRule="auto"/>
-            </w:pPr>
-            <w:r>
-              <w:rPr>
-                <w:b w:val="0"/>
-                <w:i w:val="0"/>
-                <w:sz w:val="20"/>
-              </w:rPr>
-              <w:t xml:space="preserve">R$ </w:t>
-            </w:r>
-            <w:r>
-              <w:rPr>
-                <w:b w:val="0"/>
-                <w:i w:val="0"/>
-                <w:sz w:val="20"/>
-                <w:highlight w:val="yellow"/>
-              </w:rPr>
-              <w:t>[__]</w:t>
-            </w:r>
-          </w:p>
-        </w:tc>
-        <w:tc>
-          <w:tcPr>
-            <w:tcW w:type="dxa" w:w="2268"/>
-          </w:tcPr>
-          <w:p>
-            <w:pPr>
-              <w:spacing w:line="240" w:lineRule="auto"/>
-            </w:pPr>
-            <w:r>
-              <w:rPr>
-                <w:b w:val="0"/>
-                <w:i w:val="0"/>
-                <w:sz w:val="20"/>
-                <w:highlight w:val="yellow"/>
-              </w:rPr>
-              <w:t>[__]</w:t>
-            </w:r>
-            <w:r>
-              <w:rPr>
-                <w:b w:val="0"/>
-                <w:i w:val="0"/>
-                <w:sz w:val="20"/>
-              </w:rPr>
-              <w:t>%</w:t>
-            </w:r>
-          </w:p>
-        </w:tc>
-        <w:tc>
-          <w:tcPr>
-            <w:tcW w:type="dxa" w:w="2268"/>
-          </w:tcPr>
-          <w:p>
-            <w:pPr>
-              <w:spacing w:line="240" w:lineRule="auto"/>
-            </w:pPr>
-            <w:r>
-              <w:rPr>
-                <w:b w:val="0"/>
-                <w:i w:val="0"/>
-                <w:sz w:val="20"/>
-              </w:rPr>
-              <w:t xml:space="preserve">R$ </w:t>
-            </w:r>
-            <w:r>
-              <w:rPr>
-                <w:b w:val="0"/>
-                <w:i w:val="0"/>
-                <w:sz w:val="20"/>
-                <w:highlight w:val="yellow"/>
-              </w:rPr>
-              <w:t>[__]</w:t>
-            </w:r>
-          </w:p>
-        </w:tc>
-      </w:tr>
-      <w:tr>
-        <w:tc>
-          <w:tcPr>
-            <w:tcW w:type="dxa" w:w="2268"/>
-          </w:tcPr>
-          <w:p>
-            <w:pPr>
-              <w:spacing w:line="240" w:lineRule="auto"/>
-            </w:pPr>
-            <w:r>
-              <w:rPr>
-                <w:b w:val="0"/>
-                <w:i w:val="0"/>
-                <w:sz w:val="20"/>
-                <w:highlight w:val="yellow"/>
-              </w:rPr>
-              <w:t>[credor 3]</w:t>
+              <w:t>Banco do Brasil S.A.</w:t>
             </w:r>
           </w:p>
         </w:tc>

</xml_diff>

<commit_message>
Minuta Francisco: preenche renda, consignados, débitos em conta e plano com base nos holerites e extratos
Co-Authored-By: Claude Opus 5.5 <noreply@anthropic.com>
Claude-Session: https://claude.ai/code/session_01EVatDVNz5NJ1N9yNUnzyHx
</commit_message>
<xml_diff>
--- a/Francisco Bernardo Sousa Santos - Superendividamento/Inicial - Repactuação de dívidas - Francisco Bernardo Sousa Santos (minuta).docx
+++ b/Francisco Bernardo Sousa Santos - Superendividamento/Inicial - Repactuação de dívidas - Francisco Bernardo Sousa Santos (minuta).docx
@@ -91,7 +91,7 @@
           <w:b w:val="0"/>
           <w:i w:val="0"/>
         </w:rPr>
-        <w:t>, onde recebe intimações, vem, respeitosamente, à presença de Vossa Excelência, com fundamento nos arts. 6º, XI e XII, 54-A, 104-A e 104-B do Código de Defesa do Consumidor, propor a presente</w:t>
+        <w:t>, onde recebe intimações, vem, respeitosamente, à presença de Vossa Excelência, com fundamento nos arts. 6º, XI e XII, 54-A, 54-C, 54-D, 104-A e 104-B do Código de Defesa do Consumidor (incluídos pela Lei nº 14.181/2021) e no art. 300 do Código de Processo Civil, propor a presente</w:t>
       </w:r>
     </w:p>
     <w:p>
@@ -129,14 +129,14 @@
           <w:b/>
           <w:i w:val="0"/>
         </w:rPr>
-        <w:t>BANCO BRADESCO S.A.</w:t>
+        <w:t>BANCO DO BRASIL S.A.</w:t>
       </w:r>
       <w:r>
         <w:rPr>
           <w:b w:val="0"/>
           <w:i w:val="0"/>
         </w:rPr>
-        <w:t xml:space="preserve">, pessoa jurídica de direito privado, inscrita no CNPJ nº 60.746.948/0001-12, com sede no Núcleo Cidade de Deus, s/n, Vila Yara, Osasco – SP, CEP 06029-900, </w:t>
+        <w:t xml:space="preserve">, sociedade de economia mista, inscrita no CNPJ nº 00.000.000/0001-91, com sede no SAUN, Quadra 5, Lote B, Torre I, Edifício Banco do Brasil, Asa Norte, Brasília – DF, CEP 70040-912, </w:t>
       </w:r>
       <w:r>
         <w:rPr>
@@ -144,7 +144,7 @@
           <w:i w:val="0"/>
           <w:highlight w:val="yellow"/>
         </w:rPr>
-        <w:t>[endereço eletrônico para citação]</w:t>
+        <w:t>[endereço da agência 2298-5 para citação, se preferir]</w:t>
       </w:r>
       <w:r>
         <w:rPr>
@@ -164,14 +164,14 @@
           <w:b/>
           <w:i w:val="0"/>
         </w:rPr>
-        <w:t>BANCO DO BRASIL S.A.</w:t>
+        <w:t>BANCO BRADESCO S.A.</w:t>
       </w:r>
       <w:r>
         <w:rPr>
           <w:b w:val="0"/>
           <w:i w:val="0"/>
         </w:rPr>
-        <w:t xml:space="preserve">, sociedade de economia mista, inscrita no CNPJ nº 00.000.000/0001-91, com sede no SAUN, Quadra 5, Lote B, Torre I, Edifício Banco do Brasil, Asa Norte, Brasília – DF, CEP 70040-912, </w:t>
+        <w:t xml:space="preserve">, pessoa jurídica de direito privado, inscrita no CNPJ nº 60.746.948/0001-12, com sede no Núcleo Cidade de Deus, s/n, Vila Yara, Osasco – SP, CEP 06029-900, </w:t>
       </w:r>
       <w:r>
         <w:rPr>
@@ -179,7 +179,7 @@
           <w:i w:val="0"/>
           <w:highlight w:val="yellow"/>
         </w:rPr>
-        <w:t>[endereço eletrônico para citação]</w:t>
+        <w:t>[endereço da agência 5792 para citação, se preferir]</w:t>
       </w:r>
       <w:r>
         <w:rPr>
@@ -211,7 +211,7 @@
           <w:b/>
           <w:i w:val="0"/>
         </w:rPr>
-        <w:t>1. DA GRATUIDADE DA JUSTIÇA</w:t>
+        <w:t>1. DA COMPETÊNCIA</w:t>
       </w:r>
     </w:p>
     <w:p>
@@ -224,7 +224,7 @@
           <w:b w:val="0"/>
           <w:i w:val="0"/>
         </w:rPr>
-        <w:t>O Autor não dispõe de recursos para arcar com as custas, despesas processuais e honorários advocatícios sem prejuízo do próprio sustento e de sua família, como evidenciam os documentos de renda e de despesas anexos e a própria situação de superendividamento narrada nesta inicial. Requer, assim, os benefícios da gratuidade da justiça, nos termos do art. 5º, LXXIV, da Constituição Federal e dos arts. 98 e 99, § 3º, do CPC.</w:t>
+        <w:t>A demanda é proposta no foro do domicílio do consumidor, nos termos do art. 101, I, do CDC.</w:t>
       </w:r>
     </w:p>
     <w:p>
@@ -236,7 +236,7 @@
           <w:b/>
           <w:i w:val="0"/>
         </w:rPr>
-        <w:t>2. DOS FATOS</w:t>
+        <w:t>2. DA GRATUIDADE DA JUSTIÇA</w:t>
       </w:r>
     </w:p>
     <w:p>
@@ -249,7 +249,22 @@
           <w:b w:val="0"/>
           <w:i w:val="0"/>
         </w:rPr>
-        <w:t>O Autor é pessoa natural, consumidor de boa-fé que, por circunstâncias supervenientes e alheias à sua vontade, viu-se em situação de superendividamento, consistente na impossibilidade manifesta de pagar a totalidade de suas dívidas de consumo sem comprometer o seu mínimo existencial.</w:t>
+        <w:t xml:space="preserve">Embora o Autor seja servidor público com dois vínculos, sua remuneração bruta não reflete sua real capacidade econômica. Como se demonstrará a seguir, descontados os tributos, a contribuição previdenciária, a pensão alimentícia judicial e os empréstimos consignados, o Autor recebeu em conta, em maio/2026, apenas R$ 4.656,83 — valor que é integralmente absorvido, no mesmo dia, pelos débitos automáticos de outros empréstimos lançados pelo próprio Banco do Brasil, mantendo o saldo de sua conta corrente permanentemente zerado, como provam os extratos de março a setembro/2026 (docs. </w:t>
+      </w:r>
+      <w:r>
+        <w:rPr>
+          <w:b w:val="0"/>
+          <w:i w:val="0"/>
+          <w:highlight w:val="yellow"/>
+        </w:rPr>
+        <w:t>[__]</w:t>
+      </w:r>
+      <w:r>
+        <w:rPr>
+          <w:b w:val="0"/>
+          <w:i w:val="0"/>
+        </w:rPr>
+        <w:t>).</w:t>
       </w:r>
     </w:p>
     <w:p>
@@ -262,7 +277,126 @@
           <w:b w:val="0"/>
           <w:i w:val="0"/>
         </w:rPr>
-        <w:t>Atualmente, o Autor possui as seguintes obrigações vencidas e vincendas:</w:t>
+        <w:t>A hipossuficiência deve ser aferida pela renda efetivamente disponível, e não pela remuneração bruta. Requer, assim, a concessão da gratuidade da justiça (art. 5º, LXXIV, da CF e arts. 98 e 99 do CPC). Subsidiariamente, requer a concessão parcial do benefício ou o parcelamento das custas iniciais (art. 98, §§ 5º e 6º, do CPC).</w:t>
+      </w:r>
+    </w:p>
+    <w:p>
+      <w:pPr>
+        <w:spacing w:before="240"/>
+      </w:pPr>
+      <w:r>
+        <w:rPr>
+          <w:b/>
+          <w:i w:val="0"/>
+        </w:rPr>
+        <w:t>3. DOS FATOS</w:t>
+      </w:r>
+    </w:p>
+    <w:p>
+      <w:pPr>
+        <w:spacing w:before="240"/>
+      </w:pPr>
+      <w:r>
+        <w:rPr>
+          <w:b/>
+          <w:i w:val="0"/>
+        </w:rPr>
+        <w:t>3.1. Da renda do Autor</w:t>
+      </w:r>
+    </w:p>
+    <w:p>
+      <w:pPr>
+        <w:ind w:firstLine="1417"/>
+        <w:jc w:val="both"/>
+      </w:pPr>
+      <w:r>
+        <w:rPr>
+          <w:b w:val="0"/>
+          <w:i w:val="0"/>
+        </w:rPr>
+        <w:t>O Autor é professor efetivo em dois municípios piauienses:</w:t>
+      </w:r>
+    </w:p>
+    <w:p>
+      <w:pPr>
+        <w:ind w:left="850" w:hanging="283"/>
+        <w:jc w:val="both"/>
+      </w:pPr>
+      <w:r>
+        <w:rPr>
+          <w:b w:val="0"/>
+          <w:i w:val="0"/>
+        </w:rPr>
+        <w:t xml:space="preserve">• </w:t>
+      </w:r>
+      <w:r>
+        <w:rPr>
+          <w:b/>
+          <w:i w:val="0"/>
+        </w:rPr>
+        <w:t>Município de Miguel Alves</w:t>
+      </w:r>
+      <w:r>
+        <w:rPr>
+          <w:b w:val="0"/>
+          <w:i w:val="0"/>
+        </w:rPr>
+        <w:t xml:space="preserve"> (Secretaria Municipal de Educação, CNPJ 06.553.614/0004-20), matrícula nº 50-1, cargo de Professor Classe C, Nível V, 40h, admitido em 08/03/2005;</w:t>
+      </w:r>
+    </w:p>
+    <w:p>
+      <w:pPr>
+        <w:ind w:left="850" w:hanging="283"/>
+        <w:jc w:val="both"/>
+      </w:pPr>
+      <w:r>
+        <w:rPr>
+          <w:b w:val="0"/>
+          <w:i w:val="0"/>
+        </w:rPr>
+        <w:t xml:space="preserve">• </w:t>
+      </w:r>
+      <w:r>
+        <w:rPr>
+          <w:b/>
+          <w:i w:val="0"/>
+        </w:rPr>
+        <w:t>Município de União</w:t>
+      </w:r>
+      <w:r>
+        <w:rPr>
+          <w:b w:val="0"/>
+          <w:i w:val="0"/>
+        </w:rPr>
+        <w:t xml:space="preserve"> (CNPJ 06.553.606/0001-30), matrícula nº 007107, cargo de Professor C I, 20h, admitido em 01/03/2016.</w:t>
+      </w:r>
+    </w:p>
+    <w:p>
+      <w:pPr>
+        <w:ind w:firstLine="1417"/>
+        <w:jc w:val="both"/>
+      </w:pPr>
+      <w:r>
+        <w:rPr>
+          <w:b w:val="0"/>
+          <w:i w:val="0"/>
+        </w:rPr>
+        <w:t xml:space="preserve">Tomando-se como referência o mês de maio/2026 em ambos os vínculos — mês sem verbas eventuais —, a composição da renda do Autor é a seguinte (docs. </w:t>
+      </w:r>
+      <w:r>
+        <w:rPr>
+          <w:b w:val="0"/>
+          <w:i w:val="0"/>
+          <w:highlight w:val="yellow"/>
+        </w:rPr>
+        <w:t>[__]</w:t>
+      </w:r>
+      <w:r>
+        <w:rPr>
+          <w:b w:val="0"/>
+          <w:i w:val="0"/>
+        </w:rPr>
+        <w:t>):</w:t>
       </w:r>
     </w:p>
     <w:tbl>
@@ -272,16 +406,761 @@
         <w:tblLook w:firstColumn="1" w:firstRow="1" w:lastColumn="0" w:lastRow="0" w:noHBand="0" w:noVBand="1" w:val="04A0"/>
       </w:tblPr>
       <w:tblGrid>
-        <w:gridCol w:w="1814"/>
-        <w:gridCol w:w="1814"/>
-        <w:gridCol w:w="1814"/>
-        <w:gridCol w:w="1814"/>
-        <w:gridCol w:w="1814"/>
+        <w:gridCol w:w="2268"/>
+        <w:gridCol w:w="2268"/>
+        <w:gridCol w:w="2268"/>
+        <w:gridCol w:w="2268"/>
       </w:tblGrid>
       <w:tr>
         <w:tc>
           <w:tcPr>
-            <w:tcW w:type="dxa" w:w="1814"/>
+            <w:tcW w:type="dxa" w:w="2268"/>
+          </w:tcPr>
+          <w:p>
+            <w:pPr>
+              <w:spacing w:line="240" w:lineRule="auto"/>
+            </w:pPr>
+            <w:r>
+              <w:rPr>
+                <w:b/>
+                <w:i w:val="0"/>
+                <w:sz w:val="20"/>
+              </w:rPr>
+              <w:t>Rubrica (maio/2026)</w:t>
+            </w:r>
+          </w:p>
+        </w:tc>
+        <w:tc>
+          <w:tcPr>
+            <w:tcW w:type="dxa" w:w="2268"/>
+          </w:tcPr>
+          <w:p>
+            <w:pPr>
+              <w:spacing w:line="240" w:lineRule="auto"/>
+            </w:pPr>
+            <w:r>
+              <w:rPr>
+                <w:b/>
+                <w:i w:val="0"/>
+                <w:sz w:val="20"/>
+              </w:rPr>
+              <w:t>Miguel Alves</w:t>
+            </w:r>
+          </w:p>
+        </w:tc>
+        <w:tc>
+          <w:tcPr>
+            <w:tcW w:type="dxa" w:w="2268"/>
+          </w:tcPr>
+          <w:p>
+            <w:pPr>
+              <w:spacing w:line="240" w:lineRule="auto"/>
+            </w:pPr>
+            <w:r>
+              <w:rPr>
+                <w:b/>
+                <w:i w:val="0"/>
+                <w:sz w:val="20"/>
+              </w:rPr>
+              <w:t>União</w:t>
+            </w:r>
+          </w:p>
+        </w:tc>
+        <w:tc>
+          <w:tcPr>
+            <w:tcW w:type="dxa" w:w="2268"/>
+          </w:tcPr>
+          <w:p>
+            <w:pPr>
+              <w:spacing w:line="240" w:lineRule="auto"/>
+            </w:pPr>
+            <w:r>
+              <w:rPr>
+                <w:b/>
+                <w:i w:val="0"/>
+                <w:sz w:val="20"/>
+              </w:rPr>
+              <w:t>Total</w:t>
+            </w:r>
+          </w:p>
+        </w:tc>
+      </w:tr>
+      <w:tr>
+        <w:tc>
+          <w:tcPr>
+            <w:tcW w:type="dxa" w:w="2268"/>
+          </w:tcPr>
+          <w:p>
+            <w:pPr>
+              <w:spacing w:line="240" w:lineRule="auto"/>
+            </w:pPr>
+            <w:r>
+              <w:rPr>
+                <w:b w:val="0"/>
+                <w:i w:val="0"/>
+                <w:sz w:val="20"/>
+              </w:rPr>
+              <w:t>Remuneração bruta</w:t>
+            </w:r>
+          </w:p>
+        </w:tc>
+        <w:tc>
+          <w:tcPr>
+            <w:tcW w:type="dxa" w:w="2268"/>
+          </w:tcPr>
+          <w:p>
+            <w:pPr>
+              <w:spacing w:line="240" w:lineRule="auto"/>
+            </w:pPr>
+            <w:r>
+              <w:rPr>
+                <w:b w:val="0"/>
+                <w:i w:val="0"/>
+                <w:sz w:val="20"/>
+              </w:rPr>
+              <w:t>R$ 13.606,98</w:t>
+            </w:r>
+          </w:p>
+        </w:tc>
+        <w:tc>
+          <w:tcPr>
+            <w:tcW w:type="dxa" w:w="2268"/>
+          </w:tcPr>
+          <w:p>
+            <w:pPr>
+              <w:spacing w:line="240" w:lineRule="auto"/>
+            </w:pPr>
+            <w:r>
+              <w:rPr>
+                <w:b w:val="0"/>
+                <w:i w:val="0"/>
+                <w:sz w:val="20"/>
+              </w:rPr>
+              <w:t>R$ 3.894,14</w:t>
+            </w:r>
+          </w:p>
+        </w:tc>
+        <w:tc>
+          <w:tcPr>
+            <w:tcW w:type="dxa" w:w="2268"/>
+          </w:tcPr>
+          <w:p>
+            <w:pPr>
+              <w:spacing w:line="240" w:lineRule="auto"/>
+            </w:pPr>
+            <w:r>
+              <w:rPr>
+                <w:b w:val="0"/>
+                <w:i w:val="0"/>
+                <w:sz w:val="20"/>
+              </w:rPr>
+              <w:t>R$ 17.501,12</w:t>
+            </w:r>
+          </w:p>
+        </w:tc>
+      </w:tr>
+      <w:tr>
+        <w:tc>
+          <w:tcPr>
+            <w:tcW w:type="dxa" w:w="2268"/>
+          </w:tcPr>
+          <w:p>
+            <w:pPr>
+              <w:spacing w:line="240" w:lineRule="auto"/>
+            </w:pPr>
+            <w:r>
+              <w:rPr>
+                <w:b w:val="0"/>
+                <w:i w:val="0"/>
+                <w:sz w:val="20"/>
+              </w:rPr>
+              <w:t>Previdência (INSS/RPPS)</w:t>
+            </w:r>
+          </w:p>
+        </w:tc>
+        <w:tc>
+          <w:tcPr>
+            <w:tcW w:type="dxa" w:w="2268"/>
+          </w:tcPr>
+          <w:p>
+            <w:pPr>
+              <w:spacing w:line="240" w:lineRule="auto"/>
+            </w:pPr>
+            <w:r>
+              <w:rPr>
+                <w:b w:val="0"/>
+                <w:i w:val="0"/>
+                <w:sz w:val="20"/>
+              </w:rPr>
+              <w:t>R$ 988,07</w:t>
+            </w:r>
+          </w:p>
+        </w:tc>
+        <w:tc>
+          <w:tcPr>
+            <w:tcW w:type="dxa" w:w="2268"/>
+          </w:tcPr>
+          <w:p>
+            <w:pPr>
+              <w:spacing w:line="240" w:lineRule="auto"/>
+            </w:pPr>
+            <w:r>
+              <w:rPr>
+                <w:b w:val="0"/>
+                <w:i w:val="0"/>
+                <w:sz w:val="20"/>
+              </w:rPr>
+              <w:t>R$ 545,17</w:t>
+            </w:r>
+          </w:p>
+        </w:tc>
+        <w:tc>
+          <w:tcPr>
+            <w:tcW w:type="dxa" w:w="2268"/>
+          </w:tcPr>
+          <w:p>
+            <w:pPr>
+              <w:spacing w:line="240" w:lineRule="auto"/>
+            </w:pPr>
+            <w:r>
+              <w:rPr>
+                <w:b w:val="0"/>
+                <w:i w:val="0"/>
+                <w:sz w:val="20"/>
+              </w:rPr>
+              <w:t>R$ 1.533,24</w:t>
+            </w:r>
+          </w:p>
+        </w:tc>
+      </w:tr>
+      <w:tr>
+        <w:tc>
+          <w:tcPr>
+            <w:tcW w:type="dxa" w:w="2268"/>
+          </w:tcPr>
+          <w:p>
+            <w:pPr>
+              <w:spacing w:line="240" w:lineRule="auto"/>
+            </w:pPr>
+            <w:r>
+              <w:rPr>
+                <w:b w:val="0"/>
+                <w:i w:val="0"/>
+                <w:sz w:val="20"/>
+              </w:rPr>
+              <w:t>Imposto de renda</w:t>
+            </w:r>
+          </w:p>
+        </w:tc>
+        <w:tc>
+          <w:tcPr>
+            <w:tcW w:type="dxa" w:w="2268"/>
+          </w:tcPr>
+          <w:p>
+            <w:pPr>
+              <w:spacing w:line="240" w:lineRule="auto"/>
+            </w:pPr>
+            <w:r>
+              <w:rPr>
+                <w:b w:val="0"/>
+                <w:i w:val="0"/>
+                <w:sz w:val="20"/>
+              </w:rPr>
+              <w:t>R$ 2.062,13</w:t>
+            </w:r>
+          </w:p>
+        </w:tc>
+        <w:tc>
+          <w:tcPr>
+            <w:tcW w:type="dxa" w:w="2268"/>
+          </w:tcPr>
+          <w:p>
+            <w:pPr>
+              <w:spacing w:line="240" w:lineRule="auto"/>
+            </w:pPr>
+            <w:r>
+              <w:rPr>
+                <w:b w:val="0"/>
+                <w:i w:val="0"/>
+                <w:sz w:val="20"/>
+              </w:rPr>
+              <w:t>–</w:t>
+            </w:r>
+          </w:p>
+        </w:tc>
+        <w:tc>
+          <w:tcPr>
+            <w:tcW w:type="dxa" w:w="2268"/>
+          </w:tcPr>
+          <w:p>
+            <w:pPr>
+              <w:spacing w:line="240" w:lineRule="auto"/>
+            </w:pPr>
+            <w:r>
+              <w:rPr>
+                <w:b w:val="0"/>
+                <w:i w:val="0"/>
+                <w:sz w:val="20"/>
+              </w:rPr>
+              <w:t>R$ 2.062,13</w:t>
+            </w:r>
+          </w:p>
+        </w:tc>
+      </w:tr>
+      <w:tr>
+        <w:tc>
+          <w:tcPr>
+            <w:tcW w:type="dxa" w:w="2268"/>
+          </w:tcPr>
+          <w:p>
+            <w:pPr>
+              <w:spacing w:line="240" w:lineRule="auto"/>
+            </w:pPr>
+            <w:r>
+              <w:rPr>
+                <w:b w:val="0"/>
+                <w:i w:val="0"/>
+                <w:sz w:val="20"/>
+              </w:rPr>
+              <w:t>Pensão alimentícia judicial</w:t>
+            </w:r>
+          </w:p>
+        </w:tc>
+        <w:tc>
+          <w:tcPr>
+            <w:tcW w:type="dxa" w:w="2268"/>
+          </w:tcPr>
+          <w:p>
+            <w:pPr>
+              <w:spacing w:line="240" w:lineRule="auto"/>
+            </w:pPr>
+            <w:r>
+              <w:rPr>
+                <w:b w:val="0"/>
+                <w:i w:val="0"/>
+                <w:sz w:val="20"/>
+              </w:rPr>
+              <w:t>R$ 1.815,78</w:t>
+            </w:r>
+          </w:p>
+        </w:tc>
+        <w:tc>
+          <w:tcPr>
+            <w:tcW w:type="dxa" w:w="2268"/>
+          </w:tcPr>
+          <w:p>
+            <w:pPr>
+              <w:spacing w:line="240" w:lineRule="auto"/>
+            </w:pPr>
+            <w:r>
+              <w:rPr>
+                <w:b w:val="0"/>
+                <w:i w:val="0"/>
+                <w:sz w:val="20"/>
+              </w:rPr>
+              <w:t>–</w:t>
+            </w:r>
+          </w:p>
+        </w:tc>
+        <w:tc>
+          <w:tcPr>
+            <w:tcW w:type="dxa" w:w="2268"/>
+          </w:tcPr>
+          <w:p>
+            <w:pPr>
+              <w:spacing w:line="240" w:lineRule="auto"/>
+            </w:pPr>
+            <w:r>
+              <w:rPr>
+                <w:b w:val="0"/>
+                <w:i w:val="0"/>
+                <w:sz w:val="20"/>
+              </w:rPr>
+              <w:t>R$ 1.815,78</w:t>
+            </w:r>
+          </w:p>
+        </w:tc>
+      </w:tr>
+      <w:tr>
+        <w:tc>
+          <w:tcPr>
+            <w:tcW w:type="dxa" w:w="2268"/>
+          </w:tcPr>
+          <w:p>
+            <w:pPr>
+              <w:spacing w:line="240" w:lineRule="auto"/>
+            </w:pPr>
+            <w:r>
+              <w:rPr>
+                <w:b/>
+                <w:i w:val="0"/>
+                <w:sz w:val="20"/>
+              </w:rPr>
+              <w:t>Remuneração disponível</w:t>
+            </w:r>
+          </w:p>
+        </w:tc>
+        <w:tc>
+          <w:tcPr>
+            <w:tcW w:type="dxa" w:w="2268"/>
+          </w:tcPr>
+          <w:p>
+            <w:pPr>
+              <w:spacing w:line="240" w:lineRule="auto"/>
+            </w:pPr>
+            <w:r>
+              <w:rPr>
+                <w:b/>
+                <w:i w:val="0"/>
+                <w:sz w:val="20"/>
+              </w:rPr>
+              <w:t>R$ 8.741,00</w:t>
+            </w:r>
+          </w:p>
+        </w:tc>
+        <w:tc>
+          <w:tcPr>
+            <w:tcW w:type="dxa" w:w="2268"/>
+          </w:tcPr>
+          <w:p>
+            <w:pPr>
+              <w:spacing w:line="240" w:lineRule="auto"/>
+            </w:pPr>
+            <w:r>
+              <w:rPr>
+                <w:b/>
+                <w:i w:val="0"/>
+                <w:sz w:val="20"/>
+              </w:rPr>
+              <w:t>R$ 3.348,97</w:t>
+            </w:r>
+          </w:p>
+        </w:tc>
+        <w:tc>
+          <w:tcPr>
+            <w:tcW w:type="dxa" w:w="2268"/>
+          </w:tcPr>
+          <w:p>
+            <w:pPr>
+              <w:spacing w:line="240" w:lineRule="auto"/>
+            </w:pPr>
+            <w:r>
+              <w:rPr>
+                <w:b/>
+                <w:i w:val="0"/>
+                <w:sz w:val="20"/>
+              </w:rPr>
+              <w:t>R$ 12.089,97</w:t>
+            </w:r>
+          </w:p>
+        </w:tc>
+      </w:tr>
+      <w:tr>
+        <w:tc>
+          <w:tcPr>
+            <w:tcW w:type="dxa" w:w="2268"/>
+          </w:tcPr>
+          <w:p>
+            <w:pPr>
+              <w:spacing w:line="240" w:lineRule="auto"/>
+            </w:pPr>
+            <w:r>
+              <w:rPr>
+                <w:b w:val="0"/>
+                <w:i w:val="0"/>
+                <w:sz w:val="20"/>
+              </w:rPr>
+              <w:t>Empréstimos consignados em folha</w:t>
+            </w:r>
+          </w:p>
+        </w:tc>
+        <w:tc>
+          <w:tcPr>
+            <w:tcW w:type="dxa" w:w="2268"/>
+          </w:tcPr>
+          <w:p>
+            <w:pPr>
+              <w:spacing w:line="240" w:lineRule="auto"/>
+            </w:pPr>
+            <w:r>
+              <w:rPr>
+                <w:b w:val="0"/>
+                <w:i w:val="0"/>
+                <w:sz w:val="20"/>
+              </w:rPr>
+              <w:t>R$ 5.041,53</w:t>
+            </w:r>
+          </w:p>
+        </w:tc>
+        <w:tc>
+          <w:tcPr>
+            <w:tcW w:type="dxa" w:w="2268"/>
+          </w:tcPr>
+          <w:p>
+            <w:pPr>
+              <w:spacing w:line="240" w:lineRule="auto"/>
+            </w:pPr>
+            <w:r>
+              <w:rPr>
+                <w:b w:val="0"/>
+                <w:i w:val="0"/>
+                <w:sz w:val="20"/>
+              </w:rPr>
+              <w:t>R$ 2.266,17</w:t>
+            </w:r>
+          </w:p>
+        </w:tc>
+        <w:tc>
+          <w:tcPr>
+            <w:tcW w:type="dxa" w:w="2268"/>
+          </w:tcPr>
+          <w:p>
+            <w:pPr>
+              <w:spacing w:line="240" w:lineRule="auto"/>
+            </w:pPr>
+            <w:r>
+              <w:rPr>
+                <w:b w:val="0"/>
+                <w:i w:val="0"/>
+                <w:sz w:val="20"/>
+              </w:rPr>
+              <w:t>R$ 7.307,70</w:t>
+            </w:r>
+          </w:p>
+        </w:tc>
+      </w:tr>
+      <w:tr>
+        <w:tc>
+          <w:tcPr>
+            <w:tcW w:type="dxa" w:w="2268"/>
+          </w:tcPr>
+          <w:p>
+            <w:pPr>
+              <w:spacing w:line="240" w:lineRule="auto"/>
+            </w:pPr>
+            <w:r>
+              <w:rPr>
+                <w:b w:val="0"/>
+                <w:i w:val="0"/>
+                <w:sz w:val="20"/>
+              </w:rPr>
+              <w:t>Contribuição sindical</w:t>
+            </w:r>
+          </w:p>
+        </w:tc>
+        <w:tc>
+          <w:tcPr>
+            <w:tcW w:type="dxa" w:w="2268"/>
+          </w:tcPr>
+          <w:p>
+            <w:pPr>
+              <w:spacing w:line="240" w:lineRule="auto"/>
+            </w:pPr>
+            <w:r>
+              <w:rPr>
+                <w:b w:val="0"/>
+                <w:i w:val="0"/>
+                <w:sz w:val="20"/>
+              </w:rPr>
+              <w:t>R$ 90,04</w:t>
+            </w:r>
+          </w:p>
+        </w:tc>
+        <w:tc>
+          <w:tcPr>
+            <w:tcW w:type="dxa" w:w="2268"/>
+          </w:tcPr>
+          <w:p>
+            <w:pPr>
+              <w:spacing w:line="240" w:lineRule="auto"/>
+            </w:pPr>
+            <w:r>
+              <w:rPr>
+                <w:b w:val="0"/>
+                <w:i w:val="0"/>
+                <w:sz w:val="20"/>
+              </w:rPr>
+              <w:t>R$ 35,40</w:t>
+            </w:r>
+          </w:p>
+        </w:tc>
+        <w:tc>
+          <w:tcPr>
+            <w:tcW w:type="dxa" w:w="2268"/>
+          </w:tcPr>
+          <w:p>
+            <w:pPr>
+              <w:spacing w:line="240" w:lineRule="auto"/>
+            </w:pPr>
+            <w:r>
+              <w:rPr>
+                <w:b w:val="0"/>
+                <w:i w:val="0"/>
+                <w:sz w:val="20"/>
+              </w:rPr>
+              <w:t>R$ 125,44</w:t>
+            </w:r>
+          </w:p>
+        </w:tc>
+      </w:tr>
+      <w:tr>
+        <w:tc>
+          <w:tcPr>
+            <w:tcW w:type="dxa" w:w="2268"/>
+          </w:tcPr>
+          <w:p>
+            <w:pPr>
+              <w:spacing w:line="240" w:lineRule="auto"/>
+            </w:pPr>
+            <w:r>
+              <w:rPr>
+                <w:b/>
+                <w:i w:val="0"/>
+                <w:sz w:val="20"/>
+              </w:rPr>
+              <w:t>Valor líquido creditado</w:t>
+            </w:r>
+          </w:p>
+        </w:tc>
+        <w:tc>
+          <w:tcPr>
+            <w:tcW w:type="dxa" w:w="2268"/>
+          </w:tcPr>
+          <w:p>
+            <w:pPr>
+              <w:spacing w:line="240" w:lineRule="auto"/>
+            </w:pPr>
+            <w:r>
+              <w:rPr>
+                <w:b/>
+                <w:i w:val="0"/>
+                <w:sz w:val="20"/>
+              </w:rPr>
+              <w:t>R$ 3.609,43</w:t>
+            </w:r>
+          </w:p>
+        </w:tc>
+        <w:tc>
+          <w:tcPr>
+            <w:tcW w:type="dxa" w:w="2268"/>
+          </w:tcPr>
+          <w:p>
+            <w:pPr>
+              <w:spacing w:line="240" w:lineRule="auto"/>
+            </w:pPr>
+            <w:r>
+              <w:rPr>
+                <w:b/>
+                <w:i w:val="0"/>
+                <w:sz w:val="20"/>
+              </w:rPr>
+              <w:t>R$ 1.047,40</w:t>
+            </w:r>
+          </w:p>
+        </w:tc>
+        <w:tc>
+          <w:tcPr>
+            <w:tcW w:type="dxa" w:w="2268"/>
+          </w:tcPr>
+          <w:p>
+            <w:pPr>
+              <w:spacing w:line="240" w:lineRule="auto"/>
+            </w:pPr>
+            <w:r>
+              <w:rPr>
+                <w:b/>
+                <w:i w:val="0"/>
+                <w:sz w:val="20"/>
+              </w:rPr>
+              <w:t>R$ 4.656,83</w:t>
+            </w:r>
+          </w:p>
+        </w:tc>
+      </w:tr>
+    </w:tbl>
+    <w:p>
+      <w:pPr>
+        <w:ind w:firstLine="1417"/>
+        <w:jc w:val="both"/>
+      </w:pPr>
+      <w:r>
+        <w:rPr>
+          <w:b w:val="0"/>
+          <w:i w:val="0"/>
+        </w:rPr>
+        <w:t xml:space="preserve">Registre-se que, a partir de julho/2026, a pensão alimentícia descontada na folha de Miguel Alves passou de 19% do líquido para 30% do bruto (R$ 2.011,20), reduzindo ainda mais a renda disponível do Autor (doc. </w:t>
+      </w:r>
+      <w:r>
+        <w:rPr>
+          <w:b w:val="0"/>
+          <w:i w:val="0"/>
+          <w:highlight w:val="yellow"/>
+        </w:rPr>
+        <w:t>[__]</w:t>
+      </w:r>
+      <w:r>
+        <w:rPr>
+          <w:b w:val="0"/>
+          <w:i w:val="0"/>
+        </w:rPr>
+        <w:t>).</w:t>
+      </w:r>
+    </w:p>
+    <w:p>
+      <w:pPr>
+        <w:spacing w:before="240"/>
+      </w:pPr>
+      <w:r>
+        <w:rPr>
+          <w:b/>
+          <w:i w:val="0"/>
+        </w:rPr>
+        <w:t>3.2. Dos empréstimos consignados em folha — margem consignável extrapolada</w:t>
+      </w:r>
+    </w:p>
+    <w:p>
+      <w:pPr>
+        <w:ind w:firstLine="1417"/>
+        <w:jc w:val="both"/>
+      </w:pPr>
+      <w:r>
+        <w:rPr>
+          <w:b w:val="0"/>
+          <w:i w:val="0"/>
+        </w:rPr>
+        <w:t xml:space="preserve">Somente os empréstimos consignados em folha consomem </w:t>
+      </w:r>
+      <w:r>
+        <w:rPr>
+          <w:b/>
+          <w:i w:val="0"/>
+        </w:rPr>
+        <w:t>R$ 7.307,70 por mês, o que corresponde a 60,44% da remuneração disponível do Autor</w:t>
+      </w:r>
+      <w:r>
+        <w:rPr>
+          <w:b w:val="0"/>
+          <w:i w:val="0"/>
+        </w:rPr>
+        <w:t>, muito acima de qualquer margem consignável admitida pela legislação:</w:t>
+      </w:r>
+    </w:p>
+    <w:tbl>
+      <w:tblPr>
+        <w:tblStyle w:val="TableGrid"/>
+        <w:tblW w:type="auto" w:w="0"/>
+        <w:tblLook w:firstColumn="1" w:firstRow="1" w:lastColumn="0" w:lastRow="0" w:noHBand="0" w:noVBand="1" w:val="04A0"/>
+      </w:tblPr>
+      <w:tblGrid>
+        <w:gridCol w:w="2268"/>
+        <w:gridCol w:w="2268"/>
+        <w:gridCol w:w="2268"/>
+        <w:gridCol w:w="2268"/>
+      </w:tblGrid>
+      <w:tr>
+        <w:tc>
+          <w:tcPr>
+            <w:tcW w:type="dxa" w:w="2268"/>
           </w:tcPr>
           <w:p>
             <w:pPr>
@@ -299,7 +1178,7 @@
         </w:tc>
         <w:tc>
           <w:tcPr>
-            <w:tcW w:type="dxa" w:w="1814"/>
+            <w:tcW w:type="dxa" w:w="2268"/>
           </w:tcPr>
           <w:p>
             <w:pPr>
@@ -311,13 +1190,13 @@
                 <w:i w:val="0"/>
                 <w:sz w:val="20"/>
               </w:rPr>
-              <w:t>Tipo de dívida</w:t>
+              <w:t>Rubrica na folha</w:t>
             </w:r>
           </w:p>
         </w:tc>
         <w:tc>
           <w:tcPr>
-            <w:tcW w:type="dxa" w:w="1814"/>
+            <w:tcW w:type="dxa" w:w="2268"/>
           </w:tcPr>
           <w:p>
             <w:pPr>
@@ -329,13 +1208,13 @@
                 <w:i w:val="0"/>
                 <w:sz w:val="20"/>
               </w:rPr>
-              <w:t>Valor original</w:t>
+              <w:t>Parcela</w:t>
             </w:r>
           </w:p>
         </w:tc>
         <w:tc>
           <w:tcPr>
-            <w:tcW w:type="dxa" w:w="1814"/>
+            <w:tcW w:type="dxa" w:w="2268"/>
           </w:tcPr>
           <w:p>
             <w:pPr>
@@ -347,25 +1226,7 @@
                 <w:i w:val="0"/>
                 <w:sz w:val="20"/>
               </w:rPr>
-              <w:t>Parcela mensal</w:t>
-            </w:r>
-          </w:p>
-        </w:tc>
-        <w:tc>
-          <w:tcPr>
-            <w:tcW w:type="dxa" w:w="1814"/>
-          </w:tcPr>
-          <w:p>
-            <w:pPr>
-              <w:spacing w:line="240" w:lineRule="auto"/>
-            </w:pPr>
-            <w:r>
-              <w:rPr>
-                <w:b/>
-                <w:i w:val="0"/>
-                <w:sz w:val="20"/>
-              </w:rPr>
-              <w:t>Saldo estimado</w:t>
+              <w:t>Parcela nº (jul/2026)</w:t>
             </w:r>
           </w:p>
         </w:tc>
@@ -373,7 +1234,7 @@
       <w:tr>
         <w:tc>
           <w:tcPr>
-            <w:tcW w:type="dxa" w:w="1814"/>
+            <w:tcW w:type="dxa" w:w="2268"/>
           </w:tcPr>
           <w:p>
             <w:pPr>
@@ -385,32 +1246,13 @@
                 <w:i w:val="0"/>
                 <w:sz w:val="20"/>
               </w:rPr>
-              <w:t>Banco Bradesco S.A.</w:t>
+              <w:t>Banco do Brasil</w:t>
             </w:r>
           </w:p>
         </w:tc>
         <w:tc>
           <w:tcPr>
-            <w:tcW w:type="dxa" w:w="1814"/>
-          </w:tcPr>
-          <w:p>
-            <w:pPr>
-              <w:spacing w:line="240" w:lineRule="auto"/>
-            </w:pPr>
-            <w:r>
-              <w:rPr>
-                <w:b w:val="0"/>
-                <w:i w:val="0"/>
-                <w:sz w:val="20"/>
-                <w:highlight w:val="yellow"/>
-              </w:rPr>
-              <w:t>[contrato nº __ – empréstimo/cartão/consignado]</w:t>
-            </w:r>
-          </w:p>
-        </w:tc>
-        <w:tc>
-          <w:tcPr>
-            <w:tcW w:type="dxa" w:w="1814"/>
+            <w:tcW w:type="dxa" w:w="2268"/>
           </w:tcPr>
           <w:p>
             <w:pPr>
@@ -422,22 +1264,13 @@
                 <w:i w:val="0"/>
                 <w:sz w:val="20"/>
               </w:rPr>
-              <w:t xml:space="preserve">R$ </w:t>
-            </w:r>
-            <w:r>
-              <w:rPr>
-                <w:b w:val="0"/>
-                <w:i w:val="0"/>
-                <w:sz w:val="20"/>
-                <w:highlight w:val="yellow"/>
-              </w:rPr>
-              <w:t>[__]</w:t>
+              <w:t>CONSIG. CDC B BRASIL I (Miguel Alves)</w:t>
             </w:r>
           </w:p>
         </w:tc>
         <w:tc>
           <w:tcPr>
-            <w:tcW w:type="dxa" w:w="1814"/>
+            <w:tcW w:type="dxa" w:w="2268"/>
           </w:tcPr>
           <w:p>
             <w:pPr>
@@ -449,22 +1282,13 @@
                 <w:i w:val="0"/>
                 <w:sz w:val="20"/>
               </w:rPr>
-              <w:t xml:space="preserve">R$ </w:t>
-            </w:r>
-            <w:r>
-              <w:rPr>
-                <w:b w:val="0"/>
-                <w:i w:val="0"/>
-                <w:sz w:val="20"/>
-                <w:highlight w:val="yellow"/>
-              </w:rPr>
-              <w:t>[__]</w:t>
+              <w:t>R$ 4.014,86</w:t>
             </w:r>
           </w:p>
         </w:tc>
         <w:tc>
           <w:tcPr>
-            <w:tcW w:type="dxa" w:w="1814"/>
+            <w:tcW w:type="dxa" w:w="2268"/>
           </w:tcPr>
           <w:p>
             <w:pPr>
@@ -476,8 +1300,222 @@
                 <w:i w:val="0"/>
                 <w:sz w:val="20"/>
               </w:rPr>
-              <w:t xml:space="preserve">R$ </w:t>
+              <w:t>16/120</w:t>
             </w:r>
+          </w:p>
+        </w:tc>
+      </w:tr>
+      <w:tr>
+        <w:tc>
+          <w:tcPr>
+            <w:tcW w:type="dxa" w:w="2268"/>
+          </w:tcPr>
+          <w:p>
+            <w:pPr>
+              <w:spacing w:line="240" w:lineRule="auto"/>
+            </w:pPr>
+            <w:r>
+              <w:rPr>
+                <w:b w:val="0"/>
+                <w:i w:val="0"/>
+                <w:sz w:val="20"/>
+              </w:rPr>
+              <w:t>Banco do Brasil</w:t>
+            </w:r>
+          </w:p>
+        </w:tc>
+        <w:tc>
+          <w:tcPr>
+            <w:tcW w:type="dxa" w:w="2268"/>
+          </w:tcPr>
+          <w:p>
+            <w:pPr>
+              <w:spacing w:line="240" w:lineRule="auto"/>
+            </w:pPr>
+            <w:r>
+              <w:rPr>
+                <w:b w:val="0"/>
+                <w:i w:val="0"/>
+                <w:sz w:val="20"/>
+              </w:rPr>
+              <w:t>CONSIG. CDC B BRASIL I (Miguel Alves)</w:t>
+            </w:r>
+          </w:p>
+        </w:tc>
+        <w:tc>
+          <w:tcPr>
+            <w:tcW w:type="dxa" w:w="2268"/>
+          </w:tcPr>
+          <w:p>
+            <w:pPr>
+              <w:spacing w:line="240" w:lineRule="auto"/>
+            </w:pPr>
+            <w:r>
+              <w:rPr>
+                <w:b w:val="0"/>
+                <w:i w:val="0"/>
+                <w:sz w:val="20"/>
+              </w:rPr>
+              <w:t>R$ 644,95</w:t>
+            </w:r>
+          </w:p>
+        </w:tc>
+        <w:tc>
+          <w:tcPr>
+            <w:tcW w:type="dxa" w:w="2268"/>
+          </w:tcPr>
+          <w:p>
+            <w:pPr>
+              <w:spacing w:line="240" w:lineRule="auto"/>
+            </w:pPr>
+            <w:r>
+              <w:rPr>
+                <w:b w:val="0"/>
+                <w:i w:val="0"/>
+                <w:sz w:val="20"/>
+              </w:rPr>
+              <w:t>15/120</w:t>
+            </w:r>
+          </w:p>
+        </w:tc>
+      </w:tr>
+      <w:tr>
+        <w:tc>
+          <w:tcPr>
+            <w:tcW w:type="dxa" w:w="2268"/>
+          </w:tcPr>
+          <w:p>
+            <w:pPr>
+              <w:spacing w:line="240" w:lineRule="auto"/>
+            </w:pPr>
+            <w:r>
+              <w:rPr>
+                <w:b w:val="0"/>
+                <w:i w:val="0"/>
+                <w:sz w:val="20"/>
+              </w:rPr>
+              <w:t>Banco do Brasil</w:t>
+            </w:r>
+          </w:p>
+        </w:tc>
+        <w:tc>
+          <w:tcPr>
+            <w:tcW w:type="dxa" w:w="2268"/>
+          </w:tcPr>
+          <w:p>
+            <w:pPr>
+              <w:spacing w:line="240" w:lineRule="auto"/>
+            </w:pPr>
+            <w:r>
+              <w:rPr>
+                <w:b w:val="0"/>
+                <w:i w:val="0"/>
+                <w:sz w:val="20"/>
+              </w:rPr>
+              <w:t>CONSIG. CDC B BRASIL III (Miguel Alves)</w:t>
+            </w:r>
+          </w:p>
+        </w:tc>
+        <w:tc>
+          <w:tcPr>
+            <w:tcW w:type="dxa" w:w="2268"/>
+          </w:tcPr>
+          <w:p>
+            <w:pPr>
+              <w:spacing w:line="240" w:lineRule="auto"/>
+            </w:pPr>
+            <w:r>
+              <w:rPr>
+                <w:b w:val="0"/>
+                <w:i w:val="0"/>
+                <w:sz w:val="20"/>
+              </w:rPr>
+              <w:t>R$ 241,37</w:t>
+            </w:r>
+          </w:p>
+        </w:tc>
+        <w:tc>
+          <w:tcPr>
+            <w:tcW w:type="dxa" w:w="2268"/>
+          </w:tcPr>
+          <w:p>
+            <w:pPr>
+              <w:spacing w:line="240" w:lineRule="auto"/>
+            </w:pPr>
+            <w:r>
+              <w:rPr>
+                <w:b w:val="0"/>
+                <w:i w:val="0"/>
+                <w:sz w:val="20"/>
+              </w:rPr>
+              <w:t>5/120</w:t>
+            </w:r>
+          </w:p>
+        </w:tc>
+      </w:tr>
+      <w:tr>
+        <w:tc>
+          <w:tcPr>
+            <w:tcW w:type="dxa" w:w="2268"/>
+          </w:tcPr>
+          <w:p>
+            <w:pPr>
+              <w:spacing w:line="240" w:lineRule="auto"/>
+            </w:pPr>
+            <w:r>
+              <w:rPr>
+                <w:b w:val="0"/>
+                <w:i w:val="0"/>
+                <w:sz w:val="20"/>
+              </w:rPr>
+              <w:t>Banco do Brasil</w:t>
+            </w:r>
+          </w:p>
+        </w:tc>
+        <w:tc>
+          <w:tcPr>
+            <w:tcW w:type="dxa" w:w="2268"/>
+          </w:tcPr>
+          <w:p>
+            <w:pPr>
+              <w:spacing w:line="240" w:lineRule="auto"/>
+            </w:pPr>
+            <w:r>
+              <w:rPr>
+                <w:b w:val="0"/>
+                <w:i w:val="0"/>
+                <w:sz w:val="20"/>
+              </w:rPr>
+              <w:t>CONSIGNAÇÃO B. BRASIL V (Miguel Alves)</w:t>
+            </w:r>
+          </w:p>
+        </w:tc>
+        <w:tc>
+          <w:tcPr>
+            <w:tcW w:type="dxa" w:w="2268"/>
+          </w:tcPr>
+          <w:p>
+            <w:pPr>
+              <w:spacing w:line="240" w:lineRule="auto"/>
+            </w:pPr>
+            <w:r>
+              <w:rPr>
+                <w:b w:val="0"/>
+                <w:i w:val="0"/>
+                <w:sz w:val="20"/>
+              </w:rPr>
+              <w:t>R$ 140,35</w:t>
+            </w:r>
+          </w:p>
+        </w:tc>
+        <w:tc>
+          <w:tcPr>
+            <w:tcW w:type="dxa" w:w="2268"/>
+          </w:tcPr>
+          <w:p>
+            <w:pPr>
+              <w:spacing w:line="240" w:lineRule="auto"/>
+            </w:pPr>
             <w:r>
               <w:rPr>
                 <w:b w:val="0"/>
@@ -493,7 +1531,7 @@
       <w:tr>
         <w:tc>
           <w:tcPr>
-            <w:tcW w:type="dxa" w:w="1814"/>
+            <w:tcW w:type="dxa" w:w="2268"/>
           </w:tcPr>
           <w:p>
             <w:pPr>
@@ -505,32 +1543,13 @@
                 <w:i w:val="0"/>
                 <w:sz w:val="20"/>
               </w:rPr>
-              <w:t>Banco do Brasil S.A.</w:t>
+              <w:t>Bradesco</w:t>
             </w:r>
           </w:p>
         </w:tc>
         <w:tc>
           <w:tcPr>
-            <w:tcW w:type="dxa" w:w="1814"/>
-          </w:tcPr>
-          <w:p>
-            <w:pPr>
-              <w:spacing w:line="240" w:lineRule="auto"/>
-            </w:pPr>
-            <w:r>
-              <w:rPr>
-                <w:b w:val="0"/>
-                <w:i w:val="0"/>
-                <w:sz w:val="20"/>
-                <w:highlight w:val="yellow"/>
-              </w:rPr>
-              <w:t>[contrato nº __ – empréstimo/cartão/consignado]</w:t>
-            </w:r>
-          </w:p>
-        </w:tc>
-        <w:tc>
-          <w:tcPr>
-            <w:tcW w:type="dxa" w:w="1814"/>
+            <w:tcW w:type="dxa" w:w="2268"/>
           </w:tcPr>
           <w:p>
             <w:pPr>
@@ -542,22 +1561,13 @@
                 <w:i w:val="0"/>
                 <w:sz w:val="20"/>
               </w:rPr>
-              <w:t xml:space="preserve">R$ </w:t>
-            </w:r>
-            <w:r>
-              <w:rPr>
-                <w:b w:val="0"/>
-                <w:i w:val="0"/>
-                <w:sz w:val="20"/>
-                <w:highlight w:val="yellow"/>
-              </w:rPr>
-              <w:t>[__]</w:t>
+              <w:t>CDC CONSIG. BRADESCO-I (União)</w:t>
             </w:r>
           </w:p>
         </w:tc>
         <w:tc>
           <w:tcPr>
-            <w:tcW w:type="dxa" w:w="1814"/>
+            <w:tcW w:type="dxa" w:w="2268"/>
           </w:tcPr>
           <w:p>
             <w:pPr>
@@ -569,35 +1579,18 @@
                 <w:i w:val="0"/>
                 <w:sz w:val="20"/>
               </w:rPr>
-              <w:t xml:space="preserve">R$ </w:t>
-            </w:r>
-            <w:r>
-              <w:rPr>
-                <w:b w:val="0"/>
-                <w:i w:val="0"/>
-                <w:sz w:val="20"/>
-                <w:highlight w:val="yellow"/>
-              </w:rPr>
-              <w:t>[__]</w:t>
+              <w:t>R$ 2.266,17</w:t>
             </w:r>
           </w:p>
         </w:tc>
         <w:tc>
           <w:tcPr>
-            <w:tcW w:type="dxa" w:w="1814"/>
+            <w:tcW w:type="dxa" w:w="2268"/>
           </w:tcPr>
           <w:p>
             <w:pPr>
               <w:spacing w:line="240" w:lineRule="auto"/>
             </w:pPr>
-            <w:r>
-              <w:rPr>
-                <w:b w:val="0"/>
-                <w:i w:val="0"/>
-                <w:sz w:val="20"/>
-              </w:rPr>
-              <w:t xml:space="preserve">R$ </w:t>
-            </w:r>
             <w:r>
               <w:rPr>
                 <w:b w:val="0"/>
@@ -613,7 +1606,7 @@
       <w:tr>
         <w:tc>
           <w:tcPr>
-            <w:tcW w:type="dxa" w:w="1814"/>
+            <w:tcW w:type="dxa" w:w="2268"/>
           </w:tcPr>
           <w:p>
             <w:pPr>
@@ -631,7 +1624,7 @@
         </w:tc>
         <w:tc>
           <w:tcPr>
-            <w:tcW w:type="dxa" w:w="1814"/>
+            <w:tcW w:type="dxa" w:w="2268"/>
           </w:tcPr>
           <w:p>
             <w:pPr>
@@ -641,7 +1634,7 @@
         </w:tc>
         <w:tc>
           <w:tcPr>
-            <w:tcW w:type="dxa" w:w="1814"/>
+            <w:tcW w:type="dxa" w:w="2268"/>
           </w:tcPr>
           <w:p>
             <w:pPr>
@@ -653,22 +1646,267 @@
                 <w:i w:val="0"/>
                 <w:sz w:val="20"/>
               </w:rPr>
-              <w:t xml:space="preserve">R$ </w:t>
-            </w:r>
-            <w:r>
-              <w:rPr>
-                <w:b/>
-                <w:i w:val="0"/>
-                <w:sz w:val="20"/>
-                <w:highlight w:val="yellow"/>
-              </w:rPr>
-              <w:t>[__]</w:t>
+              <w:t>R$ 7.307,70</w:t>
             </w:r>
           </w:p>
         </w:tc>
         <w:tc>
           <w:tcPr>
-            <w:tcW w:type="dxa" w:w="1814"/>
+            <w:tcW w:type="dxa" w:w="2268"/>
+          </w:tcPr>
+          <w:p>
+            <w:pPr>
+              <w:spacing w:line="240" w:lineRule="auto"/>
+            </w:pPr>
+          </w:p>
+        </w:tc>
+      </w:tr>
+    </w:tbl>
+    <w:p>
+      <w:pPr>
+        <w:ind w:firstLine="1417"/>
+        <w:jc w:val="both"/>
+      </w:pPr>
+      <w:r>
+        <w:rPr>
+          <w:b w:val="0"/>
+          <w:i w:val="0"/>
+        </w:rPr>
+        <w:t xml:space="preserve">No vínculo de Miguel Alves, os consignados (R$ 5.041,53) correspondem a 57,68% da remuneração disponível, e o próprio contracheque indica margem consignável residual de apenas </w:t>
+      </w:r>
+      <w:r>
+        <w:rPr>
+          <w:b/>
+          <w:i w:val="0"/>
+        </w:rPr>
+        <w:t>R$ 1,26</w:t>
+      </w:r>
+      <w:r>
+        <w:rPr>
+          <w:b w:val="0"/>
+          <w:i w:val="0"/>
+        </w:rPr>
+        <w:t xml:space="preserve">. No vínculo de União, o consignado do Bradesco (R$ 2.266,17) corresponde a 67,67% da remuneração disponível e a 58,19% da remuneração bruta, embora o próprio contracheque aponte </w:t>
+      </w:r>
+      <w:r>
+        <w:rPr>
+          <w:b/>
+          <w:i w:val="0"/>
+        </w:rPr>
+        <w:t>margem consignável de R$ 1.168,24</w:t>
+      </w:r>
+      <w:r>
+        <w:rPr>
+          <w:b w:val="0"/>
+          <w:i w:val="0"/>
+        </w:rPr>
+        <w:t xml:space="preserve"> — ou seja, o desconto supera em quase o dobro a margem informada pelo órgão pagador (docs. </w:t>
+      </w:r>
+      <w:r>
+        <w:rPr>
+          <w:b w:val="0"/>
+          <w:i w:val="0"/>
+          <w:highlight w:val="yellow"/>
+        </w:rPr>
+        <w:t>[__]</w:t>
+      </w:r>
+      <w:r>
+        <w:rPr>
+          <w:b w:val="0"/>
+          <w:i w:val="0"/>
+        </w:rPr>
+        <w:t>). Até abril/2026, essa mesma margem era ocupada por dois contratos do Banco do Brasil (CDC BANCO DO BRASIL-I, R$ 1.137,45, e CDC BANCO DO BRASIL-II, R$ 1.122,58).</w:t>
+      </w:r>
+    </w:p>
+    <w:p>
+      <w:pPr>
+        <w:ind w:firstLine="1417"/>
+        <w:jc w:val="both"/>
+      </w:pPr>
+      <w:r>
+        <w:rPr>
+          <w:b w:val="0"/>
+          <w:i w:val="0"/>
+        </w:rPr>
+        <w:t>Os contratos são de 120 (cento e vinte) parcelas — dez anos de descontos —, o que evidencia a concessão de crédito sem qualquer análise da capacidade de pagamento do consumidor.</w:t>
+      </w:r>
+    </w:p>
+    <w:p>
+      <w:pPr>
+        <w:spacing w:before="240"/>
+      </w:pPr>
+      <w:r>
+        <w:rPr>
+          <w:b/>
+          <w:i w:val="0"/>
+        </w:rPr>
+        <w:t>3.3. Dos débitos em conta corrente — a “ciranda” de crédito do Banco do Brasil</w:t>
+      </w:r>
+    </w:p>
+    <w:p>
+      <w:pPr>
+        <w:ind w:firstLine="1417"/>
+        <w:jc w:val="both"/>
+      </w:pPr>
+      <w:r>
+        <w:rPr>
+          <w:b w:val="0"/>
+          <w:i w:val="0"/>
+        </w:rPr>
+        <w:t xml:space="preserve">Além dos consignados, o Banco do Brasil debita diretamente da conta corrente do Autor (agência 2298-5, conta 6198-0), na qual são creditados seus vencimentos, parcelas de outros contratos, entre eles (docs. </w:t>
+      </w:r>
+      <w:r>
+        <w:rPr>
+          <w:b w:val="0"/>
+          <w:i w:val="0"/>
+          <w:highlight w:val="yellow"/>
+        </w:rPr>
+        <w:t>[__]</w:t>
+      </w:r>
+      <w:r>
+        <w:rPr>
+          <w:b w:val="0"/>
+          <w:i w:val="0"/>
+        </w:rPr>
+        <w:t>):</w:t>
+      </w:r>
+    </w:p>
+    <w:p>
+      <w:pPr>
+        <w:ind w:left="850" w:hanging="283"/>
+        <w:jc w:val="both"/>
+      </w:pPr>
+      <w:r>
+        <w:rPr>
+          <w:b w:val="0"/>
+          <w:i w:val="0"/>
+        </w:rPr>
+        <w:t xml:space="preserve">• contrato nº 196434985 – </w:t>
+      </w:r>
+      <w:r>
+        <w:rPr>
+          <w:b/>
+          <w:i w:val="0"/>
+        </w:rPr>
+        <w:t>BB Crédito Renegociação I</w:t>
+      </w:r>
+      <w:r>
+        <w:rPr>
+          <w:b w:val="0"/>
+          <w:i w:val="0"/>
+        </w:rPr>
+        <w:t>;</w:t>
+      </w:r>
+    </w:p>
+    <w:p>
+      <w:pPr>
+        <w:ind w:left="850" w:hanging="283"/>
+        <w:jc w:val="both"/>
+      </w:pPr>
+      <w:r>
+        <w:rPr>
+          <w:b w:val="0"/>
+          <w:i w:val="0"/>
+        </w:rPr>
+        <w:t xml:space="preserve">• contrato nº 180848571 – </w:t>
+      </w:r>
+      <w:r>
+        <w:rPr>
+          <w:b/>
+          <w:i w:val="0"/>
+        </w:rPr>
+        <w:t>BB Crédito Salário</w:t>
+      </w:r>
+      <w:r>
+        <w:rPr>
+          <w:b w:val="0"/>
+          <w:i w:val="0"/>
+        </w:rPr>
+        <w:t>, com débitos de R$ 764,89 (03/2026), R$ 764,66 (05/2026) e R$ 421,01 + R$ 357,15 + R$ 649,22 (07/2026);</w:t>
+      </w:r>
+    </w:p>
+    <w:p>
+      <w:pPr>
+        <w:ind w:left="850" w:hanging="283"/>
+        <w:jc w:val="both"/>
+      </w:pPr>
+      <w:r>
+        <w:rPr>
+          <w:b w:val="0"/>
+          <w:i w:val="0"/>
+        </w:rPr>
+        <w:t xml:space="preserve">• contrato nº 166175821 – </w:t>
+      </w:r>
+      <w:r>
+        <w:rPr>
+          <w:b/>
+          <w:i w:val="0"/>
+        </w:rPr>
+        <w:t>BB Crédito Consignação</w:t>
+      </w:r>
+      <w:r>
+        <w:rPr>
+          <w:b w:val="0"/>
+          <w:i w:val="0"/>
+        </w:rPr>
+        <w:t>, debitado em conta no valor de R$ 1.118,27 (31/07/2026);</w:t>
+      </w:r>
+    </w:p>
+    <w:p>
+      <w:pPr>
+        <w:ind w:left="850" w:hanging="283"/>
+        <w:jc w:val="both"/>
+      </w:pPr>
+      <w:r>
+        <w:rPr>
+          <w:b w:val="0"/>
+          <w:i w:val="0"/>
+        </w:rPr>
+        <w:t>• seguros e serviços (BB Seguros, Seguro de Vida e “Clube de Benefícios”), cujas tentativas de débito se repetem diariamente.</w:t>
+      </w:r>
+    </w:p>
+    <w:p>
+      <w:pPr>
+        <w:ind w:firstLine="1417"/>
+        <w:jc w:val="both"/>
+      </w:pPr>
+      <w:r>
+        <w:rPr>
+          <w:b w:val="0"/>
+          <w:i w:val="0"/>
+        </w:rPr>
+        <w:t xml:space="preserve">O extrato de março/2026 revela a dinâmica que levou o Autor ao superendividamento: o banco concedeu ao Autor </w:t>
+      </w:r>
+      <w:r>
+        <w:rPr>
+          <w:b/>
+          <w:i w:val="0"/>
+        </w:rPr>
+        <w:t>três novos créditos consignados em menos de um mês</w:t>
+      </w:r>
+      <w:r>
+        <w:rPr>
+          <w:b w:val="0"/>
+          <w:i w:val="0"/>
+        </w:rPr>
+        <w:t>, e, no mesmo dia de cada liberação, debitou parte relevante do valor para amortizar a renegociação anterior (contrato nº 196434985):</w:t>
+      </w:r>
+    </w:p>
+    <w:tbl>
+      <w:tblPr>
+        <w:tblStyle w:val="TableGrid"/>
+        <w:tblW w:type="auto" w:w="0"/>
+        <w:tblLook w:firstColumn="1" w:firstRow="1" w:lastColumn="0" w:lastRow="0" w:noHBand="0" w:noVBand="1" w:val="04A0"/>
+      </w:tblPr>
+      <w:tblGrid>
+        <w:gridCol w:w="3024"/>
+        <w:gridCol w:w="3024"/>
+        <w:gridCol w:w="3024"/>
+      </w:tblGrid>
+      <w:tr>
+        <w:tc>
+          <w:tcPr>
+            <w:tcW w:type="dxa" w:w="3024"/>
           </w:tcPr>
           <w:p>
             <w:pPr>
@@ -680,22 +1918,13 @@
                 <w:i w:val="0"/>
                 <w:sz w:val="20"/>
               </w:rPr>
-              <w:t xml:space="preserve">R$ </w:t>
-            </w:r>
-            <w:r>
-              <w:rPr>
-                <w:b/>
-                <w:i w:val="0"/>
-                <w:sz w:val="20"/>
-                <w:highlight w:val="yellow"/>
-              </w:rPr>
-              <w:t>[__]</w:t>
+              <w:t>Data</w:t>
             </w:r>
           </w:p>
         </w:tc>
         <w:tc>
           <w:tcPr>
-            <w:tcW w:type="dxa" w:w="1814"/>
+            <w:tcW w:type="dxa" w:w="3024"/>
           </w:tcPr>
           <w:p>
             <w:pPr>
@@ -707,16 +1936,249 @@
                 <w:i w:val="0"/>
                 <w:sz w:val="20"/>
               </w:rPr>
-              <w:t xml:space="preserve">R$ </w:t>
+              <w:t>Crédito liberado</w:t>
             </w:r>
+          </w:p>
+        </w:tc>
+        <w:tc>
+          <w:tcPr>
+            <w:tcW w:type="dxa" w:w="3024"/>
+          </w:tcPr>
+          <w:p>
+            <w:pPr>
+              <w:spacing w:line="240" w:lineRule="auto"/>
+            </w:pPr>
             <w:r>
               <w:rPr>
                 <w:b/>
                 <w:i w:val="0"/>
                 <w:sz w:val="20"/>
-                <w:highlight w:val="yellow"/>
               </w:rPr>
-              <w:t>[__]</w:t>
+              <w:t>Débito imediato (Renegociação I)</w:t>
+            </w:r>
+          </w:p>
+        </w:tc>
+      </w:tr>
+      <w:tr>
+        <w:tc>
+          <w:tcPr>
+            <w:tcW w:type="dxa" w:w="3024"/>
+          </w:tcPr>
+          <w:p>
+            <w:pPr>
+              <w:spacing w:line="240" w:lineRule="auto"/>
+            </w:pPr>
+            <w:r>
+              <w:rPr>
+                <w:b w:val="0"/>
+                <w:i w:val="0"/>
+                <w:sz w:val="20"/>
+              </w:rPr>
+              <w:t>04/03/2026</w:t>
+            </w:r>
+          </w:p>
+        </w:tc>
+        <w:tc>
+          <w:tcPr>
+            <w:tcW w:type="dxa" w:w="3024"/>
+          </w:tcPr>
+          <w:p>
+            <w:pPr>
+              <w:spacing w:line="240" w:lineRule="auto"/>
+            </w:pPr>
+            <w:r>
+              <w:rPr>
+                <w:b w:val="0"/>
+                <w:i w:val="0"/>
+                <w:sz w:val="20"/>
+              </w:rPr>
+              <w:t>R$ 7.200,00 – contrato 204465045 (BB Crédito Consignação)</w:t>
+            </w:r>
+          </w:p>
+        </w:tc>
+        <w:tc>
+          <w:tcPr>
+            <w:tcW w:type="dxa" w:w="3024"/>
+          </w:tcPr>
+          <w:p>
+            <w:pPr>
+              <w:spacing w:line="240" w:lineRule="auto"/>
+            </w:pPr>
+            <w:r>
+              <w:rPr>
+                <w:b w:val="0"/>
+                <w:i w:val="0"/>
+                <w:sz w:val="20"/>
+              </w:rPr>
+              <w:t>R$ 4.785,98</w:t>
+            </w:r>
+          </w:p>
+        </w:tc>
+      </w:tr>
+      <w:tr>
+        <w:tc>
+          <w:tcPr>
+            <w:tcW w:type="dxa" w:w="3024"/>
+          </w:tcPr>
+          <w:p>
+            <w:pPr>
+              <w:spacing w:line="240" w:lineRule="auto"/>
+            </w:pPr>
+            <w:r>
+              <w:rPr>
+                <w:b w:val="0"/>
+                <w:i w:val="0"/>
+                <w:sz w:val="20"/>
+              </w:rPr>
+              <w:t>09/03/2026</w:t>
+            </w:r>
+          </w:p>
+        </w:tc>
+        <w:tc>
+          <w:tcPr>
+            <w:tcW w:type="dxa" w:w="3024"/>
+          </w:tcPr>
+          <w:p>
+            <w:pPr>
+              <w:spacing w:line="240" w:lineRule="auto"/>
+            </w:pPr>
+            <w:r>
+              <w:rPr>
+                <w:b w:val="0"/>
+                <w:i w:val="0"/>
+                <w:sz w:val="20"/>
+              </w:rPr>
+              <w:t>R$ 7.500,00 – contrato 206541263 (BB Renovação Consignação)</w:t>
+            </w:r>
+          </w:p>
+        </w:tc>
+        <w:tc>
+          <w:tcPr>
+            <w:tcW w:type="dxa" w:w="3024"/>
+          </w:tcPr>
+          <w:p>
+            <w:pPr>
+              <w:spacing w:line="240" w:lineRule="auto"/>
+            </w:pPr>
+            <w:r>
+              <w:rPr>
+                <w:b w:val="0"/>
+                <w:i w:val="0"/>
+                <w:sz w:val="20"/>
+              </w:rPr>
+              <w:t>R$ 2.274,12</w:t>
+            </w:r>
+          </w:p>
+        </w:tc>
+      </w:tr>
+      <w:tr>
+        <w:tc>
+          <w:tcPr>
+            <w:tcW w:type="dxa" w:w="3024"/>
+          </w:tcPr>
+          <w:p>
+            <w:pPr>
+              <w:spacing w:line="240" w:lineRule="auto"/>
+            </w:pPr>
+            <w:r>
+              <w:rPr>
+                <w:b w:val="0"/>
+                <w:i w:val="0"/>
+                <w:sz w:val="20"/>
+              </w:rPr>
+              <w:t>31/03/2026</w:t>
+            </w:r>
+          </w:p>
+        </w:tc>
+        <w:tc>
+          <w:tcPr>
+            <w:tcW w:type="dxa" w:w="3024"/>
+          </w:tcPr>
+          <w:p>
+            <w:pPr>
+              <w:spacing w:line="240" w:lineRule="auto"/>
+            </w:pPr>
+            <w:r>
+              <w:rPr>
+                <w:b w:val="0"/>
+                <w:i w:val="0"/>
+                <w:sz w:val="20"/>
+              </w:rPr>
+              <w:t>R$ 5.300,00 – contrato 208660618 (BB Crédito Consignação)</w:t>
+            </w:r>
+          </w:p>
+        </w:tc>
+        <w:tc>
+          <w:tcPr>
+            <w:tcW w:type="dxa" w:w="3024"/>
+          </w:tcPr>
+          <w:p>
+            <w:pPr>
+              <w:spacing w:line="240" w:lineRule="auto"/>
+            </w:pPr>
+            <w:r>
+              <w:rPr>
+                <w:b w:val="0"/>
+                <w:i w:val="0"/>
+                <w:sz w:val="20"/>
+              </w:rPr>
+              <w:t>R$ 1.201,27</w:t>
+            </w:r>
+          </w:p>
+        </w:tc>
+      </w:tr>
+      <w:tr>
+        <w:tc>
+          <w:tcPr>
+            <w:tcW w:type="dxa" w:w="3024"/>
+          </w:tcPr>
+          <w:p>
+            <w:pPr>
+              <w:spacing w:line="240" w:lineRule="auto"/>
+            </w:pPr>
+            <w:r>
+              <w:rPr>
+                <w:b/>
+                <w:i w:val="0"/>
+                <w:sz w:val="20"/>
+              </w:rPr>
+              <w:t>Total</w:t>
+            </w:r>
+          </w:p>
+        </w:tc>
+        <w:tc>
+          <w:tcPr>
+            <w:tcW w:type="dxa" w:w="3024"/>
+          </w:tcPr>
+          <w:p>
+            <w:pPr>
+              <w:spacing w:line="240" w:lineRule="auto"/>
+            </w:pPr>
+            <w:r>
+              <w:rPr>
+                <w:b/>
+                <w:i w:val="0"/>
+                <w:sz w:val="20"/>
+              </w:rPr>
+              <w:t>R$ 20.000,00</w:t>
+            </w:r>
+          </w:p>
+        </w:tc>
+        <w:tc>
+          <w:tcPr>
+            <w:tcW w:type="dxa" w:w="3024"/>
+          </w:tcPr>
+          <w:p>
+            <w:pPr>
+              <w:spacing w:line="240" w:lineRule="auto"/>
+            </w:pPr>
+            <w:r>
+              <w:rPr>
+                <w:b/>
+                <w:i w:val="0"/>
+                <w:sz w:val="20"/>
+              </w:rPr>
+              <w:t>R$ 8.261,37</w:t>
             </w:r>
           </w:p>
         </w:tc>
@@ -732,63 +2194,7 @@
           <w:b w:val="0"/>
           <w:i w:val="0"/>
         </w:rPr>
-        <w:t xml:space="preserve">As dívidas acima decorrem de relações de consumo e foram contraídas para </w:t>
-      </w:r>
-      <w:r>
-        <w:rPr>
-          <w:b w:val="0"/>
-          <w:i w:val="0"/>
-          <w:highlight w:val="yellow"/>
-        </w:rPr>
-        <w:t>[descrever: despesas básicas, tratamento de saúde, manutenção da família etc.]</w:t>
-      </w:r>
-      <w:r>
-        <w:rPr>
-          <w:b w:val="0"/>
-          <w:i w:val="0"/>
-        </w:rPr>
-        <w:t>.</w:t>
-      </w:r>
-    </w:p>
-    <w:p>
-      <w:pPr>
-        <w:ind w:firstLine="1417"/>
-        <w:jc w:val="both"/>
-      </w:pPr>
-      <w:r>
-        <w:rPr>
-          <w:b w:val="0"/>
-          <w:i w:val="0"/>
-        </w:rPr>
-        <w:t xml:space="preserve">O quadro financeiro do Autor agravou-se em razão de </w:t>
-      </w:r>
-      <w:r>
-        <w:rPr>
-          <w:b w:val="0"/>
-          <w:i w:val="0"/>
-          <w:highlight w:val="yellow"/>
-        </w:rPr>
-        <w:t>[redução salarial / desemprego / doença / separação / aumento do custo de vida / outro motivo]</w:t>
-      </w:r>
-      <w:r>
-        <w:rPr>
-          <w:b w:val="0"/>
-          <w:i w:val="0"/>
-        </w:rPr>
-        <w:t>, o que reduziu drasticamente sua capacidade de pagamento.</w:t>
-      </w:r>
-    </w:p>
-    <w:p>
-      <w:pPr>
-        <w:ind w:firstLine="1417"/>
-        <w:jc w:val="both"/>
-      </w:pPr>
-      <w:r>
-        <w:rPr>
-          <w:b w:val="0"/>
-          <w:i w:val="0"/>
-        </w:rPr>
-        <w:t xml:space="preserve">Atualmente, a renda mensal líquida do Autor é de R$ </w:t>
+        <w:t xml:space="preserve">Mais grave: os extratos de junho e agosto/2026 mostram, nos “lançamentos futuros”, que o Banco do Brasil passou a lançar automaticamente créditos sob a rubrica “EMPRÉSTIMO” para cobrir as parcelas de “Pagamento Empréstimo CDC” que o saldo zerado do Autor não comportava — por exemplo, em 06/08/2026, débitos de R$ 1.156,24, R$ 19,73, R$ 19,75, R$ 1.155,10 e R$ 735,60 (total de R$ 3.086,42), acompanhados de novos “EMPRÉSTIMOS” de R$ 1.155,10 e R$ 19,73 (docs. </w:t>
       </w:r>
       <w:r>
         <w:rPr>
@@ -803,7 +2209,46 @@
           <w:b w:val="0"/>
           <w:i w:val="0"/>
         </w:rPr>
-        <w:t xml:space="preserve">, ao passo que as parcelas das dívidas acima somam R$ </w:t>
+        <w:t>). Ou seja, o banco toma novo crédito em nome do consumidor para pagar crédito anterior, num ciclo que só faz aumentar a dívida.</w:t>
+      </w:r>
+    </w:p>
+    <w:p>
+      <w:pPr>
+        <w:spacing w:before="240"/>
+      </w:pPr>
+      <w:r>
+        <w:rPr>
+          <w:b/>
+          <w:i w:val="0"/>
+        </w:rPr>
+        <w:t>3.4. Das dívidas com o Bradesco</w:t>
+      </w:r>
+    </w:p>
+    <w:p>
+      <w:pPr>
+        <w:ind w:firstLine="1417"/>
+        <w:jc w:val="both"/>
+      </w:pPr>
+      <w:r>
+        <w:rPr>
+          <w:b w:val="0"/>
+          <w:i w:val="0"/>
+        </w:rPr>
+        <w:t xml:space="preserve">Além do consignado em folha no Município de União (R$ 2.266,17 mensais), o Autor mantém junto ao Banco Bradesco (agência 5792, conta 231325-1) os contratos de crédito pessoal nº 503906781 e nº 504307147, ambos em 120 parcelas, que vinham sendo pagos por débito em conta e hoje constam como </w:t>
+      </w:r>
+      <w:r>
+        <w:rPr>
+          <w:b/>
+          <w:i w:val="0"/>
+        </w:rPr>
+        <w:t>“OPERAÇÕES VENCIDAS” no valor de R$ 73.453,99</w:t>
+      </w:r>
+      <w:r>
+        <w:rPr>
+          <w:b w:val="0"/>
+          <w:i w:val="0"/>
+        </w:rPr>
+        <w:t xml:space="preserve"> (extrato de 18/06/2026 – doc. </w:t>
       </w:r>
       <w:r>
         <w:rPr>
@@ -818,7 +2263,73 @@
           <w:b w:val="0"/>
           <w:i w:val="0"/>
         </w:rPr>
-        <w:t xml:space="preserve">, o que representa </w:t>
+        <w:t>).</w:t>
+      </w:r>
+    </w:p>
+    <w:p>
+      <w:pPr>
+        <w:spacing w:before="240"/>
+      </w:pPr>
+      <w:r>
+        <w:rPr>
+          <w:b/>
+          <w:i w:val="0"/>
+        </w:rPr>
+        <w:t>3.5. Do comprometimento total da renda e da violação do mínimo existencial</w:t>
+      </w:r>
+    </w:p>
+    <w:p>
+      <w:pPr>
+        <w:ind w:firstLine="1417"/>
+        <w:jc w:val="both"/>
+      </w:pPr>
+      <w:r>
+        <w:rPr>
+          <w:b w:val="0"/>
+          <w:i w:val="0"/>
+        </w:rPr>
+        <w:t xml:space="preserve">Somando-se os consignados em folha (R$ 7.307,70) aos débitos em conta corrente documentados — BB Crédito Salário (≈ R$ 764,66), parcelas de CDC (R$ 3.086,42 em agosto/2026), BB Crédito Consignação debitado em conta (R$ 1.118,27) e seguros (≈ R$ 126,75) —, as obrigações mensais exigidas do Autor atingem cerca de </w:t>
+      </w:r>
+      <w:r>
+        <w:rPr>
+          <w:b/>
+          <w:i w:val="0"/>
+        </w:rPr>
+        <w:t>R$ 12.403,80, o que supera 100% de sua remuneração disponível (R$ 12.089,97)</w:t>
+      </w:r>
+      <w:r>
+        <w:rPr>
+          <w:b w:val="0"/>
+          <w:i w:val="0"/>
+        </w:rPr>
+        <w:t>, sem contar as parcelas vencidas do Bradesco (R$ 73.453,99).</w:t>
+      </w:r>
+    </w:p>
+    <w:p>
+      <w:pPr>
+        <w:ind w:firstLine="1417"/>
+        <w:jc w:val="both"/>
+      </w:pPr>
+      <w:r>
+        <w:rPr>
+          <w:b w:val="0"/>
+          <w:i w:val="0"/>
+        </w:rPr>
+        <w:t xml:space="preserve">Não por acaso, a conta corrente do Autor encerra todos os dias com </w:t>
+      </w:r>
+      <w:r>
+        <w:rPr>
+          <w:b/>
+          <w:i w:val="0"/>
+        </w:rPr>
+        <w:t>saldo R$ 0,00</w:t>
+      </w:r>
+      <w:r>
+        <w:rPr>
+          <w:b w:val="0"/>
+          <w:i w:val="0"/>
+        </w:rPr>
+        <w:t xml:space="preserve">, e os débitos de seguros, tributos e serviços são sucessivamente estornados por falta de fundos (extratos de março a setembro/2026 – docs. </w:t>
       </w:r>
       <w:r>
         <w:rPr>
@@ -833,7 +2344,20 @@
           <w:b w:val="0"/>
           <w:i w:val="0"/>
         </w:rPr>
-        <w:t xml:space="preserve">% de sua renda — percentual incompatível com o custeio das despesas essenciais de R$ </w:t>
+        <w:t>).</w:t>
+      </w:r>
+    </w:p>
+    <w:p>
+      <w:pPr>
+        <w:ind w:firstLine="1417"/>
+        <w:jc w:val="both"/>
+      </w:pPr>
+      <w:r>
+        <w:rPr>
+          <w:b w:val="0"/>
+          <w:i w:val="0"/>
+        </w:rPr>
+        <w:t xml:space="preserve">O Autor tem despesas essenciais mensais estimadas em R$ </w:t>
       </w:r>
       <w:r>
         <w:rPr>
@@ -848,506 +2372,7 @@
           <w:b w:val="0"/>
           <w:i w:val="0"/>
         </w:rPr>
-        <w:t xml:space="preserve"> mensais, demonstradas no item 5.</w:t>
-      </w:r>
-    </w:p>
-    <w:p>
-      <w:pPr>
-        <w:ind w:firstLine="1417"/>
-        <w:jc w:val="both"/>
-      </w:pPr>
-      <w:r>
-        <w:rPr>
-          <w:b w:val="0"/>
-          <w:i w:val="0"/>
-        </w:rPr>
-        <w:t xml:space="preserve">Apesar da evidente boa-fé, o Autor passou a sofrer </w:t>
-      </w:r>
-      <w:r>
-        <w:rPr>
-          <w:b w:val="0"/>
-          <w:i w:val="0"/>
-          <w:highlight w:val="yellow"/>
-        </w:rPr>
-        <w:t>[cobranças reiteradas / negativação / descontos que comprometem a renda]</w:t>
-      </w:r>
-      <w:r>
-        <w:rPr>
-          <w:b w:val="0"/>
-          <w:i w:val="0"/>
-        </w:rPr>
-        <w:t>, o que torna inviável o pagamento simultâneo de todas as obrigações sem prejuízo de sua dignidade e de sua subsistência.</w:t>
-      </w:r>
-    </w:p>
-    <w:p>
-      <w:pPr>
-        <w:ind w:firstLine="1417"/>
-        <w:jc w:val="both"/>
-      </w:pPr>
-      <w:r>
-        <w:rPr>
-          <w:b w:val="0"/>
-          <w:i w:val="0"/>
-        </w:rPr>
-        <w:t>O Autor não pretende se eximir das dívidas, mas reorganizá-las de forma a conseguir adimpli-las, por meio de plano de pagamento compatível com sua renda e com a preservação do mínimo existencial.</w:t>
-      </w:r>
-    </w:p>
-    <w:p>
-      <w:pPr>
-        <w:spacing w:before="240"/>
-      </w:pPr>
-      <w:r>
-        <w:rPr>
-          <w:b/>
-          <w:i w:val="0"/>
-        </w:rPr>
-        <w:t>3. DO DIREITO</w:t>
-      </w:r>
-    </w:p>
-    <w:p>
-      <w:pPr>
-        <w:ind w:firstLine="1417"/>
-        <w:jc w:val="both"/>
-      </w:pPr>
-      <w:r>
-        <w:rPr>
-          <w:b w:val="0"/>
-          <w:i w:val="0"/>
-        </w:rPr>
-        <w:t>A Lei nº 14.181/2021 introduziu no Código de Defesa do Consumidor disciplina específica para a prevenção e o tratamento do superendividamento, assegurando ao consumidor pessoa natural, de boa-fé, a possibilidade de repactuação global de suas dívidas de consumo.</w:t>
-      </w:r>
-    </w:p>
-    <w:p>
-      <w:pPr>
-        <w:ind w:firstLine="1417"/>
-        <w:jc w:val="both"/>
-      </w:pPr>
-      <w:r>
-        <w:rPr>
-          <w:b w:val="0"/>
-          <w:i w:val="0"/>
-        </w:rPr>
-        <w:t>Nos termos do art. 54-A, § 1º, do CDC, o superendividamento é a impossibilidade manifesta de o consumidor pessoa natural, de boa-fé, pagar a totalidade de suas dívidas de consumo, exigíveis e vincendas, sem comprometer seu mínimo existencial.</w:t>
-      </w:r>
-    </w:p>
-    <w:p>
-      <w:pPr>
-        <w:ind w:firstLine="1417"/>
-        <w:jc w:val="both"/>
-      </w:pPr>
-      <w:r>
-        <w:rPr>
-          <w:b w:val="0"/>
-          <w:i w:val="0"/>
-        </w:rPr>
-        <w:t>O art. 104-A do CDC autoriza o consumidor a requerer ao juízo a instauração de processo de repactuação de dívidas, com a designação de audiência conciliatória com a presença de todos os credores, na qual apresentará proposta de plano de pagamento com prazo máximo de 5 (cinco) anos. O não comparecimento injustificado de qualquer credor acarreta a suspensão da exigibilidade do débito e a interrupção dos encargos da mora, além da sujeição compulsória ao plano, se o montante devido for certo e conhecido pelo consumidor (art. 104-A, § 2º, do CDC). Não havendo êxito na conciliação, instaura-se, a pedido do consumidor, processo para revisão e integração dos contratos e repactuação das dívidas remanescentes mediante plano judicial compulsório (art. 104-B do CDC).</w:t>
-      </w:r>
-    </w:p>
-    <w:p>
-      <w:pPr>
-        <w:ind w:firstLine="1417"/>
-        <w:jc w:val="both"/>
-      </w:pPr>
-      <w:r>
-        <w:rPr>
-          <w:b w:val="0"/>
-          <w:i w:val="0"/>
-        </w:rPr>
-        <w:t>O objetivo da legislação é permitir uma solução equilibrada, preservando:</w:t>
-      </w:r>
-    </w:p>
-    <w:p>
-      <w:pPr>
-        <w:ind w:left="850" w:hanging="283"/>
-        <w:jc w:val="both"/>
-      </w:pPr>
-      <w:r>
-        <w:rPr>
-          <w:b w:val="0"/>
-          <w:i w:val="0"/>
-        </w:rPr>
-        <w:t>• a dignidade do consumidor;</w:t>
-      </w:r>
-    </w:p>
-    <w:p>
-      <w:pPr>
-        <w:ind w:left="850" w:hanging="283"/>
-        <w:jc w:val="both"/>
-      </w:pPr>
-      <w:r>
-        <w:rPr>
-          <w:b w:val="0"/>
-          <w:i w:val="0"/>
-        </w:rPr>
-        <w:t>• a boa-fé objetiva;</w:t>
-      </w:r>
-    </w:p>
-    <w:p>
-      <w:pPr>
-        <w:ind w:left="850" w:hanging="283"/>
-        <w:jc w:val="both"/>
-      </w:pPr>
-      <w:r>
-        <w:rPr>
-          <w:b w:val="0"/>
-          <w:i w:val="0"/>
-        </w:rPr>
-        <w:t>• a função social do crédito;</w:t>
-      </w:r>
-    </w:p>
-    <w:p>
-      <w:pPr>
-        <w:ind w:left="850" w:hanging="283"/>
-        <w:jc w:val="both"/>
-      </w:pPr>
-      <w:r>
-        <w:rPr>
-          <w:b w:val="0"/>
-          <w:i w:val="0"/>
-        </w:rPr>
-        <w:t>• o pagamento responsável e possível das obrigações.</w:t>
-      </w:r>
-    </w:p>
-    <w:p>
-      <w:pPr>
-        <w:ind w:firstLine="1417"/>
-        <w:jc w:val="both"/>
-      </w:pPr>
-      <w:r>
-        <w:rPr>
-          <w:b w:val="0"/>
-          <w:i w:val="0"/>
-        </w:rPr>
-        <w:t>No caso concreto, estão presentes os requisitos legais:</w:t>
-      </w:r>
-    </w:p>
-    <w:p>
-      <w:pPr>
-        <w:ind w:left="850" w:hanging="283"/>
-        <w:jc w:val="both"/>
-      </w:pPr>
-      <w:r>
-        <w:rPr>
-          <w:b w:val="0"/>
-          <w:i w:val="0"/>
-        </w:rPr>
-        <w:t>• o Autor é pessoa natural;</w:t>
-      </w:r>
-    </w:p>
-    <w:p>
-      <w:pPr>
-        <w:ind w:left="850" w:hanging="283"/>
-        <w:jc w:val="both"/>
-      </w:pPr>
-      <w:r>
-        <w:rPr>
-          <w:b w:val="0"/>
-          <w:i w:val="0"/>
-        </w:rPr>
-        <w:t>• as dívidas decorrem de relações de consumo e não se enquadram nas exclusões do art. 104-A, § 1º, do CDC (dívidas contraídas dolosamente sem o propósito de pagamento, contratos de crédito com garantia real, financiamentos imobiliários e crédito rural);</w:t>
-      </w:r>
-    </w:p>
-    <w:p>
-      <w:pPr>
-        <w:ind w:left="850" w:hanging="283"/>
-        <w:jc w:val="both"/>
-      </w:pPr>
-      <w:r>
-        <w:rPr>
-          <w:b w:val="0"/>
-          <w:i w:val="0"/>
-        </w:rPr>
-        <w:t>• há impossibilidade manifesta de pagamento integral sem comprometer o mínimo existencial;</w:t>
-      </w:r>
-    </w:p>
-    <w:p>
-      <w:pPr>
-        <w:ind w:left="850" w:hanging="283"/>
-        <w:jc w:val="both"/>
-      </w:pPr>
-      <w:r>
-        <w:rPr>
-          <w:b w:val="0"/>
-          <w:i w:val="0"/>
-        </w:rPr>
-        <w:t>• não há indício de fraude ou má-fé;</w:t>
-      </w:r>
-    </w:p>
-    <w:p>
-      <w:pPr>
-        <w:ind w:left="850" w:hanging="283"/>
-        <w:jc w:val="both"/>
-      </w:pPr>
-      <w:r>
-        <w:rPr>
-          <w:b w:val="0"/>
-          <w:i w:val="0"/>
-        </w:rPr>
-        <w:t>• há interesse real na composição e na repactuação das dívidas;</w:t>
-      </w:r>
-    </w:p>
-    <w:p>
-      <w:pPr>
-        <w:ind w:left="850" w:hanging="283"/>
-        <w:jc w:val="both"/>
-      </w:pPr>
-      <w:r>
-        <w:rPr>
-          <w:b w:val="0"/>
-          <w:i w:val="0"/>
-        </w:rPr>
-        <w:t>• o Autor não se valeu do procedimento de repactuação nos últimos 2 (dois) anos (art. 104-A, § 5º, do CDC).</w:t>
-      </w:r>
-    </w:p>
-    <w:p>
-      <w:pPr>
-        <w:ind w:firstLine="1417"/>
-        <w:jc w:val="both"/>
-      </w:pPr>
-      <w:r>
-        <w:rPr>
-          <w:b w:val="0"/>
-          <w:i w:val="0"/>
-        </w:rPr>
-        <w:t>Quanto ao mínimo existencial, o valor fixado pelo Decreto nº 11.150/2022 (com a redação do Decreto nº 11.567/2023) não deve ser tomado como parâmetro absoluto, sob pena de esvaziar a finalidade protetiva da lei — tanto que o tema é objeto de questionamento no Supremo Tribunal Federal (ADPFs 1005 e 1006). O mínimo existencial deve ser aferido no caso concreto, a partir das despesas essenciais efetivamente comprovadas.</w:t>
-      </w:r>
-    </w:p>
-    <w:p>
-      <w:pPr>
-        <w:ind w:firstLine="1417"/>
-        <w:jc w:val="both"/>
-      </w:pPr>
-      <w:r>
-        <w:rPr>
-          <w:b w:val="0"/>
-          <w:i w:val="0"/>
-        </w:rPr>
-        <w:t>Dessa forma, é medida de rigor a instauração do procedimento de superendividamento, com a convocação dos credores para audiência global de conciliação e a apreciação do plano de pagamento apresentado.</w:t>
-      </w:r>
-    </w:p>
-    <w:p>
-      <w:pPr>
-        <w:spacing w:before="240"/>
-      </w:pPr>
-      <w:r>
-        <w:rPr>
-          <w:b/>
-          <w:i w:val="0"/>
-        </w:rPr>
-        <w:t>4. DA TUTELA DE URGÊNCIA</w:t>
-      </w:r>
-    </w:p>
-    <w:p>
-      <w:pPr>
-        <w:ind w:firstLine="1417"/>
-        <w:jc w:val="both"/>
-      </w:pPr>
-      <w:r>
-        <w:rPr>
-          <w:b w:val="0"/>
-          <w:i w:val="0"/>
-        </w:rPr>
-        <w:t>Nos termos do art. 300 do CPC, estão presentes a probabilidade do direito e o perigo de dano.</w:t>
-      </w:r>
-    </w:p>
-    <w:p>
-      <w:pPr>
-        <w:ind w:firstLine="1417"/>
-        <w:jc w:val="both"/>
-      </w:pPr>
-      <w:r>
-        <w:rPr>
-          <w:b w:val="0"/>
-          <w:i w:val="0"/>
-        </w:rPr>
-        <w:t>A probabilidade do direito decorre da documentação anexa, que demonstra a renda mensal do Autor, suas despesas essenciais e a multiplicidade de dívidas de consumo cujo pagamento simultâneo é incompatível com o mínimo existencial.</w:t>
-      </w:r>
-    </w:p>
-    <w:p>
-      <w:pPr>
-        <w:ind w:firstLine="1417"/>
-        <w:jc w:val="both"/>
-      </w:pPr>
-      <w:r>
-        <w:rPr>
-          <w:b w:val="0"/>
-          <w:i w:val="0"/>
-        </w:rPr>
-        <w:t>O perigo de dano é evidente, pois a manutenção das cobranças, descontos e restrições agrava a situação econômica do Autor, inviabiliza sua subsistência e torna inócua a própria finalidade do processo.</w:t>
-      </w:r>
-    </w:p>
-    <w:p>
-      <w:pPr>
-        <w:ind w:firstLine="1417"/>
-        <w:jc w:val="both"/>
-      </w:pPr>
-      <w:r>
-        <w:rPr>
-          <w:b w:val="0"/>
-          <w:i w:val="0"/>
-        </w:rPr>
-        <w:t>A medida é reversível (art. 300, § 3º, do CPC), e o Autor declara que se absterá de condutas que importem no agravamento de sua situação de superendividamento (art. 104-A, § 4º, IV, do CDC).</w:t>
-      </w:r>
-    </w:p>
-    <w:p>
-      <w:pPr>
-        <w:ind w:firstLine="1417"/>
-        <w:jc w:val="both"/>
-      </w:pPr>
-      <w:r>
-        <w:rPr>
-          <w:b w:val="0"/>
-          <w:i w:val="0"/>
-        </w:rPr>
-        <w:t>Assim, é necessária a concessão de tutela provisória para determinar:</w:t>
-      </w:r>
-    </w:p>
-    <w:p>
-      <w:pPr>
-        <w:ind w:firstLine="1417"/>
-        <w:jc w:val="both"/>
-      </w:pPr>
-      <w:r>
-        <w:rPr>
-          <w:b w:val="0"/>
-          <w:i w:val="0"/>
-        </w:rPr>
-        <w:t>a) a suspensão das cobranças extrajudiciais relacionadas às dívidas objeto desta demanda;</w:t>
-      </w:r>
-    </w:p>
-    <w:p>
-      <w:pPr>
-        <w:ind w:firstLine="1417"/>
-        <w:jc w:val="both"/>
-      </w:pPr>
-      <w:r>
-        <w:rPr>
-          <w:b w:val="0"/>
-          <w:i w:val="0"/>
-        </w:rPr>
-        <w:t>b) a suspensão de atos de constrição em ações de cobrança ou execução eventualmente ajuizadas pelos credores abrangidos, relativamente a essas dívidas;</w:t>
-      </w:r>
-    </w:p>
-    <w:p>
-      <w:pPr>
-        <w:ind w:firstLine="1417"/>
-        <w:jc w:val="both"/>
-      </w:pPr>
-      <w:r>
-        <w:rPr>
-          <w:b w:val="0"/>
-          <w:i w:val="0"/>
-        </w:rPr>
-        <w:t>c) a abstenção de novas inscrições ou reinscrições em cadastros de inadimplentes, enquanto durar o procedimento, relativamente às dívidas ora discutidas;</w:t>
-      </w:r>
-    </w:p>
-    <w:p>
-      <w:pPr>
-        <w:ind w:firstLine="1417"/>
-        <w:jc w:val="both"/>
-      </w:pPr>
-      <w:r>
-        <w:rPr>
-          <w:b w:val="0"/>
-          <w:i w:val="0"/>
-        </w:rPr>
-        <w:t xml:space="preserve">d) havendo descontos automáticos em conta ou em folha, a sua limitação a </w:t>
-      </w:r>
-      <w:r>
-        <w:rPr>
-          <w:b w:val="0"/>
-          <w:i w:val="0"/>
-          <w:highlight w:val="yellow"/>
-        </w:rPr>
-        <w:t>[35]</w:t>
-      </w:r>
-      <w:r>
-        <w:rPr>
-          <w:b w:val="0"/>
-          <w:i w:val="0"/>
-        </w:rPr>
-        <w:t>% dos rendimentos líquidos do Autor, ou a sua suspensão, de modo a preservar o mínimo existencial, conforme a prova dos autos e a natureza da dívida;</w:t>
-      </w:r>
-    </w:p>
-    <w:p>
-      <w:pPr>
-        <w:ind w:firstLine="1417"/>
-        <w:jc w:val="both"/>
-      </w:pPr>
-      <w:r>
-        <w:rPr>
-          <w:b w:val="0"/>
-          <w:i w:val="0"/>
-        </w:rPr>
-        <w:t>e) a fixação de multa por ato de descumprimento, em valor a ser arbitrado por Vossa Excelência (art. 537 do CPC).</w:t>
-      </w:r>
-    </w:p>
-    <w:p>
-      <w:pPr>
-        <w:spacing w:before="240"/>
-      </w:pPr>
-      <w:r>
-        <w:rPr>
-          <w:b/>
-          <w:i w:val="0"/>
-        </w:rPr>
-        <w:t>5. DO PLANO DE PAGAMENTO PROPOSTO</w:t>
-      </w:r>
-    </w:p>
-    <w:p>
-      <w:pPr>
-        <w:ind w:firstLine="1417"/>
-        <w:jc w:val="both"/>
-      </w:pPr>
-      <w:r>
-        <w:rPr>
-          <w:b w:val="0"/>
-          <w:i w:val="0"/>
-        </w:rPr>
-        <w:t>Em observância ao art. 104-A do CDC, o Autor apresenta proposta inicial de repactuação, de acordo com sua real capacidade financeira.</w:t>
-      </w:r>
-    </w:p>
-    <w:p>
-      <w:pPr>
-        <w:ind w:firstLine="1417"/>
-        <w:jc w:val="both"/>
-      </w:pPr>
-      <w:r>
-        <w:rPr>
-          <w:b w:val="0"/>
-          <w:i w:val="0"/>
-        </w:rPr>
-        <w:t xml:space="preserve">Sua renda mensal líquida é de R$ </w:t>
-      </w:r>
-      <w:r>
-        <w:rPr>
-          <w:b w:val="0"/>
-          <w:i w:val="0"/>
-          <w:highlight w:val="yellow"/>
-        </w:rPr>
-        <w:t>[__]</w:t>
-      </w:r>
-      <w:r>
-        <w:rPr>
-          <w:b w:val="0"/>
-          <w:i w:val="0"/>
-        </w:rPr>
-        <w:t xml:space="preserve">, e suas despesas essenciais somam R$ </w:t>
-      </w:r>
-      <w:r>
-        <w:rPr>
-          <w:b w:val="0"/>
-          <w:i w:val="0"/>
-          <w:highlight w:val="yellow"/>
-        </w:rPr>
-        <w:t>[__]</w:t>
-      </w:r>
-      <w:r>
-        <w:rPr>
-          <w:b w:val="0"/>
-          <w:i w:val="0"/>
-        </w:rPr>
-        <w:t>, assim distribuídas:</w:t>
+        <w:t>, conforme quadro abaixo, que não consegue custear com regularidade:</w:t>
       </w:r>
     </w:p>
     <w:tbl>
@@ -1460,7 +2485,7 @@
                 <w:i w:val="0"/>
                 <w:sz w:val="20"/>
               </w:rPr>
-              <w:t>Moradia</w:t>
+              <w:t>Moradia (aluguel/condomínio/manutenção)</w:t>
             </w:r>
           </w:p>
         </w:tc>
@@ -1507,7 +2532,7 @@
                 <w:i w:val="0"/>
                 <w:sz w:val="20"/>
               </w:rPr>
-              <w:t>Água/luz/gás</w:t>
+              <w:t>Água, energia e gás</w:t>
             </w:r>
           </w:p>
         </w:tc>
@@ -1554,7 +2579,7 @@
                 <w:i w:val="0"/>
                 <w:sz w:val="20"/>
               </w:rPr>
-              <w:t>Transporte</w:t>
+              <w:t>Transporte (deslocamento entre Miguel Alves e União)</w:t>
             </w:r>
           </w:p>
         </w:tc>
@@ -1601,7 +2626,7 @@
                 <w:i w:val="0"/>
                 <w:sz w:val="20"/>
               </w:rPr>
-              <w:t>Saúde</w:t>
+              <w:t>Saúde e medicamentos</w:t>
             </w:r>
           </w:p>
         </w:tc>
@@ -1647,8 +2672,9 @@
                 <w:b w:val="0"/>
                 <w:i w:val="0"/>
                 <w:sz w:val="20"/>
+                <w:highlight w:val="yellow"/>
               </w:rPr>
-              <w:t>Despesas escolares/familiares</w:t>
+              <w:t>[Outras]</w:t>
             </w:r>
           </w:p>
         </w:tc>
@@ -1737,38 +2763,414 @@
         <w:rPr>
           <w:b w:val="0"/>
           <w:i w:val="0"/>
+          <w:highlight w:val="yellow"/>
         </w:rPr>
-        <w:t xml:space="preserve">Assim, o Autor propõe o pagamento mensal de R$ </w:t>
+        <w:t>[Descrever, com as palavras do cliente, como começou o endividamento: motivo dos primeiros empréstimos, divórcio, despesas familiares, saúde etc.]</w:t>
       </w:r>
+    </w:p>
+    <w:p>
+      <w:pPr>
+        <w:ind w:firstLine="1417"/>
+        <w:jc w:val="both"/>
+      </w:pPr>
       <w:r>
         <w:rPr>
           <w:b w:val="0"/>
           <w:i w:val="0"/>
-          <w:highlight w:val="yellow"/>
         </w:rPr>
-        <w:t>[__]</w:t>
+        <w:t>O Autor não pretende se eximir de suas obrigações. Busca reorganizá-las, por meio de plano de pagamento compatível com sua renda, que preserve o mínimo necessário à sua subsistência.</w:t>
+      </w:r>
+    </w:p>
+    <w:p>
+      <w:pPr>
+        <w:spacing w:before="240"/>
+      </w:pPr>
+      <w:r>
+        <w:rPr>
+          <w:b/>
+          <w:i w:val="0"/>
+        </w:rPr>
+        <w:t>4. DO DIREITO</w:t>
+      </w:r>
+    </w:p>
+    <w:p>
+      <w:pPr>
+        <w:spacing w:before="240"/>
+      </w:pPr>
+      <w:r>
+        <w:rPr>
+          <w:b/>
+          <w:i w:val="0"/>
+        </w:rPr>
+        <w:t>4.1. Da relação de consumo e da inversão do ônus da prova</w:t>
+      </w:r>
+    </w:p>
+    <w:p>
+      <w:pPr>
+        <w:ind w:firstLine="1417"/>
+        <w:jc w:val="both"/>
+      </w:pPr>
+      <w:r>
+        <w:rPr>
+          <w:b w:val="0"/>
+          <w:i w:val="0"/>
+        </w:rPr>
+        <w:t>A relação entre o Autor e as instituições financeiras é de consumo (arts. 2º e 3º, § 2º, do CDC; Súmula 297 do STJ). Presentes a verossimilhança das alegações, comprovadas por contracheques e extratos, e a hipossuficiência técnica e informacional do consumidor, que não dispõe das cópias dos contratos nem dos demonstrativos de saldo devedor, impõe-se a inversão do ônus da prova (art. 6º, VIII, do CDC), com a determinação de que os Réus exibam os contratos e o demonstrativo atualizado de cada operação.</w:t>
+      </w:r>
+    </w:p>
+    <w:p>
+      <w:pPr>
+        <w:spacing w:before="240"/>
+      </w:pPr>
+      <w:r>
+        <w:rPr>
+          <w:b/>
+          <w:i w:val="0"/>
+        </w:rPr>
+        <w:t>4.2. Do superendividamento</w:t>
+      </w:r>
+    </w:p>
+    <w:p>
+      <w:pPr>
+        <w:ind w:firstLine="1417"/>
+        <w:jc w:val="both"/>
+      </w:pPr>
+      <w:r>
+        <w:rPr>
+          <w:b w:val="0"/>
+          <w:i w:val="0"/>
+        </w:rPr>
+        <w:t>O art. 54-A, § 1º, do CDC define o superendividamento como “a impossibilidade manifesta de o consumidor pessoa natural, de boa-fé, pagar a totalidade de suas dívidas de consumo, exigíveis e vincendas, sem comprometer seu mínimo existencial, nos termos da regulamentação”.</w:t>
+      </w:r>
+    </w:p>
+    <w:p>
+      <w:pPr>
+        <w:ind w:firstLine="1417"/>
+        <w:jc w:val="both"/>
+      </w:pPr>
+      <w:r>
+        <w:rPr>
+          <w:b w:val="0"/>
+          <w:i w:val="0"/>
+        </w:rPr>
+        <w:t>Os documentos demonstram que as dívidas de consumo exigíveis consomem a totalidade da renda disponível do Autor, que vive com a conta zerada e depende de novos créditos para honrar os anteriores. Trata-se de típica situação de superendividamento.</w:t>
+      </w:r>
+    </w:p>
+    <w:p>
+      <w:pPr>
+        <w:ind w:firstLine="1417"/>
+        <w:jc w:val="both"/>
+      </w:pPr>
+      <w:r>
+        <w:rPr>
+          <w:b w:val="0"/>
+          <w:i w:val="0"/>
+        </w:rPr>
+        <w:t>Quanto ao mínimo existencial, o valor fixado pelo Decreto nº 11.150/2022 (com a redação do Decreto nº 11.567/2023) não deve ser tomado como parâmetro absoluto, sob pena de esvaziar a finalidade protetiva da lei — tema, inclusive, questionado no Supremo Tribunal Federal (ADPFs 1005 e 1006). O mínimo existencial deve ser aferido no caso concreto, à luz das despesas essenciais efetivamente comprovadas e do princípio da dignidade da pessoa humana (art. 1º, III, da CF).</w:t>
+      </w:r>
+    </w:p>
+    <w:p>
+      <w:pPr>
+        <w:spacing w:before="240"/>
+      </w:pPr>
+      <w:r>
+        <w:rPr>
+          <w:b/>
+          <w:i w:val="0"/>
+        </w:rPr>
+        <w:t>4.3. Da concessão irresponsável de crédito (arts. 54-C e 54-D do CDC)</w:t>
+      </w:r>
+    </w:p>
+    <w:p>
+      <w:pPr>
+        <w:ind w:firstLine="1417"/>
+        <w:jc w:val="both"/>
+      </w:pPr>
+      <w:r>
+        <w:rPr>
+          <w:b w:val="0"/>
+          <w:i w:val="0"/>
+        </w:rPr>
+        <w:t>O art. 6º, XI, do CDC assegura ao consumidor “a garantia de práticas de crédito responsável”, e o art. 54-D, II, impõe ao fornecedor o dever de, previamente à contratação, “avaliar, de forma responsável, as condições de crédito do consumidor”.</w:t>
+      </w:r>
+    </w:p>
+    <w:p>
+      <w:pPr>
+        <w:ind w:firstLine="1417"/>
+        <w:jc w:val="both"/>
+      </w:pPr>
+      <w:r>
+        <w:rPr>
+          <w:b w:val="0"/>
+          <w:i w:val="0"/>
+        </w:rPr>
+        <w:t>No caso, os Réus concederam ao Autor sucessivos créditos de 120 parcelas, em montante que ultrapassa a margem consignável indicada nos próprios contracheques; o Banco do Brasil liberou três consignados em um único mês para amortizar renegociação anterior; e passou a lançar “empréstimos” automáticos para cobrir parcelas de outros empréstimos. Essa conduta viola frontalmente os deveres de informação, de avaliação responsável e de cooperação, e autoriza, nos termos do parágrafo único do art. 54-D do CDC, a redução dos juros e encargos e a dilação do prazo de pagamento, sem prejuízo da revisão contratual no procedimento do art. 104-B.</w:t>
+      </w:r>
+    </w:p>
+    <w:p>
+      <w:pPr>
+        <w:spacing w:before="240"/>
+      </w:pPr>
+      <w:r>
+        <w:rPr>
+          <w:b/>
+          <w:i w:val="0"/>
+        </w:rPr>
+        <w:t>4.4. Da repactuação das dívidas (arts. 104-A e 104-B do CDC)</w:t>
+      </w:r>
+    </w:p>
+    <w:p>
+      <w:pPr>
+        <w:ind w:firstLine="1417"/>
+        <w:jc w:val="both"/>
+      </w:pPr>
+      <w:r>
+        <w:rPr>
+          <w:b w:val="0"/>
+          <w:i w:val="0"/>
+        </w:rPr>
+        <w:t>O art. 104-A do CDC autoriza o consumidor superendividado a requerer a instauração de processo de repactuação de dívidas, com audiência conciliatória em que apresentará proposta de plano de pagamento com prazo máximo de 5 (cinco) anos, preservado o mínimo existencial. O não comparecimento injustificado do credor acarreta a suspensão da exigibilidade do débito e a interrupção dos encargos da mora, além da sujeição compulsória ao plano (art. 104-A, § 2º). Frustrada a conciliação, instaura-se, a pedido do consumidor, processo por superendividamento para revisão e integração dos contratos e repactuação das dívidas remanescentes mediante plano judicial compulsório (art. 104-B).</w:t>
+      </w:r>
+    </w:p>
+    <w:p>
+      <w:pPr>
+        <w:ind w:firstLine="1417"/>
+        <w:jc w:val="both"/>
+      </w:pPr>
+      <w:r>
+        <w:rPr>
+          <w:b w:val="0"/>
+          <w:i w:val="0"/>
+        </w:rPr>
+        <w:t>As dívidas objeto desta ação decorrem de contratos de crédito pessoal, consignado e de serviços bancários, e não se enquadram nas exclusões do art. 104-A, § 1º, do CDC.</w:t>
+      </w:r>
+    </w:p>
+    <w:p>
+      <w:pPr>
+        <w:spacing w:before="240"/>
+      </w:pPr>
+      <w:r>
+        <w:rPr>
+          <w:b/>
+          <w:i w:val="0"/>
+        </w:rPr>
+        <w:t>4.5. Da inaplicabilidade do Tema 1.085 do STJ</w:t>
+      </w:r>
+    </w:p>
+    <w:p>
+      <w:pPr>
+        <w:ind w:firstLine="1417"/>
+        <w:jc w:val="both"/>
+      </w:pPr>
+      <w:r>
+        <w:rPr>
+          <w:b w:val="0"/>
+          <w:i w:val="0"/>
+        </w:rPr>
+        <w:t>O Tema 1.085 do STJ (REsp 1.863.973/SP) não se aplica ao caso. Não se pretende a aplicação analógica do limite de consignação a descontos em conta corrente: pretende-se, com base na Lei nº 14.181/2021, a repactuação global das dívidas de consumidor superendividado, com preservação do mínimo existencial. Ademais, quanto aos consignados em folha, o excesso decorre da própria superação da margem consignável informada pelos órgãos pagadores.</w:t>
+      </w:r>
+    </w:p>
+    <w:p>
+      <w:pPr>
+        <w:spacing w:before="240"/>
+      </w:pPr>
+      <w:r>
+        <w:rPr>
+          <w:b/>
+          <w:i w:val="0"/>
+        </w:rPr>
+        <w:t>5. DA TUTELA DE URGÊNCIA</w:t>
+      </w:r>
+    </w:p>
+    <w:p>
+      <w:pPr>
+        <w:ind w:firstLine="1417"/>
+        <w:jc w:val="both"/>
+      </w:pPr>
+      <w:r>
+        <w:rPr>
+          <w:b/>
+          <w:i w:val="0"/>
+        </w:rPr>
+        <w:t>Probabilidade do direito.</w:t>
       </w:r>
       <w:r>
         <w:rPr>
           <w:b w:val="0"/>
           <w:i w:val="0"/>
         </w:rPr>
-        <w:t xml:space="preserve">, pelo prazo de </w:t>
+        <w:t xml:space="preserve"> Os contracheques comprovam que os consignados consomem 60,44% da remuneração disponível do Autor, acima da margem consignável informada pelos próprios órgãos pagadores (margem residual de R$ 1,26 em Miguel Alves; desconto de R$ 2.266,17 contra margem de R$ 1.168,24 em União). Os extratos comprovam a conta corrente zerada, os débitos sucessivos e a concessão automática de novos empréstimos para pagar os anteriores.</w:t>
       </w:r>
+    </w:p>
+    <w:p>
+      <w:pPr>
+        <w:ind w:firstLine="1417"/>
+        <w:jc w:val="both"/>
+      </w:pPr>
       <w:r>
         <w:rPr>
-          <w:b w:val="0"/>
+          <w:b/>
           <w:i w:val="0"/>
-          <w:highlight w:val="yellow"/>
         </w:rPr>
-        <w:t>[__]</w:t>
+        <w:t>Perigo de dano.</w:t>
       </w:r>
       <w:r>
         <w:rPr>
           <w:b w:val="0"/>
           <w:i w:val="0"/>
         </w:rPr>
-        <w:t xml:space="preserve"> meses (limitado a 60 meses), com divisão proporcional entre os credores, na forma abaixo:</w:t>
+        <w:t xml:space="preserve"> A cada mês, o Autor tem sua renda integralmente absorvida pelas dívidas, sem condições de custear alimentação, moradia, transporte e saúde, e de manter a pensão alimentícia devida a seus dependentes. A espera pela audiência de conciliação agravará a dívida, diante dos novos “empréstimos” automáticos lançados pelo Banco do Brasil.</w:t>
+      </w:r>
+    </w:p>
+    <w:p>
+      <w:pPr>
+        <w:ind w:firstLine="1417"/>
+        <w:jc w:val="both"/>
+      </w:pPr>
+      <w:r>
+        <w:rPr>
+          <w:b/>
+          <w:i w:val="0"/>
+        </w:rPr>
+        <w:t>Reversibilidade.</w:t>
+      </w:r>
+      <w:r>
+        <w:rPr>
+          <w:b w:val="0"/>
+          <w:i w:val="0"/>
+        </w:rPr>
+        <w:t xml:space="preserve"> A medida é reversível (art. 300, § 3º, do CPC): o Autor não se nega a pagar, mas pede a reorganização das dívidas, podendo os descontos ser restabelecidos em caso de improcedência. O Autor declara, desde já, que se absterá de contrair novas dívidas e de praticar condutas que agravem sua situação de superendividamento (art. 104-A, § 4º, IV, do CDC).</w:t>
+      </w:r>
+    </w:p>
+    <w:p>
+      <w:pPr>
+        <w:ind w:firstLine="1417"/>
+        <w:jc w:val="both"/>
+      </w:pPr>
+      <w:r>
+        <w:rPr>
+          <w:b w:val="0"/>
+          <w:i w:val="0"/>
+        </w:rPr>
+        <w:t>Assim, requer a concessão de tutela de urgência para:</w:t>
+      </w:r>
+    </w:p>
+    <w:p>
+      <w:pPr>
+        <w:ind w:firstLine="1417"/>
+        <w:jc w:val="both"/>
+      </w:pPr>
+      <w:r>
+        <w:rPr>
+          <w:b w:val="0"/>
+          <w:i w:val="0"/>
+        </w:rPr>
+        <w:t>a) limitar os descontos de empréstimos consignados em folha a 35% (trinta e cinco por cento) da remuneração disponível de cada vínculo — R$ 3.059,35 em Miguel Alves e R$ 1.172,14 em União —, com rateio proporcional entre os contratos, expedindo-se ofício à Secretaria Municipal de Educação de Miguel Alves e ao Município de União para cumprimento;</w:t>
+      </w:r>
+    </w:p>
+    <w:p>
+      <w:pPr>
+        <w:ind w:firstLine="1417"/>
+        <w:jc w:val="both"/>
+      </w:pPr>
+      <w:r>
+        <w:rPr>
+          <w:b w:val="0"/>
+          <w:i w:val="0"/>
+        </w:rPr>
+        <w:t>b) determinar ao Banco do Brasil que se abstenha de debitar da conta corrente do Autor parcelas de empréstimos (CDC, Crédito Salário, Renegociação e Consignação), bem como de lançar novos “empréstimos” automáticos para cobertura de parcelas, até a audiência de conciliação;</w:t>
+      </w:r>
+    </w:p>
+    <w:p>
+      <w:pPr>
+        <w:ind w:firstLine="1417"/>
+        <w:jc w:val="both"/>
+      </w:pPr>
+      <w:r>
+        <w:rPr>
+          <w:b w:val="0"/>
+          <w:i w:val="0"/>
+        </w:rPr>
+        <w:t>c) determinar aos Réus que se abstenham de inscrever o nome do Autor em cadastros de inadimplentes, ou que excluam as inscrições existentes, relativamente às dívidas objeto desta ação;</w:t>
+      </w:r>
+    </w:p>
+    <w:p>
+      <w:pPr>
+        <w:ind w:firstLine="1417"/>
+        <w:jc w:val="both"/>
+      </w:pPr>
+      <w:r>
+        <w:rPr>
+          <w:b w:val="0"/>
+          <w:i w:val="0"/>
+        </w:rPr>
+        <w:t>d) suspender a exigibilidade dos valores que excederem os limites acima, sem incidência de encargos moratórios, até a audiência de conciliação;</w:t>
+      </w:r>
+    </w:p>
+    <w:p>
+      <w:pPr>
+        <w:ind w:firstLine="1417"/>
+        <w:jc w:val="both"/>
+      </w:pPr>
+      <w:r>
+        <w:rPr>
+          <w:b w:val="0"/>
+          <w:i w:val="0"/>
+        </w:rPr>
+        <w:t>e) fixar multa por ato de descumprimento, em valor a ser arbitrado por Vossa Excelência (art. 537 do CPC).</w:t>
+      </w:r>
+    </w:p>
+    <w:p>
+      <w:pPr>
+        <w:spacing w:before="240"/>
+      </w:pPr>
+      <w:r>
+        <w:rPr>
+          <w:b/>
+          <w:i w:val="0"/>
+        </w:rPr>
+        <w:t>6. DO PLANO DE PAGAMENTO PROPOSTO</w:t>
+      </w:r>
+    </w:p>
+    <w:p>
+      <w:pPr>
+        <w:ind w:firstLine="1417"/>
+        <w:jc w:val="both"/>
+      </w:pPr>
+      <w:r>
+        <w:rPr>
+          <w:b w:val="0"/>
+          <w:i w:val="0"/>
+        </w:rPr>
+        <w:t xml:space="preserve">Em atenção ao art. 104-A do CDC, o Autor apresenta proposta preliminar de plano de pagamento: o pagamento mensal de </w:t>
+      </w:r>
+      <w:r>
+        <w:rPr>
+          <w:b/>
+          <w:i w:val="0"/>
+        </w:rPr>
+        <w:t>R$ 4.231,49</w:t>
+      </w:r>
+      <w:r>
+        <w:rPr>
+          <w:b w:val="0"/>
+          <w:i w:val="0"/>
+        </w:rPr>
+        <w:t xml:space="preserve">, correspondente a 35% de sua remuneração disponível, pelo prazo de </w:t>
+      </w:r>
+      <w:r>
+        <w:rPr>
+          <w:b/>
+          <w:i w:val="0"/>
+        </w:rPr>
+        <w:t>60 (sessenta) meses</w:t>
+      </w:r>
+      <w:r>
+        <w:rPr>
+          <w:b w:val="0"/>
+          <w:i w:val="0"/>
+        </w:rPr>
+        <w:t>, totalizando R$ 253.889,40, rateado entre os credores na proporção de seus créditos, mediante desconto em folha.</w:t>
       </w:r>
     </w:p>
     <w:tbl>
@@ -1816,7 +3218,7 @@
                 <w:i w:val="0"/>
                 <w:sz w:val="20"/>
               </w:rPr>
-              <w:t>Valor devido</w:t>
+              <w:t>Saldo devedor</w:t>
             </w:r>
           </w:p>
         </w:tc>
@@ -1834,7 +3236,7 @@
                 <w:i w:val="0"/>
                 <w:sz w:val="20"/>
               </w:rPr>
-              <w:t>% da dívida total</w:t>
+              <w:t>% do total</w:t>
             </w:r>
           </w:p>
         </w:tc>
@@ -1872,7 +3274,7 @@
                 <w:i w:val="0"/>
                 <w:sz w:val="20"/>
               </w:rPr>
-              <w:t>Banco Bradesco S.A.</w:t>
+              <w:t>Banco do Brasil S.A.</w:t>
             </w:r>
           </w:p>
         </w:tc>
@@ -1973,7 +3375,7 @@
                 <w:i w:val="0"/>
                 <w:sz w:val="20"/>
               </w:rPr>
-              <w:t>Banco do Brasil S.A.</w:t>
+              <w:t>Banco Bradesco S.A.</w:t>
             </w:r>
           </w:p>
         </w:tc>
@@ -2137,16 +3539,7 @@
                 <w:i w:val="0"/>
                 <w:sz w:val="20"/>
               </w:rPr>
-              <w:t xml:space="preserve">R$ </w:t>
-            </w:r>
-            <w:r>
-              <w:rPr>
-                <w:b/>
-                <w:i w:val="0"/>
-                <w:sz w:val="20"/>
-                <w:highlight w:val="yellow"/>
-              </w:rPr>
-              <w:t>[__]</w:t>
+              <w:t>R$ 4.231,49</w:t>
             </w:r>
           </w:p>
         </w:tc>
@@ -2162,35 +3555,7 @@
           <w:b w:val="0"/>
           <w:i w:val="0"/>
         </w:rPr>
-        <w:t xml:space="preserve">Nos termos do art. 104-A, § 4º, do CDC, o plano contempla: (i) a dilação dos prazos de pagamento e a redução dos encargos da dívida; (ii) a suspensão ou extinção das ações judiciais em curso relativas às dívidas abrangidas; (iii) a exclusão do nome do Autor dos cadastros de inadimplentes no prazo de </w:t>
-      </w:r>
-      <w:r>
-        <w:rPr>
-          <w:b w:val="0"/>
-          <w:i w:val="0"/>
-          <w:highlight w:val="yellow"/>
-        </w:rPr>
-        <w:t>[__]</w:t>
-      </w:r>
-      <w:r>
-        <w:rPr>
-          <w:b w:val="0"/>
-          <w:i w:val="0"/>
-        </w:rPr>
-        <w:t xml:space="preserve"> dias após a homologação; e (iv) o condicionamento de seus efeitos à abstenção, pelo Autor, de condutas que agravem sua situação de superendividamento.</w:t>
-      </w:r>
-    </w:p>
-    <w:p>
-      <w:pPr>
-        <w:ind w:firstLine="1417"/>
-        <w:jc w:val="both"/>
-      </w:pPr>
-      <w:r>
-        <w:rPr>
-          <w:b w:val="0"/>
-          <w:i w:val="0"/>
-        </w:rPr>
-        <w:t>A proposta poderá ser ajustada em audiência, conforme a participação dos credores e a avaliação judicial da real capacidade de pagamento do Autor.</w:t>
+        <w:t>Os percentuais serão definidos após a exibição, pelos Réus, dos demonstrativos atualizados de saldo devedor. Nos termos do art. 104-A, § 4º, do CDC, o plano contempla: (i) a dilação dos prazos de pagamento e a redução dos encargos; (ii) a suspensão das ações judiciais em curso relativas às dívidas abrangidas; (iii) a exclusão do nome do Autor dos cadastros de inadimplentes em até 5 (cinco) dias após a homologação; e (iv) o condicionamento de seus efeitos à abstenção, pelo Autor, de condutas que agravem sua situação de superendividamento.</w:t>
       </w:r>
     </w:p>
     <w:p>
@@ -2202,7 +3567,7 @@
           <w:b/>
           <w:i w:val="0"/>
         </w:rPr>
-        <w:t>6. DOS PEDIDOS</w:t>
+        <w:t>7. DOS PEDIDOS</w:t>
       </w:r>
     </w:p>
     <w:p>
@@ -2228,7 +3593,7 @@
           <w:b w:val="0"/>
           <w:i w:val="0"/>
         </w:rPr>
-        <w:t>1. a concessão dos benefícios da gratuidade da justiça;</w:t>
+        <w:t>1. a concessão da gratuidade da justiça ou, subsidiariamente, sua concessão parcial ou o parcelamento das custas (art. 98, §§ 5º e 6º, do CPC);</w:t>
       </w:r>
     </w:p>
     <w:p>
@@ -2241,74 +3606,7 @@
           <w:b w:val="0"/>
           <w:i w:val="0"/>
         </w:rPr>
-        <w:t>2. a concessão da tutela de urgência, nos termos do item 4, para:</w:t>
-      </w:r>
-    </w:p>
-    <w:p>
-      <w:pPr>
-        <w:ind w:left="850" w:hanging="283"/>
-        <w:jc w:val="both"/>
-      </w:pPr>
-      <w:r>
-        <w:rPr>
-          <w:b w:val="0"/>
-          <w:i w:val="0"/>
-        </w:rPr>
-        <w:t>• suspender as cobranças extrajudiciais e os atos de constrição relativos às dívidas abrangidas por esta ação;</w:t>
-      </w:r>
-    </w:p>
-    <w:p>
-      <w:pPr>
-        <w:ind w:left="850" w:hanging="283"/>
-        <w:jc w:val="both"/>
-      </w:pPr>
-      <w:r>
-        <w:rPr>
-          <w:b w:val="0"/>
-          <w:i w:val="0"/>
-        </w:rPr>
-        <w:t>• impedir novas inscrições ou reinscrições em cadastros de inadimplentes enquanto perdurar o procedimento, quanto aos débitos discutidos;</w:t>
-      </w:r>
-    </w:p>
-    <w:p>
-      <w:pPr>
-        <w:ind w:left="850" w:hanging="283"/>
-        <w:jc w:val="both"/>
-      </w:pPr>
-      <w:r>
-        <w:rPr>
-          <w:b w:val="0"/>
-          <w:i w:val="0"/>
-        </w:rPr>
-        <w:t xml:space="preserve">• limitar eventuais descontos em folha ou em conta a </w:t>
-      </w:r>
-      <w:r>
-        <w:rPr>
-          <w:b w:val="0"/>
-          <w:i w:val="0"/>
-          <w:highlight w:val="yellow"/>
-        </w:rPr>
-        <w:t>[35]</w:t>
-      </w:r>
-      <w:r>
-        <w:rPr>
-          <w:b w:val="0"/>
-          <w:i w:val="0"/>
-        </w:rPr>
-        <w:t>% dos rendimentos líquidos do Autor, ou suspendê-los, conforme o caso;</w:t>
-      </w:r>
-    </w:p>
-    <w:p>
-      <w:pPr>
-        <w:ind w:left="850" w:hanging="283"/>
-        <w:jc w:val="both"/>
-      </w:pPr>
-      <w:r>
-        <w:rPr>
-          <w:b w:val="0"/>
-          <w:i w:val="0"/>
-        </w:rPr>
-        <w:t>• fixar multa por ato de descumprimento;</w:t>
+        <w:t>2. a concessão da tutela de urgência, inaudita altera pars, nos termos do item 5;</w:t>
       </w:r>
     </w:p>
     <w:p>
@@ -2321,7 +3619,7 @@
           <w:b w:val="0"/>
           <w:i w:val="0"/>
         </w:rPr>
-        <w:t>3. a designação de audiência de conciliação global, presidida por Vossa Excelência ou por conciliador credenciado, com a citação dos credores relacionados no polo passivo para dela participarem, sob pena das consequências do art. 104-A, § 2º, do CDC;</w:t>
+        <w:t>3. a designação de audiência de conciliação global, com a citação dos Réus para dela participarem, sob as penas do art. 104-A, § 2º, do CDC, manifestando o Autor interesse na sua realização, preferencialmente por videoconferência (art. 319, VII, do CPC);</w:t>
       </w:r>
     </w:p>
     <w:p>
@@ -2334,7 +3632,7 @@
           <w:b w:val="0"/>
           <w:i w:val="0"/>
         </w:rPr>
-        <w:t>4. a homologação, por sentença, do plano de pagamento ajustado em audiência, com eficácia de título executivo e força de coisa julgada (art. 104-A, § 3º, do CDC);</w:t>
+        <w:t>4. a inversão do ônus da prova (art. 6º, VIII, do CDC), determinando-se que os Réus apresentem, até 15 (quinze) dias antes da audiência, todos os contratos firmados com o Autor e o demonstrativo atualizado do saldo devedor de cada um;</w:t>
       </w:r>
     </w:p>
     <w:p>
@@ -2347,7 +3645,7 @@
           <w:b w:val="0"/>
           <w:i w:val="0"/>
         </w:rPr>
-        <w:t>5. não havendo êxito na conciliação em relação a quaisquer credores, a instauração do processo por superendividamento para revisão e integração dos contratos e repactuação das dívidas remanescentes mediante plano judicial compulsório, com a citação dos credores que não integrarem o acordo (art. 104-B do CDC);</w:t>
+        <w:t>5. a homologação, por sentença, do plano de pagamento ajustado em audiência (art. 104-A, § 3º, do CDC);</w:t>
       </w:r>
     </w:p>
     <w:p>
@@ -2360,7 +3658,7 @@
           <w:b w:val="0"/>
           <w:i w:val="0"/>
         </w:rPr>
-        <w:t>6. a inversão do ônus da prova (art. 6º, VIII, do CDC), determinando-se que os credores apresentem os contratos e o demonstrativo atualizado dos débitos;</w:t>
+        <w:t>6. não havendo acordo com quaisquer credores, a instauração do processo por superendividamento para revisão e integração dos contratos e repactuação das dívidas remanescentes mediante plano judicial compulsório (art. 104-B do CDC), com a revisão dos encargos abusivos e a redução de juros e encargos prevista no art. 54-D, parágrafo único, do CDC;</w:t>
       </w:r>
     </w:p>
     <w:p>
@@ -2373,7 +3671,7 @@
           <w:b w:val="0"/>
           <w:i w:val="0"/>
         </w:rPr>
-        <w:t>7. a condenação dos Réus ao pagamento das custas processuais e dos honorários advocatícios, na hipótese de resistência à pretensão;</w:t>
+        <w:t>7. a condenação dos Réus ao pagamento das custas processuais e dos honorários advocatícios, em caso de resistência à pretensão;</w:t>
       </w:r>
     </w:p>
     <w:p>
@@ -2386,20 +3684,7 @@
           <w:b w:val="0"/>
           <w:i w:val="0"/>
         </w:rPr>
-        <w:t>8. a produção de todas as provas em direito admitidas, especialmente documental suplementar.</w:t>
-      </w:r>
-    </w:p>
-    <w:p>
-      <w:pPr>
-        <w:ind w:firstLine="1417"/>
-        <w:jc w:val="both"/>
-      </w:pPr>
-      <w:r>
-        <w:rPr>
-          <w:b w:val="0"/>
-          <w:i w:val="0"/>
-        </w:rPr>
-        <w:t>O Autor manifesta interesse na realização de audiência de conciliação (art. 319, VII, do CPC), preferencialmente na forma virtual.</w:t>
+        <w:t>8. a produção de todas as provas em direito admitidas, especialmente a documental.</w:t>
       </w:r>
     </w:p>
     <w:p>
@@ -2411,7 +3696,7 @@
           <w:b/>
           <w:i w:val="0"/>
         </w:rPr>
-        <w:t>7. DO VALOR DA CAUSA</w:t>
+        <w:t>8. DO VALOR DA CAUSA</w:t>
       </w:r>
     </w:p>
     <w:p>
@@ -2454,149 +3739,22 @@
           <w:b w:val="0"/>
           <w:i w:val="0"/>
         </w:rPr>
-        <w:t>), correspondente à soma dos saldos devedores das dívidas submetidas ao procedimento.</w:t>
+        <w:t xml:space="preserve">), correspondente à soma dos saldos devedores das dívidas submetidas ao procedimento </w:t>
       </w:r>
-    </w:p>
-    <w:p>
-      <w:pPr>
-        <w:spacing w:before="240"/>
-      </w:pPr>
       <w:r>
         <w:rPr>
-          <w:b/>
+          <w:b w:val="0"/>
           <w:i w:val="0"/>
+          <w:highlight w:val="yellow"/>
         </w:rPr>
-        <w:t>8. DOS DOCUMENTOS QUE ACOMPANHAM A INICIAL</w:t>
+        <w:t>[mínimo conhecido: R$ 73.453,99 do Bradesco, a somar com os saldos do Banco do Brasil]</w:t>
       </w:r>
-    </w:p>
-    <w:p>
-      <w:pPr>
-        <w:ind w:left="850" w:hanging="283"/>
-        <w:jc w:val="both"/>
-      </w:pPr>
       <w:r>
         <w:rPr>
           <w:b w:val="0"/>
           <w:i w:val="0"/>
         </w:rPr>
-        <w:t>• documentos pessoais e procuração;</w:t>
-      </w:r>
-    </w:p>
-    <w:p>
-      <w:pPr>
-        <w:ind w:left="850" w:hanging="283"/>
-        <w:jc w:val="both"/>
-      </w:pPr>
-      <w:r>
-        <w:rPr>
-          <w:b w:val="0"/>
-          <w:i w:val="0"/>
-        </w:rPr>
-        <w:t>• comprovante de residência;</w:t>
-      </w:r>
-    </w:p>
-    <w:p>
-      <w:pPr>
-        <w:ind w:left="850" w:hanging="283"/>
-        <w:jc w:val="both"/>
-      </w:pPr>
-      <w:r>
-        <w:rPr>
-          <w:b w:val="0"/>
-          <w:i w:val="0"/>
-        </w:rPr>
-        <w:t>• comprovantes de renda;</w:t>
-      </w:r>
-    </w:p>
-    <w:p>
-      <w:pPr>
-        <w:ind w:left="850" w:hanging="283"/>
-        <w:jc w:val="both"/>
-      </w:pPr>
-      <w:r>
-        <w:rPr>
-          <w:b w:val="0"/>
-          <w:i w:val="0"/>
-        </w:rPr>
-        <w:t>• extratos bancários;</w:t>
-      </w:r>
-    </w:p>
-    <w:p>
-      <w:pPr>
-        <w:ind w:left="850" w:hanging="283"/>
-        <w:jc w:val="both"/>
-      </w:pPr>
-      <w:r>
-        <w:rPr>
-          <w:b w:val="0"/>
-          <w:i w:val="0"/>
-        </w:rPr>
-        <w:t>• demonstrativo de despesas essenciais;</w:t>
-      </w:r>
-    </w:p>
-    <w:p>
-      <w:pPr>
-        <w:ind w:left="850" w:hanging="283"/>
-        <w:jc w:val="both"/>
-      </w:pPr>
-      <w:r>
-        <w:rPr>
-          <w:b w:val="0"/>
-          <w:i w:val="0"/>
-        </w:rPr>
-        <w:t>• contratos e faturas dos credores;</w:t>
-      </w:r>
-    </w:p>
-    <w:p>
-      <w:pPr>
-        <w:ind w:left="850" w:hanging="283"/>
-        <w:jc w:val="both"/>
-      </w:pPr>
-      <w:r>
-        <w:rPr>
-          <w:b w:val="0"/>
-          <w:i w:val="0"/>
-        </w:rPr>
-        <w:t>• comprovantes de cobrança/negativação;</w:t>
-      </w:r>
-    </w:p>
-    <w:p>
-      <w:pPr>
-        <w:ind w:left="850" w:hanging="283"/>
-        <w:jc w:val="both"/>
-      </w:pPr>
-      <w:r>
-        <w:rPr>
-          <w:b w:val="0"/>
-          <w:i w:val="0"/>
-        </w:rPr>
-        <w:t>• planilha discriminada das dívidas;</w:t>
-      </w:r>
-    </w:p>
-    <w:p>
-      <w:pPr>
-        <w:ind w:left="850" w:hanging="283"/>
-        <w:jc w:val="both"/>
-      </w:pPr>
-      <w:r>
-        <w:rPr>
-          <w:b w:val="0"/>
-          <w:i w:val="0"/>
-        </w:rPr>
-        <w:t>• declaração de hipossuficiência;</w:t>
-      </w:r>
-    </w:p>
-    <w:p>
-      <w:pPr>
-        <w:ind w:left="850" w:hanging="283"/>
-        <w:jc w:val="both"/>
-      </w:pPr>
-      <w:r>
-        <w:rPr>
-          <w:b w:val="0"/>
-          <w:i w:val="0"/>
-        </w:rPr>
-        <w:t>• demais documentos pertinentes.</w:t>
+        <w:t>.</w:t>
       </w:r>
     </w:p>
     <w:p>
@@ -2684,22 +3842,7 @@
           <w:b w:val="0"/>
           <w:i w:val="0"/>
         </w:rPr>
-        <w:t>OAB/</w:t>
-      </w:r>
-      <w:r>
-        <w:rPr>
-          <w:b w:val="0"/>
-          <w:i w:val="0"/>
-          <w:highlight w:val="yellow"/>
-        </w:rPr>
-        <w:t>[UF]</w:t>
-      </w:r>
-      <w:r>
-        <w:rPr>
-          <w:b w:val="0"/>
-          <w:i w:val="0"/>
-        </w:rPr>
-        <w:t xml:space="preserve"> nº </w:t>
+        <w:t xml:space="preserve">OAB/PI nº </w:t>
       </w:r>
       <w:r>
         <w:rPr>
@@ -2708,6 +3851,143 @@
           <w:highlight w:val="yellow"/>
         </w:rPr>
         <w:t>[__]</w:t>
+      </w:r>
+    </w:p>
+    <w:p>
+      <w:pPr>
+        <w:spacing w:before="240"/>
+      </w:pPr>
+      <w:r>
+        <w:rPr>
+          <w:b/>
+          <w:i w:val="0"/>
+        </w:rPr>
+        <w:t>ROL DE DOCUMENTOS</w:t>
+      </w:r>
+    </w:p>
+    <w:p>
+      <w:pPr>
+        <w:ind w:left="850" w:hanging="283"/>
+        <w:jc w:val="both"/>
+      </w:pPr>
+      <w:r>
+        <w:rPr>
+          <w:b w:val="0"/>
+          <w:i w:val="0"/>
+        </w:rPr>
+        <w:t>• 01 – Procuração e documentos pessoais</w:t>
+      </w:r>
+    </w:p>
+    <w:p>
+      <w:pPr>
+        <w:ind w:left="850" w:hanging="283"/>
+        <w:jc w:val="both"/>
+      </w:pPr>
+      <w:r>
+        <w:rPr>
+          <w:b w:val="0"/>
+          <w:i w:val="0"/>
+        </w:rPr>
+        <w:t>• 02 – Declaração de hipossuficiência</w:t>
+      </w:r>
+    </w:p>
+    <w:p>
+      <w:pPr>
+        <w:ind w:left="850" w:hanging="283"/>
+        <w:jc w:val="both"/>
+      </w:pPr>
+      <w:r>
+        <w:rPr>
+          <w:b w:val="0"/>
+          <w:i w:val="0"/>
+        </w:rPr>
+        <w:t>• 03 – Comprovante de residência</w:t>
+      </w:r>
+    </w:p>
+    <w:p>
+      <w:pPr>
+        <w:ind w:left="850" w:hanging="283"/>
+        <w:jc w:val="both"/>
+      </w:pPr>
+      <w:r>
+        <w:rPr>
+          <w:b w:val="0"/>
+          <w:i w:val="0"/>
+        </w:rPr>
+        <w:t>• 04 – Contracheques Município de Miguel Alves (03, 04, 05 e 07/2026)</w:t>
+      </w:r>
+    </w:p>
+    <w:p>
+      <w:pPr>
+        <w:ind w:left="850" w:hanging="283"/>
+        <w:jc w:val="both"/>
+      </w:pPr>
+      <w:r>
+        <w:rPr>
+          <w:b w:val="0"/>
+          <w:i w:val="0"/>
+        </w:rPr>
+        <w:t>• 05 – Contracheques Município de União (03, 04 e 05/2026)</w:t>
+      </w:r>
+    </w:p>
+    <w:p>
+      <w:pPr>
+        <w:ind w:left="850" w:hanging="283"/>
+        <w:jc w:val="both"/>
+      </w:pPr>
+      <w:r>
+        <w:rPr>
+          <w:b w:val="0"/>
+          <w:i w:val="0"/>
+        </w:rPr>
+        <w:t>• 06 – Extratos de conta corrente Banco do Brasil, ag. 2298-5, c/c 6198-0 (03 a 09/2026)</w:t>
+      </w:r>
+    </w:p>
+    <w:p>
+      <w:pPr>
+        <w:ind w:left="850" w:hanging="283"/>
+        <w:jc w:val="both"/>
+      </w:pPr>
+      <w:r>
+        <w:rPr>
+          <w:b w:val="0"/>
+          <w:i w:val="0"/>
+        </w:rPr>
+        <w:t>• 07 – Extratos Bradesco, ag. 5792, c/c 231325-1 (04/2025 e 18/06/2026)</w:t>
+      </w:r>
+    </w:p>
+    <w:p>
+      <w:pPr>
+        <w:ind w:left="850" w:hanging="283"/>
+        <w:jc w:val="both"/>
+      </w:pPr>
+      <w:r>
+        <w:rPr>
+          <w:b w:val="0"/>
+          <w:i w:val="0"/>
+        </w:rPr>
+        <w:t>• 08 – Comprovantes de despesas essenciais</w:t>
+      </w:r>
+    </w:p>
+    <w:p>
+      <w:pPr>
+        <w:ind w:left="850" w:hanging="283"/>
+        <w:jc w:val="both"/>
+      </w:pPr>
+      <w:r>
+        <w:rPr>
+          <w:b w:val="0"/>
+          <w:i w:val="0"/>
+        </w:rPr>
+        <w:t xml:space="preserve">• 09 – </w:t>
+      </w:r>
+      <w:r>
+        <w:rPr>
+          <w:b w:val="0"/>
+          <w:i w:val="0"/>
+          <w:highlight w:val="yellow"/>
+        </w:rPr>
+        <w:t>[Decisão/acordo que fixou a pensão alimentícia]</w:t>
       </w:r>
     </w:p>
     <w:sectPr>

</xml_diff>

<commit_message>
Inicial Francisco: inclui histórico do endividamento (ofertas desde 2005, divórcio, construção da casa, nova família)
Co-Authored-By: Claude Opus 5.5 <noreply@anthropic.com>
Claude-Session: https://claude.ai/code/session_01EVatDVNz5NJ1N9yNUnzyHx
</commit_message>
<xml_diff>
--- a/Francisco Bernardo Sousa Santos - Superendividamento/Inicial - Repactuação de dívidas - Francisco Bernardo Sousa Santos (minuta).docx
+++ b/Francisco Bernardo Sousa Santos - Superendividamento/Inicial - Repactuação de dívidas - Francisco Bernardo Sousa Santos (minuta).docx
@@ -290,6 +290,28 @@
       </w:pPr>
       <w:r>
         <w:rPr/>
+        <w:t xml:space="preserve">O endividamento do Autor tem origem antiga e foi conduzido pelas próprias instituições financeiras. Desde 2005, quando ingressou na rede municipal de Miguel Alves, o Autor passou a receber ofertas sucessivas de empréstimos, renegociações e “troco” de refinanciamentos, sempre por iniciativa dos bancos, que dispunham de seus vencimentos como garantia. Cada nova operação quitava a anterior e liberava pequena quantia em dinheiro, ampliando o prazo e o saldo devedor.</w:t>
+      </w:r>
+    </w:p>
+    <w:p>
+      <w:pPr>
+        <w:spacing w:after="60" w:line="360"/>
+        <w:ind w:firstLine="850"/>
+        <w:jc w:val="both"/>
+      </w:pPr>
+      <w:r>
+        <w:rPr/>
+        <w:t xml:space="preserve">A situação saiu de controle após o divórcio do Autor, quando passou a arcar com a pensão alimentícia judicial, com a construção de nova moradia e com o sustento de sua nova família. Nesse contexto de fragilidade, as ofertas de crédito continuaram a chegar e a ser aceitas, até que os descontos passaram a consumir praticamente toda a sua remuneração.</w:t>
+      </w:r>
+    </w:p>
+    <w:p>
+      <w:pPr>
+        <w:spacing w:after="60" w:line="360"/>
+        <w:ind w:firstLine="850"/>
+        <w:jc w:val="both"/>
+      </w:pPr>
+      <w:r>
+        <w:rPr/>
         <w:t xml:space="preserve">Os descontos de empréstimos, extraídos dos próprios contracheques e extratos, são os seguintes:</w:t>
       </w:r>
     </w:p>
@@ -663,13 +685,7 @@
       </w:r>
       <w:r>
         <w:rPr/>
-        <w:t xml:space="preserve"> mensais (alimentação, moradia, água e energia, deslocamento entre Miguel Alves e União, saúde), não são custeadas com regularidade. </w:t>
-      </w:r>
-      <w:r>
-        <w:rPr>
-          <w:highlight w:val="yellow"/>
-        </w:rPr>
-        <w:t xml:space="preserve">[Descrever, com as palavras do cliente, como começou o endividamento.]</w:t>
+        <w:t xml:space="preserve"> mensais (alimentação, moradia, água e energia, deslocamento entre Miguel Alves e União, saúde), não são custeadas com regularidade.</w:t>
       </w:r>
     </w:p>
     <w:p>

</xml_diff>

<commit_message>
Inicial Francisco: atualiza valores com o contracheque de agosto/2026 (pensão 23%, IR, parcelas)
Co-Authored-By: Claude Opus 5.5 <noreply@anthropic.com>
Claude-Session: https://claude.ai/code/session_01EVatDVNz5NJ1N9yNUnzyHx
</commit_message>
<xml_diff>
--- a/Francisco Bernardo Sousa Santos - Superendividamento/Inicial - Repactuação de dívidas - Francisco Bernardo Sousa Santos (minuta).docx
+++ b/Francisco Bernardo Sousa Santos - Superendividamento/Inicial - Repactuação de dívidas - Francisco Bernardo Sousa Santos (minuta).docx
@@ -126,14 +126,14 @@
       </w:pPr>
       <w:r>
         <w:rPr/>
-        <w:t xml:space="preserve">Embora o Autor seja servidor público com dois vínculos, sua remuneração bruta não reflete a renda de que efetivamente dispõe. Descontados a previdência, o imposto de renda, a pensão alimentícia judicial e os empréstimos consignados, o Autor recebeu em conta, em maio de 2026, </w:t>
-      </w:r>
-      <w:r>
-        <w:rPr>
-          <w:b/>
-          <w:bCs/>
-        </w:rPr>
-        <w:t xml:space="preserve">R$ 4.656,83</w:t>
+        <w:t xml:space="preserve">Embora o Autor seja servidor público com dois vínculos, sua remuneração bruta não reflete a renda de que efetivamente dispõe. Descontados a previdência, o imposto de renda, a pensão alimentícia judicial e os empréstimos consignados, o Autor recebeu em conta, em agosto de 2026, </w:t>
+      </w:r>
+      <w:r>
+        <w:rPr>
+          <w:b/>
+          <w:bCs/>
+        </w:rPr>
+        <w:t xml:space="preserve">R$ 4.233,44</w:t>
       </w:r>
       <w:r>
         <w:rPr/>
@@ -202,7 +202,7 @@
       </w:pPr>
       <w:r>
         <w:rPr/>
-        <w:t xml:space="preserve">Seus contracheques de maio de 2026 registram, em Miguel Alves, remuneração bruta de </w:t>
+        <w:t xml:space="preserve">Seu contracheque de agosto de 2026 em Miguel Alves registra remuneração bruta de </w:t>
       </w:r>
       <w:r>
         <w:rPr>
@@ -213,18 +213,18 @@
       </w:r>
       <w:r>
         <w:rPr/>
-        <w:t xml:space="preserve">, da qual, deduzidos os descontos obrigatórios de previdência (R$ 988,07) e de imposto de renda (R$ 2.062,13), resulta remuneração líquida de </w:t>
-      </w:r>
-      <w:r>
-        <w:rPr>
-          <w:b/>
-          <w:bCs/>
-        </w:rPr>
-        <w:t xml:space="preserve">R$ 10.556,78</w:t>
-      </w:r>
-      <w:r>
-        <w:rPr/>
-        <w:t xml:space="preserve">; e, em União, remuneração bruta de </w:t>
+        <w:t xml:space="preserve">, da qual, deduzidos os descontos obrigatórios de previdência (R$ 988,07) e de imposto de renda (R$ 1.901,54), resulta remuneração líquida de </w:t>
+      </w:r>
+      <w:r>
+        <w:rPr>
+          <w:b/>
+          <w:bCs/>
+        </w:rPr>
+        <w:t xml:space="preserve">R$ 10.717,37</w:t>
+      </w:r>
+      <w:r>
+        <w:rPr/>
+        <w:t xml:space="preserve">. Em União, o contracheque de maio de 2026, cujo valor líquido se repete nos créditos de agosto e setembro registrados no extrato bancário, aponta remuneração bruta de </w:t>
       </w:r>
       <w:r>
         <w:rPr>
@@ -253,7 +253,7 @@
           <w:b/>
           <w:bCs/>
         </w:rPr>
-        <w:t xml:space="preserve">R$ 13.905,75</w:t>
+        <w:t xml:space="preserve">R$ 14.066,34</w:t>
       </w:r>
       <w:r>
         <w:rPr/>
@@ -264,7 +264,7 @@
           <w:b/>
           <w:bCs/>
         </w:rPr>
-        <w:t xml:space="preserve">R$ 4.867,01</w:t>
+        <w:t xml:space="preserve">R$ 4.923,22</w:t>
       </w:r>
       <w:r>
         <w:rPr/>
@@ -279,7 +279,18 @@
       </w:pPr>
       <w:r>
         <w:rPr/>
-        <w:t xml:space="preserve">Sobre esse valor ainda incide a pensão alimentícia judicial, descontada em folha no valor de R$ 1.815,78 até junho de 2026 e elevada, a partir de julho de 2026, para 30% do bruto (R$ 2.011,20).</w:t>
+        <w:t xml:space="preserve">Sobre esse valor ainda incide a pensão alimentícia judicial, descontada em folha no valor de R$ 1.815,78 até junho de 2026 e elevada para </w:t>
+      </w:r>
+      <w:r>
+        <w:rPr>
+          <w:b/>
+          <w:bCs/>
+        </w:rPr>
+        <w:t xml:space="preserve">R$ 2.399,76</w:t>
+      </w:r>
+      <w:r>
+        <w:rPr/>
+        <w:t xml:space="preserve"> em agosto de 2026 (23% do bruto).</w:t>
       </w:r>
     </w:p>
     <w:p>
@@ -348,14 +359,14 @@
       </w:r>
       <w:r>
         <w:rPr/>
-        <w:t xml:space="preserve"> mensais (R$ 4.014,86 e R$ 644,95, ambos em 120 parcelas; R$ 241,37, em 120 parcelas, iniciado em março de 2026; e R$ 140,35), o que corresponde a </w:t>
-      </w:r>
-      <w:r>
-        <w:rPr>
-          <w:b/>
-          <w:bCs/>
-        </w:rPr>
-        <w:t xml:space="preserve">47,76%</w:t>
+        <w:t xml:space="preserve"> mensais (R$ 4.014,86 e R$ 644,95, ambos em 120 parcelas, na 17ª e na 16ª parcela em agosto de 2026; R$ 241,37, em 120 parcelas, iniciado em março de 2026; e R$ 140,35), o que corresponde a </w:t>
+      </w:r>
+      <w:r>
+        <w:rPr>
+          <w:b/>
+          <w:bCs/>
+        </w:rPr>
+        <w:t xml:space="preserve">47,04%</w:t>
       </w:r>
       <w:r>
         <w:rPr/>
@@ -460,7 +471,7 @@
           <w:b/>
           <w:bCs/>
         </w:rPr>
-        <w:t xml:space="preserve">52,55%</w:t>
+        <w:t xml:space="preserve">51,95%</w:t>
       </w:r>
       <w:r>
         <w:rPr/>
@@ -471,7 +482,7 @@
           <w:b/>
           <w:bCs/>
         </w:rPr>
-        <w:t xml:space="preserve">R$ 2.440,69</w:t>
+        <w:t xml:space="preserve">R$ 2.384,48</w:t>
       </w:r>
       <w:r>
         <w:rPr/>
@@ -543,11 +554,22 @@
           <w:b/>
           <w:bCs/>
         </w:rPr>
-        <w:t xml:space="preserve">89,20%</w:t>
-      </w:r>
-      <w:r>
-        <w:rPr/>
-        <w:t xml:space="preserve"> da remuneração líquida do Autor. Deduzida a pensão alimentícia, ultrapassam a totalidade do que lhe resta, sem contar o saldo vencido no Bradesco.</w:t>
+        <w:t xml:space="preserve">88,18%</w:t>
+      </w:r>
+      <w:r>
+        <w:rPr/>
+        <w:t xml:space="preserve"> da remuneração líquida do Autor. Deduzida a pensão alimentícia (R$ 2.399,76), alcançam </w:t>
+      </w:r>
+      <w:r>
+        <w:rPr>
+          <w:b/>
+          <w:bCs/>
+        </w:rPr>
+        <w:t xml:space="preserve">106,32%</w:t>
+      </w:r>
+      <w:r>
+        <w:rPr/>
+        <w:t xml:space="preserve"> do que lhe resta, sem contar o saldo vencido no Bradesco.</w:t>
       </w:r>
     </w:p>
     <w:p>
@@ -966,7 +988,7 @@
       </w:pPr>
       <w:r>
         <w:rPr/>
-        <w:t xml:space="preserve">A probabilidade do direito está demonstrada pelos contracheques, que revelam consignados correspondentes a 52,55% da remuneração líquida, acima da margem informada pelos próprios órgãos pagadores, e pelos extratos, que comprovam a conta zerada e a concessão automática de novos empréstimos para pagar os anteriores. O perigo de dano decorre da natureza alimentar do salário (art. 7º, X, da CF; art. 833, IV, do CPC): a cada mês, a renda do Autor é absorvida pelas dívidas, e a espera pela audiência agravará o débito com novos “empréstimos” automáticos.</w:t>
+        <w:t xml:space="preserve">A probabilidade do direito está demonstrada pelos contracheques, que revelam consignados correspondentes a 51,95% da remuneração líquida, acima da margem informada pelos próprios órgãos pagadores, e pelos extratos, que comprovam a conta zerada e a concessão automática de novos empréstimos para pagar os anteriores. O perigo de dano decorre da natureza alimentar do salário (art. 7º, X, da CF; art. 833, IV, do CPC): a cada mês, a renda do Autor é absorvida pelas dívidas, e a espera pela audiência agravará o débito com novos “empréstimos” automáticos.</w:t>
       </w:r>
     </w:p>
     <w:p>
@@ -1016,11 +1038,11 @@
           <w:b/>
           <w:bCs/>
         </w:rPr>
-        <w:t xml:space="preserve">R$ 4.867,01</w:t>
-      </w:r>
-      <w:r>
-        <w:rPr/>
-        <w:t xml:space="preserve">, correspondente a 35% de sua remuneração líquida (R$ 3.694,87 em Miguel Alves e R$ 1.172,14 em União), mediante desconto em folha, pelo prazo de </w:t>
+        <w:t xml:space="preserve">R$ 4.923,22</w:t>
+      </w:r>
+      <w:r>
+        <w:rPr/>
+        <w:t xml:space="preserve">, correspondente a 35% de sua remuneração líquida (R$ 3.751,08 em Miguel Alves e R$ 1.172,14 em União), mediante desconto em folha, pelo prazo de </w:t>
       </w:r>
       <w:r>
         <w:rPr>
@@ -1038,7 +1060,7 @@
           <w:b/>
           <w:bCs/>
         </w:rPr>
-        <w:t xml:space="preserve">R$ 292.020,60</w:t>
+        <w:t xml:space="preserve">R$ 295.393,20</w:t>
       </w:r>
       <w:r>
         <w:rPr/>
@@ -1146,7 +1168,7 @@
       </w:r>
       <w:r>
         <w:rPr/>
-        <w:t xml:space="preserve"> (R$ 3.694,87 em Miguel Alves e R$ 1.172,14 em União), com rateio proporcional entre os contratos e solidariedade dos Réus na observância do limite, oficiando-se à Secretaria Municipal de Educação de Miguel Alves e ao Município de União; (ii) determinar ao Banco do Brasil que se abstenha de debitar da conta corrente do Autor parcelas de empréstimos e de lançar novos “empréstimos” automáticos para cobertura de parcelas; (iii) determinar aos Réus que se abstenham de inscrever o nome do Autor em cadastros de inadimplentes, ou que excluam as inscrições existentes, quanto às dívidas objeto desta ação; e (iv) suspender a exigibilidade dos valores excedentes, sem encargos moratórios, tudo sob pena de multa por ato de descumprimento (art. 537 do CPC);</w:t>
+        <w:t xml:space="preserve"> (R$ 3.751,08 em Miguel Alves e R$ 1.172,14 em União), com rateio proporcional entre os contratos e solidariedade dos Réus na observância do limite, oficiando-se à Secretaria Municipal de Educação de Miguel Alves e ao Município de União; (ii) determinar ao Banco do Brasil que se abstenha de debitar da conta corrente do Autor parcelas de empréstimos e de lançar novos “empréstimos” automáticos para cobertura de parcelas; (iii) determinar aos Réus que se abstenham de inscrever o nome do Autor em cadastros de inadimplentes, ou que excluam as inscrições existentes, quanto às dívidas objeto desta ação; e (iv) suspender a exigibilidade dos valores excedentes, sem encargos moratórios, tudo sob pena de multa por ato de descumprimento (art. 537 do CPC);</w:t>
       </w:r>
     </w:p>
     <w:p>

</xml_diff>

<commit_message>
Inicial Francisco: Bradesco saiu de Miguel Alves e deixou de descontar em folha; saldo vencido R$ 93.223,57 (14/10/2026)
Co-Authored-By: Claude Opus 5.5 <noreply@anthropic.com>
Claude-Session: https://claude.ai/code/session_01EVatDVNz5NJ1N9yNUnzyHx
</commit_message>
<xml_diff>
--- a/Francisco Bernardo Sousa Santos - Superendividamento/Inicial - Repactuação de dívidas - Francisco Bernardo Sousa Santos (minuta).docx
+++ b/Francisco Bernardo Sousa Santos - Superendividamento/Inicial - Repactuação de dívidas - Francisco Bernardo Sousa Santos (minuta).docx
@@ -514,18 +514,73 @@
       </w:pPr>
       <w:r>
         <w:rPr/>
-        <w:t xml:space="preserve">5.	no Bradesco (agência 5792, conta 231325-1), os contratos de crédito pessoal nº 503906781 e nº 504307147, ambos em 120 parcelas, constam como </w:t>
-      </w:r>
-      <w:r>
-        <w:rPr>
-          <w:b/>
-          <w:bCs/>
-        </w:rPr>
-        <w:t xml:space="preserve">“OPERAÇÕES VENCIDAS” no valor de R$ 73.453,99</w:t>
-      </w:r>
-      <w:r>
-        <w:rPr/>
-        <w:t xml:space="preserve"> (extrato de 18/06/2026).</w:t>
+        <w:t xml:space="preserve">5.	no </w:t>
+      </w:r>
+      <w:r>
+        <w:rPr>
+          <w:b/>
+          <w:bCs/>
+        </w:rPr>
+        <w:t xml:space="preserve">Bradesco</w:t>
+      </w:r>
+      <w:r>
+        <w:rPr/>
+        <w:t xml:space="preserve">, os contratos nº 503906781 e nº 504307147, celebrados na agência de Miguel Alves em 120 parcelas (R$ 641,28 e R$ 3.392,75, total de </w:t>
+      </w:r>
+      <w:r>
+        <w:rPr>
+          <w:b/>
+          <w:bCs/>
+        </w:rPr>
+        <w:t xml:space="preserve">R$ 4.034,03</w:t>
+      </w:r>
+      <w:r>
+        <w:rPr/>
+        <w:t xml:space="preserve"> mensais), eram descontados em folha. Com a saída do banco do município, os descontos deixaram de ser feitos, e o Bradesco passou a exigir o pagamento em conta corrente (agência 5792, conta 231325-1): em abril de 2025, o próprio Autor transferiu R$ 4.035,00 para quitar a 8ª parcela de cada contrato. Sem o desconto em folha e com a renda já absorvida pelos demais credores, as parcelas venceram, e o saldo de </w:t>
+      </w:r>
+      <w:r>
+        <w:rPr>
+          <w:b/>
+          <w:bCs/>
+        </w:rPr>
+        <w:t xml:space="preserve">“OPERAÇÕES VENCIDAS”</w:t>
+      </w:r>
+      <w:r>
+        <w:rPr/>
+        <w:t xml:space="preserve"> passou de </w:t>
+      </w:r>
+      <w:r>
+        <w:rPr>
+          <w:b/>
+          <w:bCs/>
+        </w:rPr>
+        <w:t xml:space="preserve">R$ 73.453,99</w:t>
+      </w:r>
+      <w:r>
+        <w:rPr/>
+        <w:t xml:space="preserve"> em 18/06/2026 para </w:t>
+      </w:r>
+      <w:r>
+        <w:rPr>
+          <w:b/>
+          <w:bCs/>
+        </w:rPr>
+        <w:t xml:space="preserve">R$ 93.223,57</w:t>
+      </w:r>
+      <w:r>
+        <w:rPr/>
+        <w:t xml:space="preserve"> em 14/10/2026, um acréscimo de </w:t>
+      </w:r>
+      <w:r>
+        <w:rPr>
+          <w:b/>
+          <w:bCs/>
+        </w:rPr>
+        <w:t xml:space="preserve">R$ 19.769,58 (26,9%) em menos de quatro meses</w:t>
+      </w:r>
+      <w:r>
+        <w:rPr/>
+        <w:t xml:space="preserve">, apenas com encargos de mora.</w:t>
       </w:r>
     </w:p>
     <w:p>
@@ -569,7 +624,7 @@
       </w:r>
       <w:r>
         <w:rPr/>
-        <w:t xml:space="preserve"> do que lhe resta, sem contar o saldo vencido no Bradesco.</w:t>
+        <w:t xml:space="preserve"> do que lhe resta, sem contar as parcelas vencidas do Bradesco, que, se exigidas, somariam mais R$ 4.034,03 por mês.</w:t>
       </w:r>
     </w:p>
     <w:p>
@@ -988,7 +1043,7 @@
       </w:pPr>
       <w:r>
         <w:rPr/>
-        <w:t xml:space="preserve">A probabilidade do direito está demonstrada pelos contracheques, que revelam consignados correspondentes a 51,95% da remuneração líquida, acima da margem informada pelos próprios órgãos pagadores, e pelos extratos, que comprovam a conta zerada e a concessão automática de novos empréstimos para pagar os anteriores. O perigo de dano decorre da natureza alimentar do salário (art. 7º, X, da CF; art. 833, IV, do CPC): a cada mês, a renda do Autor é absorvida pelas dívidas, e a espera pela audiência agravará o débito com novos “empréstimos” automáticos.</w:t>
+        <w:t xml:space="preserve">A probabilidade do direito está demonstrada pelos contracheques, que revelam consignados correspondentes a 51,95% da remuneração líquida, acima da margem informada pelos próprios órgãos pagadores, e pelos extratos, que comprovam a conta zerada e a concessão automática de novos empréstimos para pagar os anteriores. O perigo de dano decorre da natureza alimentar do salário (art. 7º, X, da CF; art. 833, IV, do CPC): a cada mês, a renda do Autor é absorvida pelas dívidas, e a espera pela audiência agravará o débito, seja pelos novos “empréstimos” automáticos do Banco do Brasil, seja pelos encargos de mora do Bradesco, que elevaram o saldo vencido em quase R$ 20 mil em menos de quatro meses.</w:t>
       </w:r>
     </w:p>
     <w:p>

</xml_diff>

<commit_message>
Inicial Francisco: despesas essenciais informadas pelo cliente (alimentação, aluguel, combustível, internet)
Co-Authored-By: Claude Opus 5.5 <noreply@anthropic.com>
Claude-Session: https://claude.ai/code/session_01EVatDVNz5NJ1N9yNUnzyHx
</commit_message>
<xml_diff>
--- a/Francisco Bernardo Sousa Santos - Superendividamento/Inicial - Repactuação de dívidas - Francisco Bernardo Sousa Santos (minuta).docx
+++ b/Francisco Bernardo Sousa Santos - Superendividamento/Inicial - Repactuação de dívidas - Francisco Bernardo Sousa Santos (minuta).docx
@@ -743,26 +743,95 @@
       </w:pPr>
       <w:r>
         <w:rPr/>
-        <w:t xml:space="preserve">Desde então, a conta corrente do Autor encerra todos os dias com saldo zero, e os débitos de seguros, tributos e serviços são sucessivamente estornados. As despesas essenciais do Autor, estimadas em </w:t>
-      </w:r>
-      <w:r>
-        <w:rPr>
-          <w:b/>
-          <w:bCs/>
-        </w:rPr>
-        <w:t xml:space="preserve">R$ </w:t>
-      </w:r>
-      <w:r>
-        <w:rPr>
-          <w:b/>
-          <w:bCs/>
+        <w:t xml:space="preserve">Desde então, a conta corrente do Autor encerra todos os dias com saldo zero, e os débitos de seguros, tributos e serviços são sucessivamente estornados. As despesas essenciais do Autor, que compõem concretamente o seu mínimo existencial, somam ao menos </w:t>
+      </w:r>
+      <w:r>
+        <w:rPr>
+          <w:b/>
+          <w:bCs/>
+        </w:rPr>
+        <w:t xml:space="preserve">R$ 1.984,90</w:t>
+      </w:r>
+      <w:r>
+        <w:rPr/>
+        <w:t xml:space="preserve"> mensais:</w:t>
+      </w:r>
+    </w:p>
+    <w:p>
+      <w:pPr>
+        <w:tabs>
+          <w:tab w:val="left" w:pos="1000"/>
+        </w:tabs>
+        <w:spacing w:after="60" w:line="360"/>
+        <w:ind w:left="1000" w:hanging="400"/>
+        <w:jc w:val="both"/>
+      </w:pPr>
+      <w:r>
+        <w:rPr/>
+        <w:t xml:space="preserve">1.	alimentação: R$ 800,00;</w:t>
+      </w:r>
+    </w:p>
+    <w:p>
+      <w:pPr>
+        <w:tabs>
+          <w:tab w:val="left" w:pos="1000"/>
+        </w:tabs>
+        <w:spacing w:after="60" w:line="360"/>
+        <w:ind w:left="1000" w:hanging="400"/>
+        <w:jc w:val="both"/>
+      </w:pPr>
+      <w:r>
+        <w:rPr/>
+        <w:t xml:space="preserve">2.	aluguel: R$ 600,00;</w:t>
+      </w:r>
+    </w:p>
+    <w:p>
+      <w:pPr>
+        <w:tabs>
+          <w:tab w:val="left" w:pos="1000"/>
+        </w:tabs>
+        <w:spacing w:after="60" w:line="360"/>
+        <w:ind w:left="1000" w:hanging="400"/>
+        <w:jc w:val="both"/>
+      </w:pPr>
+      <w:r>
+        <w:rPr/>
+        <w:t xml:space="preserve">3.	combustível para o deslocamento entre Miguel Alves e União, onde exerce o segundo vínculo: R$ 500,00;</w:t>
+      </w:r>
+    </w:p>
+    <w:p>
+      <w:pPr>
+        <w:tabs>
+          <w:tab w:val="left" w:pos="1000"/>
+        </w:tabs>
+        <w:spacing w:after="60" w:line="360"/>
+        <w:ind w:left="1000" w:hanging="400"/>
+        <w:jc w:val="both"/>
+      </w:pPr>
+      <w:r>
+        <w:rPr/>
+        <w:t xml:space="preserve">4.	internet: R$ 84,90;</w:t>
+      </w:r>
+    </w:p>
+    <w:p>
+      <w:pPr>
+        <w:spacing w:after="60" w:line="360"/>
+        <w:ind w:firstLine="850"/>
+        <w:jc w:val="both"/>
+      </w:pPr>
+      <w:r>
+        <w:rPr/>
+        <w:t xml:space="preserve">a que se somam as contas de água e energia elétrica </w:t>
+      </w:r>
+      <w:r>
+        <w:rPr>
           <w:highlight w:val="yellow"/>
         </w:rPr>
-        <w:t xml:space="preserve">[__]</w:t>
-      </w:r>
-      <w:r>
-        <w:rPr/>
-        <w:t xml:space="preserve"> mensais (alimentação, moradia, água e energia, internet, deslocamento entre Miguel Alves e União, saúde), não são custeadas com regularidade. A própria conta de internet de sua residência (Connect Telecomunicações, R$ 84,90 mensais, serviço indispensável ao exercício da docência), com vencimento em 30/06/2026, só pôde ser emitida em segunda via, para 14/07/2026, já acrescida de encargos de atraso.</w:t>
+        <w:t xml:space="preserve">[R$ __]</w:t>
+      </w:r>
+      <w:r>
+        <w:rPr/>
+        <w:t xml:space="preserve">. Essas despesas não são custeadas com regularidade. A própria conta de internet de sua residência (Connect Telecomunicações, R$ 84,90 mensais, serviço indispensável ao exercício da docência), com vencimento em 30/06/2026, só pôde ser emitida em segunda via, para 14/07/2026, já acrescida de encargos de atraso.</w:t>
       </w:r>
     </w:p>
     <w:p>

</xml_diff>

<commit_message>
Inicial Francisco: atualiza valores com o contracheque de setembro/2026 de Miguel Alves
Co-Authored-By: Claude Opus 5.5 <noreply@anthropic.com>
Claude-Session: https://claude.ai/code/session_01EVatDVNz5NJ1N9yNUnzyHx
</commit_message>
<xml_diff>
--- a/Francisco Bernardo Sousa Santos - Superendividamento/Inicial - Repactuação de dívidas - Francisco Bernardo Sousa Santos (minuta).docx
+++ b/Francisco Bernardo Sousa Santos - Superendividamento/Inicial - Repactuação de dívidas - Francisco Bernardo Sousa Santos (minuta).docx
@@ -126,14 +126,14 @@
       </w:pPr>
       <w:r>
         <w:rPr/>
-        <w:t xml:space="preserve">Embora o Autor seja servidor público com dois vínculos, sua remuneração bruta não reflete a renda de que efetivamente dispõe. Descontados a previdência, o imposto de renda, a pensão alimentícia judicial e os empréstimos consignados, o Autor recebeu em conta, em agosto de 2026, </w:t>
-      </w:r>
-      <w:r>
-        <w:rPr>
-          <w:b/>
-          <w:bCs/>
-        </w:rPr>
-        <w:t xml:space="preserve">R$ 4.233,44</w:t>
+        <w:t xml:space="preserve">Embora o Autor seja servidor público com dois vínculos, sua remuneração bruta não reflete a renda de que efetivamente dispõe. Descontados a previdência, o imposto de renda, a pensão alimentícia judicial e os empréstimos consignados, o Autor recebeu em conta, em setembro de 2026, </w:t>
+      </w:r>
+      <w:r>
+        <w:rPr>
+          <w:b/>
+          <w:bCs/>
+        </w:rPr>
+        <w:t xml:space="preserve">R$ 3.871,05</w:t>
       </w:r>
       <w:r>
         <w:rPr/>
@@ -202,7 +202,7 @@
       </w:pPr>
       <w:r>
         <w:rPr/>
-        <w:t xml:space="preserve">Seu contracheque de agosto de 2026 em Miguel Alves registra remuneração bruta de </w:t>
+        <w:t xml:space="preserve">Seu contracheque de setembro de 2026 em Miguel Alves registra remuneração bruta de </w:t>
       </w:r>
       <w:r>
         <w:rPr>
@@ -213,14 +213,14 @@
       </w:r>
       <w:r>
         <w:rPr/>
-        <w:t xml:space="preserve">, da qual, deduzidos os descontos obrigatórios de previdência (R$ 988,07) e de imposto de renda (R$ 1.901,54), resulta remuneração líquida de </w:t>
-      </w:r>
-      <w:r>
-        <w:rPr>
-          <w:b/>
-          <w:bCs/>
-        </w:rPr>
-        <w:t xml:space="preserve">R$ 10.717,37</w:t>
+        <w:t xml:space="preserve">, da qual, deduzidos os descontos obrigatórios de previdência (R$ 988,07) e de imposto de renda (R$ 1.764,08), resulta remuneração líquida de </w:t>
+      </w:r>
+      <w:r>
+        <w:rPr>
+          <w:b/>
+          <w:bCs/>
+        </w:rPr>
+        <w:t xml:space="preserve">R$ 10.854,83</w:t>
       </w:r>
       <w:r>
         <w:rPr/>
@@ -253,7 +253,7 @@
           <w:b/>
           <w:bCs/>
         </w:rPr>
-        <w:t xml:space="preserve">R$ 14.066,34</w:t>
+        <w:t xml:space="preserve">R$ 14.203,80</w:t>
       </w:r>
       <w:r>
         <w:rPr/>
@@ -264,7 +264,7 @@
           <w:b/>
           <w:bCs/>
         </w:rPr>
-        <w:t xml:space="preserve">R$ 4.923,22</w:t>
+        <w:t xml:space="preserve">R$ 4.971,33</w:t>
       </w:r>
       <w:r>
         <w:rPr/>
@@ -279,18 +279,18 @@
       </w:pPr>
       <w:r>
         <w:rPr/>
-        <w:t xml:space="preserve">Sobre esse valor ainda incide a pensão alimentícia judicial, descontada em folha no valor de R$ 1.815,78 até junho de 2026 e elevada para </w:t>
-      </w:r>
-      <w:r>
-        <w:rPr>
-          <w:b/>
-          <w:bCs/>
-        </w:rPr>
-        <w:t xml:space="preserve">R$ 2.399,76</w:t>
-      </w:r>
-      <w:r>
-        <w:rPr/>
-        <w:t xml:space="preserve"> em agosto de 2026 (23% do bruto).</w:t>
+        <w:t xml:space="preserve">Sobre esse valor ainda incide a pensão alimentícia judicial, descontada em folha no valor de R$ 1.815,78 até junho de 2026 e elevada para 23% do bruto a partir de agosto de 2026, alcançando </w:t>
+      </w:r>
+      <w:r>
+        <w:rPr>
+          <w:b/>
+          <w:bCs/>
+        </w:rPr>
+        <w:t xml:space="preserve">R$ 2.899,61</w:t>
+      </w:r>
+      <w:r>
+        <w:rPr/>
+        <w:t xml:space="preserve"> em setembro.</w:t>
       </w:r>
     </w:p>
     <w:p>
@@ -359,14 +359,14 @@
       </w:r>
       <w:r>
         <w:rPr/>
-        <w:t xml:space="preserve"> mensais (R$ 4.014,86 e R$ 644,95, ambos em 120 parcelas, na 17ª e na 16ª parcela em agosto de 2026; R$ 241,37, em 120 parcelas, iniciado em março de 2026; e R$ 140,35), o que corresponde a </w:t>
-      </w:r>
-      <w:r>
-        <w:rPr>
-          <w:b/>
-          <w:bCs/>
-        </w:rPr>
-        <w:t xml:space="preserve">47,04%</w:t>
+        <w:t xml:space="preserve"> mensais (R$ 4.014,86 e R$ 644,95, ambos em 120 parcelas, na 18ª e na 17ª parcela em setembro de 2026; R$ 241,37, em 120 parcelas, iniciado em março de 2026; e R$ 140,35), o que corresponde a </w:t>
+      </w:r>
+      <w:r>
+        <w:rPr>
+          <w:b/>
+          <w:bCs/>
+        </w:rPr>
+        <w:t xml:space="preserve">46,45%</w:t>
       </w:r>
       <w:r>
         <w:rPr/>
@@ -471,7 +471,7 @@
           <w:b/>
           <w:bCs/>
         </w:rPr>
-        <w:t xml:space="preserve">51,95%</w:t>
+        <w:t xml:space="preserve">51,45%</w:t>
       </w:r>
       <w:r>
         <w:rPr/>
@@ -482,7 +482,7 @@
           <w:b/>
           <w:bCs/>
         </w:rPr>
-        <w:t xml:space="preserve">R$ 2.384,48</w:t>
+        <w:t xml:space="preserve">R$ 2.336,37</w:t>
       </w:r>
       <w:r>
         <w:rPr/>
@@ -609,18 +609,18 @@
           <w:b/>
           <w:bCs/>
         </w:rPr>
-        <w:t xml:space="preserve">88,18%</w:t>
-      </w:r>
-      <w:r>
-        <w:rPr/>
-        <w:t xml:space="preserve"> da remuneração líquida do Autor. Deduzida a pensão alimentícia (R$ 2.399,76), alcançam </w:t>
-      </w:r>
-      <w:r>
-        <w:rPr>
-          <w:b/>
-          <w:bCs/>
-        </w:rPr>
-        <w:t xml:space="preserve">106,32%</w:t>
+        <w:t xml:space="preserve">87,33%</w:t>
+      </w:r>
+      <w:r>
+        <w:rPr/>
+        <w:t xml:space="preserve"> da remuneração líquida do Autor. Deduzida a pensão alimentícia (R$ 2.899,61), alcançam </w:t>
+      </w:r>
+      <w:r>
+        <w:rPr>
+          <w:b/>
+          <w:bCs/>
+        </w:rPr>
+        <w:t xml:space="preserve">109,73%</w:t>
       </w:r>
       <w:r>
         <w:rPr/>
@@ -1112,7 +1112,7 @@
       </w:pPr>
       <w:r>
         <w:rPr/>
-        <w:t xml:space="preserve">A probabilidade do direito está demonstrada pelos contracheques, que revelam consignados correspondentes a 51,95% da remuneração líquida, acima da margem informada pelos próprios órgãos pagadores, e pelos extratos, que comprovam a conta zerada e a concessão automática de novos empréstimos para pagar os anteriores. O perigo de dano decorre da natureza alimentar do salário (art. 7º, X, da CF; art. 833, IV, do CPC): a cada mês, a renda do Autor é absorvida pelas dívidas, e a espera pela audiência agravará o débito, seja pelos novos “empréstimos” automáticos do Banco do Brasil, seja pelos encargos de mora do Bradesco, que elevaram o saldo vencido em quase R$ 20 mil em menos de quatro meses.</w:t>
+        <w:t xml:space="preserve">A probabilidade do direito está demonstrada pelos contracheques, que revelam consignados correspondentes a 51,45% da remuneração líquida, acima da margem informada pelos próprios órgãos pagadores, e pelos extratos, que comprovam a conta zerada e a concessão automática de novos empréstimos para pagar os anteriores. O perigo de dano decorre da natureza alimentar do salário (art. 7º, X, da CF; art. 833, IV, do CPC): a cada mês, a renda do Autor é absorvida pelas dívidas, e a espera pela audiência agravará o débito, seja pelos novos “empréstimos” automáticos do Banco do Brasil, seja pelos encargos de mora do Bradesco, que elevaram o saldo vencido em quase R$ 20 mil em menos de quatro meses.</w:t>
       </w:r>
     </w:p>
     <w:p>
@@ -1162,11 +1162,11 @@
           <w:b/>
           <w:bCs/>
         </w:rPr>
-        <w:t xml:space="preserve">R$ 4.923,22</w:t>
-      </w:r>
-      <w:r>
-        <w:rPr/>
-        <w:t xml:space="preserve">, correspondente a 35% de sua remuneração líquida (R$ 3.751,08 em Miguel Alves e R$ 1.172,14 em União), mediante desconto em folha, pelo prazo de </w:t>
+        <w:t xml:space="preserve">R$ 4.971,33</w:t>
+      </w:r>
+      <w:r>
+        <w:rPr/>
+        <w:t xml:space="preserve">, correspondente a 35% de sua remuneração líquida (R$ 3.799,19 em Miguel Alves e R$ 1.172,14 em União), mediante desconto em folha, pelo prazo de </w:t>
       </w:r>
       <w:r>
         <w:rPr>
@@ -1184,7 +1184,7 @@
           <w:b/>
           <w:bCs/>
         </w:rPr>
-        <w:t xml:space="preserve">R$ 295.393,20</w:t>
+        <w:t xml:space="preserve">R$ 298.279,80</w:t>
       </w:r>
       <w:r>
         <w:rPr/>
@@ -1292,7 +1292,7 @@
       </w:r>
       <w:r>
         <w:rPr/>
-        <w:t xml:space="preserve"> (R$ 3.751,08 em Miguel Alves e R$ 1.172,14 em União), com rateio proporcional entre os contratos e solidariedade dos Réus na observância do limite, oficiando-se à Secretaria Municipal de Educação de Miguel Alves e ao Município de União; (ii) determinar ao Banco do Brasil que se abstenha de debitar da conta corrente do Autor parcelas de empréstimos e de lançar novos “empréstimos” automáticos para cobertura de parcelas; (iii) determinar aos Réus que se abstenham de inscrever o nome do Autor em cadastros de inadimplentes, ou que excluam as inscrições existentes, quanto às dívidas objeto desta ação; e (iv) suspender a exigibilidade dos valores excedentes, sem encargos moratórios, tudo sob pena de multa por ato de descumprimento (art. 537 do CPC);</w:t>
+        <w:t xml:space="preserve"> (R$ 3.799,19 em Miguel Alves e R$ 1.172,14 em União), com rateio proporcional entre os contratos e solidariedade dos Réus na observância do limite, oficiando-se à Secretaria Municipal de Educação de Miguel Alves e ao Município de União; (ii) determinar ao Banco do Brasil que se abstenha de debitar da conta corrente do Autor parcelas de empréstimos e de lançar novos “empréstimos” automáticos para cobertura de parcelas; (iii) determinar aos Réus que se abstenham de inscrever o nome do Autor em cadastros de inadimplentes, ou que excluam as inscrições existentes, quanto às dívidas objeto desta ação; e (iv) suspender a exigibilidade dos valores excedentes, sem encargos moratórios, tudo sob pena de multa por ato de descumprimento (art. 537 do CPC);</w:t>
       </w:r>
     </w:p>
     <w:p>

</xml_diff>

<commit_message>
Inicial Francisco: declaração de margem consignável de Miguel Alves (R$ 1,26, set/2026)
Co-Authored-By: Claude Opus 5.5 <noreply@anthropic.com>
Claude-Session: https://claude.ai/code/session_01EVatDVNz5NJ1N9yNUnzyHx
</commit_message>
<xml_diff>
--- a/Francisco Bernardo Sousa Santos - Superendividamento/Inicial - Repactuação de dívidas - Francisco Bernardo Sousa Santos (minuta).docx
+++ b/Francisco Bernardo Sousa Santos - Superendividamento/Inicial - Repactuação de dívidas - Francisco Bernardo Sousa Santos (minuta).docx
@@ -381,7 +381,18 @@
       </w:r>
       <w:r>
         <w:rPr/>
-        <w:t xml:space="preserve">;</w:t>
+        <w:t xml:space="preserve">, confirmada pela </w:t>
+      </w:r>
+      <w:r>
+        <w:rPr>
+          <w:b/>
+          <w:bCs/>
+        </w:rPr>
+        <w:t xml:space="preserve">Declaração de Margem Consignável</w:t>
+      </w:r>
+      <w:r>
+        <w:rPr/>
+        <w:t xml:space="preserve"> emitida pela Secretaria Municipal de Educação em 07/10/2026, referente a setembro de 2026;</w:t>
       </w:r>
     </w:p>
     <w:p>
@@ -986,7 +997,7 @@
       </w:pPr>
       <w:r>
         <w:rPr/>
-        <w:t xml:space="preserve">A margem consignável não é parâmetro criado pelo Judiciário. Trata-se de limite legal, aplicado por analogia pela jurisprudência, que deveria ter sido observado no momento da concessão do crédito, como expressão do dever de avaliar a capacidade de pagamento. No caso, os próprios contracheques demonstram que os descontos superam a margem em ambos os vínculos: em Miguel Alves, a margem residual é de R$ 1,26; em União, o desconto do Bradesco (R$ 2.266,17) é quase o dobro da margem informada pelo órgão pagador (R$ 1.168,24).</w:t>
+        <w:t xml:space="preserve">A margem consignável não é parâmetro criado pelo Judiciário. Trata-se de limite legal, aplicado por analogia pela jurisprudência, que deveria ter sido observado no momento da concessão do crédito, como expressão do dever de avaliar a capacidade de pagamento. No caso, os próprios contracheques demonstram que os descontos superam a margem em ambos os vínculos: em Miguel Alves, a margem residual é de R$ 1,26, como atesta declaração formal do órgão pagador; em União, o desconto do Bradesco (R$ 2.266,17) é quase o dobro da margem informada pelo órgão pagador (R$ 1.168,24).</w:t>
       </w:r>
     </w:p>
     <w:p>
@@ -1112,7 +1123,7 @@
       </w:pPr>
       <w:r>
         <w:rPr/>
-        <w:t xml:space="preserve">A probabilidade do direito está demonstrada pelos contracheques, que revelam consignados correspondentes a 51,45% da remuneração líquida, acima da margem informada pelos próprios órgãos pagadores, e pelos extratos, que comprovam a conta zerada e a concessão automática de novos empréstimos para pagar os anteriores. O perigo de dano decorre da natureza alimentar do salário (art. 7º, X, da CF; art. 833, IV, do CPC): a cada mês, a renda do Autor é absorvida pelas dívidas, e a espera pela audiência agravará o débito, seja pelos novos “empréstimos” automáticos do Banco do Brasil, seja pelos encargos de mora do Bradesco, que elevaram o saldo vencido em quase R$ 20 mil em menos de quatro meses.</w:t>
+        <w:t xml:space="preserve">A probabilidade do direito está demonstrada pelos contracheques, que revelam consignados correspondentes a 51,45% da remuneração líquida, acima da margem informada pelos próprios órgãos pagadores, pela declaração da Secretaria Municipal de Educação de Miguel Alves que atesta margem de apenas R$ 1,26, e pelos extratos, que comprovam a conta zerada e a concessão automática de novos empréstimos para pagar os anteriores. O perigo de dano decorre da natureza alimentar do salário (art. 7º, X, da CF; art. 833, IV, do CPC): a cada mês, a renda do Autor é absorvida pelas dívidas, e a espera pela audiência agravará o débito, seja pelos novos “empréstimos” automáticos do Banco do Brasil, seja pelos encargos de mora do Bradesco, que elevaram o saldo vencido em quase R$ 20 mil em menos de quatro meses.</w:t>
       </w:r>
     </w:p>
     <w:p>

</xml_diff>

<commit_message>
Inicial Francisco: despesas de água, energia e escola dos filhos; contas em atraso
Co-Authored-By: Claude Opus 5.5 <noreply@anthropic.com>
Claude-Session: https://claude.ai/code/session_01EVatDVNz5NJ1N9yNUnzyHx
</commit_message>
<xml_diff>
--- a/Francisco Bernardo Sousa Santos - Superendividamento/Inicial - Repactuação de dívidas - Francisco Bernardo Sousa Santos (minuta).docx
+++ b/Francisco Bernardo Sousa Santos - Superendividamento/Inicial - Repactuação de dívidas - Francisco Bernardo Sousa Santos (minuta).docx
@@ -761,7 +761,7 @@
           <w:b/>
           <w:bCs/>
         </w:rPr>
-        <w:t xml:space="preserve">R$ 1.984,90</w:t>
+        <w:t xml:space="preserve">R$ 3.148,04</w:t>
       </w:r>
       <w:r>
         <w:rPr/>
@@ -793,7 +793,7 @@
       </w:pPr>
       <w:r>
         <w:rPr/>
-        <w:t xml:space="preserve">2.	aluguel: R$ 600,00;</w:t>
+        <w:t xml:space="preserve">2.	mensalidades escolares dos dois filhos: R$ 890,00 (2 × R$ 445,00);</w:t>
       </w:r>
     </w:p>
     <w:p>
@@ -807,7 +807,7 @@
       </w:pPr>
       <w:r>
         <w:rPr/>
-        <w:t xml:space="preserve">3.	combustível para o deslocamento entre Miguel Alves e União, onde exerce o segundo vínculo: R$ 500,00;</w:t>
+        <w:t xml:space="preserve">3.	aluguel: R$ 600,00;</w:t>
       </w:r>
     </w:p>
     <w:p>
@@ -821,28 +821,71 @@
       </w:pPr>
       <w:r>
         <w:rPr/>
-        <w:t xml:space="preserve">4.	internet: R$ 84,90;</w:t>
-      </w:r>
-    </w:p>
-    <w:p>
-      <w:pPr>
-        <w:spacing w:after="60" w:line="360"/>
-        <w:ind w:firstLine="850"/>
-        <w:jc w:val="both"/>
-      </w:pPr>
-      <w:r>
-        <w:rPr/>
-        <w:t xml:space="preserve">a que se somam as contas de água e energia elétrica </w:t>
-      </w:r>
-      <w:r>
-        <w:rPr>
-          <w:highlight w:val="yellow"/>
-        </w:rPr>
-        <w:t xml:space="preserve">[R$ __]</w:t>
-      </w:r>
-      <w:r>
-        <w:rPr/>
-        <w:t xml:space="preserve">. Essas despesas não são custeadas com regularidade. A própria conta de internet de sua residência (Connect Telecomunicações, R$ 84,90 mensais, serviço indispensável ao exercício da docência), com vencimento em 30/06/2026, só pôde ser emitida em segunda via, para 14/07/2026, já acrescida de encargos de atraso.</w:t>
+        <w:t xml:space="preserve">4.	combustível para o deslocamento entre Miguel Alves e União, onde exerce o segundo vínculo: R$ 500,00;</w:t>
+      </w:r>
+    </w:p>
+    <w:p>
+      <w:pPr>
+        <w:tabs>
+          <w:tab w:val="left" w:pos="1000"/>
+        </w:tabs>
+        <w:spacing w:after="60" w:line="360"/>
+        <w:ind w:left="1000" w:hanging="400"/>
+        <w:jc w:val="both"/>
+      </w:pPr>
+      <w:r>
+        <w:rPr/>
+        <w:t xml:space="preserve">5.	energia elétrica: R$ 221,24 (setembro de 2026);</w:t>
+      </w:r>
+    </w:p>
+    <w:p>
+      <w:pPr>
+        <w:tabs>
+          <w:tab w:val="left" w:pos="1000"/>
+        </w:tabs>
+        <w:spacing w:after="60" w:line="360"/>
+        <w:ind w:left="1000" w:hanging="400"/>
+        <w:jc w:val="both"/>
+      </w:pPr>
+      <w:r>
+        <w:rPr/>
+        <w:t xml:space="preserve">6.	internet: R$ 84,90;</w:t>
+      </w:r>
+    </w:p>
+    <w:p>
+      <w:pPr>
+        <w:tabs>
+          <w:tab w:val="left" w:pos="1000"/>
+        </w:tabs>
+        <w:spacing w:after="60" w:line="360"/>
+        <w:ind w:left="1000" w:hanging="400"/>
+        <w:jc w:val="both"/>
+      </w:pPr>
+      <w:r>
+        <w:rPr/>
+        <w:t xml:space="preserve">7.	água: R$ 51,90 (agosto de 2026).</w:t>
+      </w:r>
+    </w:p>
+    <w:p>
+      <w:pPr>
+        <w:spacing w:after="60" w:line="360"/>
+        <w:ind w:firstLine="850"/>
+        <w:jc w:val="both"/>
+      </w:pPr>
+      <w:r>
+        <w:rPr/>
+        <w:t xml:space="preserve">Essas despesas já não são pagas em dia. A fatura de energia de setembro de 2026 traz multa, juros e correção monetária e registra débito de agosto em aberto (R$ 164,49); a conta de água de agosto de 2026 está vencida e </w:t>
+      </w:r>
+      <w:r>
+        <w:rPr>
+          <w:b/>
+          <w:bCs/>
+        </w:rPr>
+        <w:t xml:space="preserve">sujeita a corte a partir de 08/10/2026</w:t>
+      </w:r>
+      <w:r>
+        <w:rPr/>
+        <w:t xml:space="preserve">; e a conta de internet de junho de 2026, serviço indispensável ao exercício da docência, só pôde ser paga em segunda via, acrescida de encargos. O valor que efetivamente chega à conta do Autor (R$ 3.871,05 em setembro de 2026) mal cobre essas despesas e, ainda assim, é absorvido pelos débitos automáticos do Banco do Brasil.</w:t>
       </w:r>
     </w:p>
     <w:p>

</xml_diff>

<commit_message>
Inicial Francisco: residência alugada na Rua Antônio Dias; contas em nome de terceiros
Co-Authored-By: Claude Opus 5.5 <noreply@anthropic.com>
Claude-Session: https://claude.ai/code/session_01EVatDVNz5NJ1N9yNUnzyHx
</commit_message>
<xml_diff>
--- a/Francisco Bernardo Sousa Santos - Superendividamento/Inicial - Repactuação de dívidas - Francisco Bernardo Sousa Santos (minuta).docx
+++ b/Francisco Bernardo Sousa Santos - Superendividamento/Inicial - Repactuação de dívidas - Francisco Bernardo Sousa Santos (minuta).docx
@@ -312,7 +312,7 @@
       </w:pPr>
       <w:r>
         <w:rPr/>
-        <w:t xml:space="preserve">A situação saiu de controle após o divórcio do Autor, quando passou a arcar com a pensão alimentícia judicial e com o sustento de sua nova família e precisou de nova moradia: a compra do imóvel e as obras foram pagas à vista, com recursos obtidos nos próprios empréstimos bancários, sem financiamento imobiliário ou garantia real. Nesse contexto de fragilidade, as ofertas de crédito continuaram a chegar e a ser aceitas, até que os descontos passaram a consumir praticamente toda a sua remuneração.</w:t>
+        <w:t xml:space="preserve">A situação saiu de controle após o divórcio do Autor, quando passou a arcar com a pensão alimentícia judicial e com o sustento de sua nova família, além da aquisição de um imóvel e das respectivas obras, pagas à vista com recursos obtidos nos próprios empréstimos bancários, sem financiamento imobiliário ou garantia real. Nesse contexto de fragilidade, as ofertas de crédito continuaram a chegar e a ser aceitas, até que os descontos passaram a consumir praticamente toda a sua remuneração.</w:t>
       </w:r>
     </w:p>
     <w:p>
@@ -807,7 +807,7 @@
       </w:pPr>
       <w:r>
         <w:rPr/>
-        <w:t xml:space="preserve">3.	aluguel: R$ 600,00;</w:t>
+        <w:t xml:space="preserve">3.	aluguel do imóvel em que reside, na Rua Antônio Dias, Bairro Beira-Rio: R$ 600,00 (por se tratar de imóvel alugado, as contas de água e energia permanecem em nome de terceiros);</w:t>
       </w:r>
     </w:p>
     <w:p>

</xml_diff>

<commit_message>
Inicial Francisco: relaciona os 11 contratos do BB, consignados de União em atraso, antecipações de 13º, plano com saldo remanescente ao final e valor da causa
Co-Authored-By: Claude Opus 5.5 <noreply@anthropic.com>
Claude-Session: https://claude.ai/code/session_01EVatDVNz5NJ1N9yNUnzyHx
</commit_message>
<xml_diff>
--- a/Francisco Bernardo Sousa Santos - Superendividamento/Inicial - Repactuação de dívidas - Francisco Bernardo Sousa Santos (minuta).docx
+++ b/Francisco Bernardo Sousa Santos - Superendividamento/Inicial - Repactuação de dívidas - Francisco Bernardo Sousa Santos (minuta).docx
@@ -323,7 +323,323 @@
       </w:pPr>
       <w:r>
         <w:rPr/>
-        <w:t xml:space="preserve">Os descontos de empréstimos, extraídos dos próprios contracheques e extratos, são os seguintes:</w:t>
+        <w:t xml:space="preserve">Segundo o próprio aplicativo do Banco do Brasil, o Autor mantém com essa instituição </w:t>
+      </w:r>
+      <w:r>
+        <w:rPr>
+          <w:b/>
+          <w:bCs/>
+        </w:rPr>
+        <w:t xml:space="preserve">onze contratos ativos</w:t>
+      </w:r>
+      <w:r>
+        <w:rPr/>
+        <w:t xml:space="preserve">, que somam </w:t>
+      </w:r>
+      <w:r>
+        <w:rPr>
+          <w:b/>
+          <w:bCs/>
+        </w:rPr>
+        <w:t xml:space="preserve">R$ 345.206,06</w:t>
+      </w:r>
+      <w:r>
+        <w:rPr/>
+        <w:t xml:space="preserve"> em valores liberados:</w:t>
+      </w:r>
+    </w:p>
+    <w:p>
+      <w:pPr>
+        <w:tabs>
+          <w:tab w:val="left" w:pos="1000"/>
+        </w:tabs>
+        <w:spacing w:after="60" w:line="360"/>
+        <w:ind w:left="1000" w:hanging="400"/>
+        <w:jc w:val="both"/>
+      </w:pPr>
+      <w:r>
+        <w:rPr/>
+        <w:t xml:space="preserve">1.	nº 166175821, de 26/09/2024: R$ 46.000,00, em 96 parcelas de R$ 1.137,45 (juros de 2,00% a.m.), descontado na folha de União até abril de 2026;</w:t>
+      </w:r>
+    </w:p>
+    <w:p>
+      <w:pPr>
+        <w:tabs>
+          <w:tab w:val="left" w:pos="1000"/>
+        </w:tabs>
+        <w:spacing w:after="60" w:line="360"/>
+        <w:ind w:left="1000" w:hanging="400"/>
+        <w:jc w:val="both"/>
+      </w:pPr>
+      <w:r>
+        <w:rPr/>
+        <w:t xml:space="preserve">2.	nº 169916342, de 03/12/2024: R$ 45.000,00, em 96 parcelas de R$ 1.122,58 (2,04% a.m.), descontado na folha de União até abril de 2026;</w:t>
+      </w:r>
+    </w:p>
+    <w:p>
+      <w:pPr>
+        <w:tabs>
+          <w:tab w:val="left" w:pos="1000"/>
+        </w:tabs>
+        <w:spacing w:after="60" w:line="360"/>
+        <w:ind w:left="1000" w:hanging="400"/>
+        <w:jc w:val="both"/>
+      </w:pPr>
+      <w:r>
+        <w:rPr/>
+        <w:t xml:space="preserve">3.	nº 179103613, de 16/04/2025: R$ 20.000,00, em 120 parcelas de R$ 644,95 (2,35% a.m.; CET de 3,06% a.m.), descontado na folha de Miguel Alves;</w:t>
+      </w:r>
+    </w:p>
+    <w:p>
+      <w:pPr>
+        <w:tabs>
+          <w:tab w:val="left" w:pos="1000"/>
+        </w:tabs>
+        <w:spacing w:after="60" w:line="360"/>
+        <w:ind w:left="1000" w:hanging="400"/>
+        <w:jc w:val="both"/>
+      </w:pPr>
+      <w:r>
+        <w:rPr/>
+        <w:t xml:space="preserve">4.	nº 180848571 (“BB Crédito Salário”), de 14/05/2025: R$ 11.000,00, em 72 parcelas de R$ 735,60, com juros de </w:t>
+      </w:r>
+      <w:r>
+        <w:rPr>
+          <w:b/>
+          <w:bCs/>
+        </w:rPr>
+        <w:t xml:space="preserve">4,94% a.m.</w:t>
+      </w:r>
+      <w:r>
+        <w:rPr/>
+        <w:t xml:space="preserve"> e </w:t>
+      </w:r>
+      <w:r>
+        <w:rPr>
+          <w:b/>
+          <w:bCs/>
+        </w:rPr>
+        <w:t xml:space="preserve">CET de 81,53% ao ano</w:t>
+      </w:r>
+      <w:r>
+        <w:rPr/>
+        <w:t xml:space="preserve">, debitado em conta corrente;</w:t>
+      </w:r>
+    </w:p>
+    <w:p>
+      <w:pPr>
+        <w:tabs>
+          <w:tab w:val="left" w:pos="1000"/>
+        </w:tabs>
+        <w:spacing w:after="60" w:line="360"/>
+        <w:ind w:left="1000" w:hanging="400"/>
+        <w:jc w:val="both"/>
+      </w:pPr>
+      <w:r>
+        <w:rPr/>
+        <w:t xml:space="preserve">5.	nº 204465045, de 03/03/2026: R$ 7.200,00, em 120 parcelas de R$ 241,37 (2,40% a.m.; CET de 3,25% a.m.), descontado na folha de Miguel Alves;</w:t>
+      </w:r>
+    </w:p>
+    <w:p>
+      <w:pPr>
+        <w:tabs>
+          <w:tab w:val="left" w:pos="1000"/>
+        </w:tabs>
+        <w:spacing w:after="60" w:line="360"/>
+        <w:ind w:left="1000" w:hanging="400"/>
+        <w:jc w:val="both"/>
+      </w:pPr>
+      <w:r>
+        <w:rPr/>
+        <w:t xml:space="preserve">6.	nº 206541263 (“BB Renovação Consignação”), de 09/03/2026: </w:t>
+      </w:r>
+      <w:r>
+        <w:rPr>
+          <w:b/>
+          <w:bCs/>
+        </w:rPr>
+        <w:t xml:space="preserve">R$ 188.859,35</w:t>
+      </w:r>
+      <w:r>
+        <w:rPr/>
+        <w:t xml:space="preserve">, em 120 parcelas de R$ 4.014,58 (1,90% a.m.), descontado na folha de Miguel Alves;</w:t>
+      </w:r>
+    </w:p>
+    <w:p>
+      <w:pPr>
+        <w:tabs>
+          <w:tab w:val="left" w:pos="1000"/>
+        </w:tabs>
+        <w:spacing w:after="60" w:line="360"/>
+        <w:ind w:left="1000" w:hanging="400"/>
+        <w:jc w:val="both"/>
+      </w:pPr>
+      <w:r>
+        <w:rPr/>
+        <w:t xml:space="preserve">7.	nº 208660618, de 31/03/2026: R$ 5.300,00, em 120 parcelas de R$ 140,35 (2,40% a.m.), descontado na folha de Miguel Alves;</w:t>
+      </w:r>
+    </w:p>
+    <w:p>
+      <w:pPr>
+        <w:tabs>
+          <w:tab w:val="left" w:pos="1000"/>
+        </w:tabs>
+        <w:spacing w:after="60" w:line="360"/>
+        <w:ind w:left="1000" w:hanging="400"/>
+        <w:jc w:val="both"/>
+      </w:pPr>
+      <w:r>
+        <w:rPr/>
+        <w:t xml:space="preserve">8.	quatro antecipações de 13º salário (nº 213871312, nº 213871664, nº 213871665 e uma quarta operação), </w:t>
+      </w:r>
+      <w:r>
+        <w:rPr>
+          <w:b/>
+          <w:bCs/>
+        </w:rPr>
+        <w:t xml:space="preserve">todas contratadas no mesmo dia, 26/06/2026</w:t>
+      </w:r>
+      <w:r>
+        <w:rPr/>
+        <w:t xml:space="preserve">, que somam R$ 21.846,71 liberados e </w:t>
+      </w:r>
+      <w:r>
+        <w:rPr>
+          <w:b/>
+          <w:bCs/>
+        </w:rPr>
+        <w:t xml:space="preserve">R$ 25.411,74</w:t>
+      </w:r>
+      <w:r>
+        <w:rPr/>
+        <w:t xml:space="preserve"> a pagar em parcela única, com juros de 3,92% a.m. e CET de até 67,53% ao ano. Três delas, que somam R$ 21.646,35, venceram em setembro de 2026, antes mesmo do pagamento do 13º salário que lhes serviria de garantia.</w:t>
+      </w:r>
+    </w:p>
+    <w:p>
+      <w:pPr>
+        <w:spacing w:after="60" w:line="360"/>
+        <w:ind w:firstLine="850"/>
+        <w:jc w:val="both"/>
+      </w:pPr>
+      <w:r>
+        <w:rPr/>
+        <w:t xml:space="preserve">Com o </w:t>
+      </w:r>
+      <w:r>
+        <w:rPr>
+          <w:b/>
+          <w:bCs/>
+        </w:rPr>
+        <w:t xml:space="preserve">Bradesco</w:t>
+      </w:r>
+      <w:r>
+        <w:rPr/>
+        <w:t xml:space="preserve">, o Autor mantém:</w:t>
+      </w:r>
+    </w:p>
+    <w:p>
+      <w:pPr>
+        <w:tabs>
+          <w:tab w:val="left" w:pos="1000"/>
+        </w:tabs>
+        <w:spacing w:after="60" w:line="360"/>
+        <w:ind w:left="1000" w:hanging="400"/>
+        <w:jc w:val="both"/>
+      </w:pPr>
+      <w:r>
+        <w:rPr/>
+        <w:t xml:space="preserve">1.	o consignado averbado na folha de União desde maio de 2026 (CDC CONSIG. BRADESCO-I), de </w:t>
+      </w:r>
+      <w:r>
+        <w:rPr>
+          <w:b/>
+          <w:bCs/>
+        </w:rPr>
+        <w:t xml:space="preserve">R$ 2.266,17</w:t>
+      </w:r>
+      <w:r>
+        <w:rPr/>
+        <w:t xml:space="preserve"> mensais, cujo contrato não está disponível ao Autor;</w:t>
+      </w:r>
+    </w:p>
+    <w:p>
+      <w:pPr>
+        <w:tabs>
+          <w:tab w:val="left" w:pos="1000"/>
+        </w:tabs>
+        <w:spacing w:after="60" w:line="360"/>
+        <w:ind w:left="1000" w:hanging="400"/>
+        <w:jc w:val="both"/>
+      </w:pPr>
+      <w:r>
+        <w:rPr/>
+        <w:t xml:space="preserve">2.	os contratos nº 503906781 e nº 504307147, celebrados na agência de Miguel Alves em 120 parcelas (R$ 641,28 e R$ 3.392,75, total de </w:t>
+      </w:r>
+      <w:r>
+        <w:rPr>
+          <w:b/>
+          <w:bCs/>
+        </w:rPr>
+        <w:t xml:space="preserve">R$ 4.034,03</w:t>
+      </w:r>
+      <w:r>
+        <w:rPr/>
+        <w:t xml:space="preserve"> mensais), que eram descontados em folha. Com a saída do banco do município, os descontos deixaram de ser feitos, e o Bradesco passou a exigir o pagamento em conta corrente (agência 5792, conta 231325-1): em abril de 2025, o próprio Autor transferiu R$ 4.035,00 para quitar a 8ª parcela de cada contrato. Sem o desconto em folha e com a renda já absorvida pelos demais credores, as parcelas venceram, e o saldo de </w:t>
+      </w:r>
+      <w:r>
+        <w:rPr>
+          <w:b/>
+          <w:bCs/>
+        </w:rPr>
+        <w:t xml:space="preserve">“OPERAÇÕES VENCIDAS”</w:t>
+      </w:r>
+      <w:r>
+        <w:rPr/>
+        <w:t xml:space="preserve"> passou de </w:t>
+      </w:r>
+      <w:r>
+        <w:rPr>
+          <w:b/>
+          <w:bCs/>
+        </w:rPr>
+        <w:t xml:space="preserve">R$ 73.453,99</w:t>
+      </w:r>
+      <w:r>
+        <w:rPr/>
+        <w:t xml:space="preserve"> em 18/06/2026 para </w:t>
+      </w:r>
+      <w:r>
+        <w:rPr>
+          <w:b/>
+          <w:bCs/>
+        </w:rPr>
+        <w:t xml:space="preserve">R$ 93.223,57</w:t>
+      </w:r>
+      <w:r>
+        <w:rPr/>
+        <w:t xml:space="preserve"> em 14/10/2026, um acréscimo de </w:t>
+      </w:r>
+      <w:r>
+        <w:rPr>
+          <w:b/>
+          <w:bCs/>
+        </w:rPr>
+        <w:t xml:space="preserve">R$ 19.769,58 (26,9%) em menos de quatro meses</w:t>
+      </w:r>
+      <w:r>
+        <w:rPr/>
+        <w:t xml:space="preserve">, apenas com encargos de mora.</w:t>
+      </w:r>
+    </w:p>
+    <w:p>
+      <w:pPr>
+        <w:spacing w:after="60" w:line="360"/>
+        <w:ind w:firstLine="850"/>
+        <w:jc w:val="both"/>
+      </w:pPr>
+      <w:r>
+        <w:rPr/>
+        <w:t xml:space="preserve">O impacto desses contratos sobre a remuneração do Autor, extraído dos contracheques, é o seguinte:</w:t>
       </w:r>
     </w:p>
     <w:p>
@@ -348,7 +664,7 @@
       </w:r>
       <w:r>
         <w:rPr/>
-        <w:t xml:space="preserve">, quatro consignados do Banco do Brasil somam </w:t>
+        <w:t xml:space="preserve">, os quatro consignados do Banco do Brasil (contratos 3, 5, 6 e 7) consomem </w:t>
       </w:r>
       <w:r>
         <w:rPr>
@@ -359,7 +675,7 @@
       </w:r>
       <w:r>
         <w:rPr/>
-        <w:t xml:space="preserve"> mensais (R$ 4.014,86 e R$ 644,95, ambos em 120 parcelas, na 18ª e na 17ª parcela em setembro de 2026; R$ 241,37, em 120 parcelas, iniciado em março de 2026; e R$ 140,35), o que corresponde a </w:t>
+        <w:t xml:space="preserve"> mensais, o que corresponde a </w:t>
       </w:r>
       <w:r>
         <w:rPr>
@@ -417,7 +733,7 @@
       </w:r>
       <w:r>
         <w:rPr/>
-        <w:t xml:space="preserve">, o consignado do Bradesco (CDC CONSIG. BRADESCO-I) consome </w:t>
+        <w:t xml:space="preserve">, a partir de maio de 2026, os dois consignados do Banco do Brasil (contratos 1 e 2) deixaram de ser descontados em folha, onde passou a figurar o consignado do Bradesco, de </w:t>
       </w:r>
       <w:r>
         <w:rPr>
@@ -428,7 +744,7 @@
       </w:r>
       <w:r>
         <w:rPr/>
-        <w:t xml:space="preserve"> mensais, isto é, </w:t>
+        <w:t xml:space="preserve">, isto é, </w:t>
       </w:r>
       <w:r>
         <w:rPr>
@@ -450,21 +766,21 @@
       </w:r>
       <w:r>
         <w:rPr/>
-        <w:t xml:space="preserve">. Até abril de 2026, essa mesma margem era ocupada por dois contratos do Banco do Brasil (R$ 1.137,45 e R$ 1.122,58);</w:t>
-      </w:r>
-    </w:p>
-    <w:p>
-      <w:pPr>
-        <w:tabs>
-          <w:tab w:val="left" w:pos="1000"/>
-        </w:tabs>
-        <w:spacing w:after="60" w:line="360"/>
-        <w:ind w:left="1000" w:hanging="400"/>
-        <w:jc w:val="both"/>
-      </w:pPr>
-      <w:r>
-        <w:rPr/>
-        <w:t xml:space="preserve">3.	somados, os consignados alcançam </w:t>
+        <w:t xml:space="preserve">. Os contratos do Banco do Brasil continuam ativos e passaram a ser cobrados em conta corrente, onde estão em atraso desde julho e agosto de 2026;</w:t>
+      </w:r>
+    </w:p>
+    <w:p>
+      <w:pPr>
+        <w:tabs>
+          <w:tab w:val="left" w:pos="1000"/>
+        </w:tabs>
+        <w:spacing w:after="60" w:line="360"/>
+        <w:ind w:left="1000" w:hanging="400"/>
+        <w:jc w:val="both"/>
+      </w:pPr>
+      <w:r>
+        <w:rPr/>
+        <w:t xml:space="preserve">3.	somados, os consignados em folha alcançam </w:t>
       </w:r>
       <w:r>
         <w:rPr>
@@ -497,119 +813,25 @@
       </w:r>
       <w:r>
         <w:rPr/>
-        <w:t xml:space="preserve"> por mês;</w:t>
-      </w:r>
-    </w:p>
-    <w:p>
-      <w:pPr>
-        <w:tabs>
-          <w:tab w:val="left" w:pos="1000"/>
-        </w:tabs>
-        <w:spacing w:after="60" w:line="360"/>
-        <w:ind w:left="1000" w:hanging="400"/>
-        <w:jc w:val="both"/>
-      </w:pPr>
-      <w:r>
-        <w:rPr/>
-        <w:t xml:space="preserve">4.	além dos consignados, o Banco do Brasil debita diretamente da conta corrente em que o Autor recebe seus vencimentos (agência 2298-5, conta 6198-0) as parcelas dos contratos nº 180848571 (BB Crédito Salário, cerca de R$ 764,66 mensais), nº 196434985 (BB Crédito Renegociação I) e nº 166175821 (BB Crédito Consignação, R$ 1.118,27 debitados em 31/07/2026), além de parcelas de CDC que somaram R$ 3.086,42 em agosto de 2026 e de seguros vinculados à conta;</w:t>
-      </w:r>
-    </w:p>
-    <w:p>
-      <w:pPr>
-        <w:tabs>
-          <w:tab w:val="left" w:pos="1000"/>
-        </w:tabs>
-        <w:spacing w:after="60" w:line="360"/>
-        <w:ind w:left="1000" w:hanging="400"/>
-        <w:jc w:val="both"/>
-      </w:pPr>
-      <w:r>
-        <w:rPr/>
-        <w:t xml:space="preserve">5.	no </w:t>
-      </w:r>
-      <w:r>
-        <w:rPr>
-          <w:b/>
-          <w:bCs/>
-        </w:rPr>
-        <w:t xml:space="preserve">Bradesco</w:t>
-      </w:r>
-      <w:r>
-        <w:rPr/>
-        <w:t xml:space="preserve">, os contratos nº 503906781 e nº 504307147, celebrados na agência de Miguel Alves em 120 parcelas (R$ 641,28 e R$ 3.392,75, total de </w:t>
-      </w:r>
-      <w:r>
-        <w:rPr>
-          <w:b/>
-          <w:bCs/>
-        </w:rPr>
-        <w:t xml:space="preserve">R$ 4.034,03</w:t>
-      </w:r>
-      <w:r>
-        <w:rPr/>
-        <w:t xml:space="preserve"> mensais), eram descontados em folha. Com a saída do banco do município, os descontos deixaram de ser feitos, e o Bradesco passou a exigir o pagamento em conta corrente (agência 5792, conta 231325-1): em abril de 2025, o próprio Autor transferiu R$ 4.035,00 para quitar a 8ª parcela de cada contrato. Sem o desconto em folha e com a renda já absorvida pelos demais credores, as parcelas venceram, e o saldo de </w:t>
-      </w:r>
-      <w:r>
-        <w:rPr>
-          <w:b/>
-          <w:bCs/>
-        </w:rPr>
-        <w:t xml:space="preserve">“OPERAÇÕES VENCIDAS”</w:t>
-      </w:r>
-      <w:r>
-        <w:rPr/>
-        <w:t xml:space="preserve"> passou de </w:t>
-      </w:r>
-      <w:r>
-        <w:rPr>
-          <w:b/>
-          <w:bCs/>
-        </w:rPr>
-        <w:t xml:space="preserve">R$ 73.453,99</w:t>
-      </w:r>
-      <w:r>
-        <w:rPr/>
-        <w:t xml:space="preserve"> em 18/06/2026 para </w:t>
-      </w:r>
-      <w:r>
-        <w:rPr>
-          <w:b/>
-          <w:bCs/>
-        </w:rPr>
-        <w:t xml:space="preserve">R$ 93.223,57</w:t>
-      </w:r>
-      <w:r>
-        <w:rPr/>
-        <w:t xml:space="preserve"> em 14/10/2026, um acréscimo de </w:t>
-      </w:r>
-      <w:r>
-        <w:rPr>
-          <w:b/>
-          <w:bCs/>
-        </w:rPr>
-        <w:t xml:space="preserve">R$ 19.769,58 (26,9%) em menos de quatro meses</w:t>
-      </w:r>
-      <w:r>
-        <w:rPr/>
-        <w:t xml:space="preserve">, apenas com encargos de mora.</w:t>
-      </w:r>
-    </w:p>
-    <w:p>
-      <w:pPr>
-        <w:spacing w:after="60" w:line="360"/>
-        <w:ind w:firstLine="850"/>
-        <w:jc w:val="both"/>
-      </w:pPr>
-      <w:r>
-        <w:rPr/>
-        <w:t xml:space="preserve">Somadas as parcelas em folha e em conta corrente, as cobranças mensais atingem cerca de </w:t>
-      </w:r>
-      <w:r>
-        <w:rPr>
-          <w:b/>
-          <w:bCs/>
-        </w:rPr>
-        <w:t xml:space="preserve">R$ 12.403,80</w:t>
+        <w:t xml:space="preserve"> por mês.</w:t>
+      </w:r>
+    </w:p>
+    <w:p>
+      <w:pPr>
+        <w:spacing w:after="60" w:line="360"/>
+        <w:ind w:firstLine="850"/>
+        <w:jc w:val="both"/>
+      </w:pPr>
+      <w:r>
+        <w:rPr/>
+        <w:t xml:space="preserve">Somadas às parcelas cobradas em conta corrente pelo Banco do Brasil (R$ 2.260,03 dos consignados de União e R$ 735,60 do Crédito Salário), as cobranças mensais atingem </w:t>
+      </w:r>
+      <w:r>
+        <w:rPr>
+          <w:b/>
+          <w:bCs/>
+        </w:rPr>
+        <w:t xml:space="preserve">R$ 10.303,33</w:t>
       </w:r>
       <w:r>
         <w:rPr/>
@@ -620,33 +842,77 @@
           <w:b/>
           <w:bCs/>
         </w:rPr>
-        <w:t xml:space="preserve">87,33%</w:t>
-      </w:r>
-      <w:r>
-        <w:rPr/>
-        <w:t xml:space="preserve"> da remuneração líquida do Autor. Deduzida a pensão alimentícia (R$ 2.899,61), alcançam </w:t>
-      </w:r>
-      <w:r>
-        <w:rPr>
-          <w:b/>
-          <w:bCs/>
-        </w:rPr>
-        <w:t xml:space="preserve">109,73%</w:t>
-      </w:r>
-      <w:r>
-        <w:rPr/>
-        <w:t xml:space="preserve"> do que lhe resta, sem contar as parcelas vencidas do Bradesco, que, se exigidas, somariam mais R$ 4.034,03 por mês.</w:t>
-      </w:r>
-    </w:p>
-    <w:p>
-      <w:pPr>
-        <w:spacing w:after="60" w:line="360"/>
-        <w:ind w:firstLine="850"/>
-        <w:jc w:val="both"/>
-      </w:pPr>
-      <w:r>
-        <w:rPr/>
-        <w:t xml:space="preserve">O extrato de março de 2026 revela como se formou esse quadro. Em menos de um mês, o Banco do Brasil concedeu ao Autor três novos créditos consignados e, no mesmo dia de cada liberação, reteve parte do valor para amortizar a renegociação anterior (contrato nº 196434985):</w:t>
+        <w:t xml:space="preserve">72,54%</w:t>
+      </w:r>
+      <w:r>
+        <w:rPr/>
+        <w:t xml:space="preserve"> da remuneração líquida do Autor e </w:t>
+      </w:r>
+      <w:r>
+        <w:rPr>
+          <w:b/>
+          <w:bCs/>
+        </w:rPr>
+        <w:t xml:space="preserve">91,15%</w:t>
+      </w:r>
+      <w:r>
+        <w:rPr/>
+        <w:t xml:space="preserve"> do que lhe resta após a pensão alimentícia. Acrescidas as parcelas do Bradesco de Miguel Alves (R$ 4.034,03), chegariam a </w:t>
+      </w:r>
+      <w:r>
+        <w:rPr>
+          <w:b/>
+          <w:bCs/>
+        </w:rPr>
+        <w:t xml:space="preserve">R$ 14.337,36</w:t>
+      </w:r>
+      <w:r>
+        <w:rPr/>
+        <w:t xml:space="preserve">, mais do que toda a sua remuneração líquida (</w:t>
+      </w:r>
+      <w:r>
+        <w:rPr>
+          <w:b/>
+          <w:bCs/>
+        </w:rPr>
+        <w:t xml:space="preserve">100,94%</w:t>
+      </w:r>
+      <w:r>
+        <w:rPr/>
+        <w:t xml:space="preserve">). Além disso, estão vencidos R$ 21.646,35 das antecipações de 13º salário.</w:t>
+      </w:r>
+    </w:p>
+    <w:p>
+      <w:pPr>
+        <w:spacing w:after="60" w:line="360"/>
+        <w:ind w:firstLine="850"/>
+        <w:jc w:val="both"/>
+      </w:pPr>
+      <w:r>
+        <w:rPr/>
+        <w:t xml:space="preserve">Os próprios contratos revelam como se formou esse quadro. Em março de 2026, com margem consignável praticamente nula, o Banco do Brasil celebrou </w:t>
+      </w:r>
+      <w:r>
+        <w:rPr>
+          <w:b/>
+          <w:bCs/>
+        </w:rPr>
+        <w:t xml:space="preserve">três contratos consignados em menos de um mês</w:t>
+      </w:r>
+      <w:r>
+        <w:rPr/>
+        <w:t xml:space="preserve"> (contratos 5, 6 e 7). A “Renovação Consignação” de 09/03/2026, de R$ 188.859,35, foi usada quase integralmente para quitar contratos anteriores do próprio banco: apenas </w:t>
+      </w:r>
+      <w:r>
+        <w:rPr>
+          <w:b/>
+          <w:bCs/>
+        </w:rPr>
+        <w:t xml:space="preserve">R$ 7.500,00</w:t>
+      </w:r>
+      <w:r>
+        <w:rPr/>
+        <w:t xml:space="preserve"> foram creditados na conta do Autor, e, desse valor, R$ 2.274,12 foram debitados no mesmo dia para amortizar a renegociação nº 196434985. O mesmo ocorreu com os demais créditos do mês:</w:t>
       </w:r>
     </w:p>
     <w:p>
@@ -671,7 +937,7 @@
       </w:r>
       <w:r>
         <w:rPr/>
-        <w:t xml:space="preserve">, liberou R$ 7.200,00 (contrato nº 204465045) e debitou R$ 4.785,98;</w:t>
+        <w:t xml:space="preserve">, creditou R$ 7.200,00 (contrato nº 204465045) e debitou R$ 4.785,98;</w:t>
       </w:r>
     </w:p>
     <w:p>
@@ -696,7 +962,7 @@
       </w:r>
       <w:r>
         <w:rPr/>
-        <w:t xml:space="preserve">, liberou R$ 7.500,00 (contrato nº 206541263, “BB Renovação Consignação”) e debitou R$ 2.274,12;</w:t>
+        <w:t xml:space="preserve">, creditou R$ 7.500,00 (contrato nº 206541263) e debitou R$ 2.274,12;</w:t>
       </w:r>
     </w:p>
     <w:p>
@@ -721,29 +987,29 @@
       </w:r>
       <w:r>
         <w:rPr/>
-        <w:t xml:space="preserve">, liberou R$ 5.300,00 (contrato nº 208660618) e debitou R$ 1.201,27.</w:t>
-      </w:r>
-    </w:p>
-    <w:p>
-      <w:pPr>
-        <w:spacing w:after="60" w:line="360"/>
-        <w:ind w:firstLine="850"/>
-        <w:jc w:val="both"/>
-      </w:pPr>
-      <w:r>
-        <w:rPr/>
-        <w:t xml:space="preserve">Dos R$ 20.000,00 liberados, </w:t>
-      </w:r>
-      <w:r>
-        <w:rPr>
-          <w:b/>
-          <w:bCs/>
-        </w:rPr>
-        <w:t xml:space="preserve">R$ 8.261,37</w:t>
-      </w:r>
-      <w:r>
-        <w:rPr/>
-        <w:t xml:space="preserve"> voltaram imediatamente ao próprio banco. Nos meses seguintes, os extratos de junho e agosto de 2026 registram, nos lançamentos futuros, créditos automáticos sob a rubrica “EMPRÉSTIMO” destinados a cobrir parcelas de “Pagamento Empréstimo CDC” que o saldo zerado não comportava. Em 06/08/2026, por exemplo, foram lançados débitos de R$ 1.156,24, R$ 19,73, R$ 19,75, R$ 1.155,10 e R$ 735,60, acompanhados de novos “empréstimos” de R$ 1.155,10 e R$ 19,73. O banco toma, em nome do consumidor, novo crédito para pagar o crédito anterior, num ciclo que só faz crescer a dívida.</w:t>
+        <w:t xml:space="preserve">, creditou R$ 5.300,00 (contrato nº 208660618) e debitou R$ 1.201,27.</w:t>
+      </w:r>
+    </w:p>
+    <w:p>
+      <w:pPr>
+        <w:spacing w:after="60" w:line="360"/>
+        <w:ind w:firstLine="850"/>
+        <w:jc w:val="both"/>
+      </w:pPr>
+      <w:r>
+        <w:rPr/>
+        <w:t xml:space="preserve">Em troca de 120 parcelas de R$ 4.014,58 — </w:t>
+      </w:r>
+      <w:r>
+        <w:rPr>
+          <w:b/>
+          <w:bCs/>
+        </w:rPr>
+        <w:t xml:space="preserve">R$ 481.749,60</w:t>
+      </w:r>
+      <w:r>
+        <w:rPr/>
+        <w:t xml:space="preserve"> ao final —, o Autor recebeu, em março de 2026, pouco mais de R$ 5.000,00 em dinheiro. Três meses depois, sem qualquer margem, recebeu mais quatro antecipações de 13º salário no mesmo dia. Os extratos de junho e agosto de 2026 registram ainda, nos lançamentos futuros, créditos automáticos sob a rubrica “EMPRÉSTIMO” destinados a cobrir as parcelas em atraso, acrescidas de encargos, dos consignados de União e do Crédito Salário: em 06/08/2026, por exemplo, débitos de R$ 1.156,24, R$ 1.155,10 e R$ 735,60, acompanhados de novos “empréstimos” de R$ 1.155,10 e R$ 19,73. O banco toma, em nome do consumidor, novo crédito para pagar o crédito anterior, num ciclo que só faz crescer a dívida.</w:t>
       </w:r>
     </w:p>
     <w:p>
@@ -1082,7 +1348,7 @@
       </w:pPr>
       <w:r>
         <w:rPr/>
-        <w:t xml:space="preserve">O mesmo se verifica aqui, com o agravante de que o Banco do Brasil liberou três consignados em um único mês para amortizar sua própria renegociação e passou a lançar “empréstimos” automáticos para cobrir parcelas de outros empréstimos. O descumprimento dos deveres de crédito responsável autoriza a redução dos juros e encargos e a dilação do prazo de pagamento (art. 54-D, parágrafo único, do CDC).</w:t>
+        <w:t xml:space="preserve">O mesmo se verifica aqui, com o agravante de que o Banco do Brasil celebrou três consignados em um único mês, com margem de R$ 1,26, usando-os para quitar seus próprios contratos, concedeu quatro antecipações de 13º salário no mesmo dia e passou a lançar “empréstimos” automáticos para cobrir parcelas de outros empréstimos. O descumprimento dos deveres de crédito responsável autoriza a redução dos juros e encargos e a dilação do prazo de pagamento (art. 54-D, parágrafo único, do CDC).</w:t>
       </w:r>
     </w:p>
     <w:p>
@@ -1231,18 +1497,18 @@
       </w:r>
       <w:r>
         <w:rPr/>
-        <w:t xml:space="preserve">, totalizando </w:t>
-      </w:r>
-      <w:r>
-        <w:rPr>
-          <w:b/>
-          <w:bCs/>
-        </w:rPr>
-        <w:t xml:space="preserve">R$ 298.279,80</w:t>
-      </w:r>
-      <w:r>
-        <w:rPr/>
         <w:t xml:space="preserve">, rateado entre os credores na proporção dos respectivos saldos devedores, a serem apurados após a exibição dos demonstrativos pelos Réus.</w:t>
+      </w:r>
+    </w:p>
+    <w:p>
+      <w:pPr>
+        <w:spacing w:after="60" w:line="360"/>
+        <w:ind w:firstLine="850"/>
+        <w:jc w:val="both"/>
+      </w:pPr>
+      <w:r>
+        <w:rPr/>
+        <w:t xml:space="preserve">Como o montante das dívidas, pelos elementos disponíveis, supera o que o Autor pode pagar em 60 meses sem comprometer o mínimo existencial, requer que o saldo eventualmente remanescente seja pago ao final, nas mesmas condições, sem juros de mora e com a redução dos juros remuneratórios autorizada pelo art. 54-D, parágrafo único, do CDC, solução semelhante à adotada por este Juízo no Processo nº 0800070-46.2025.8.18.0061, em que se determinou o pagamento do saldo remanescente ao final dos contratos, sem juros de mora.</w:t>
       </w:r>
     </w:p>
     <w:p>
@@ -1346,7 +1612,7 @@
       </w:r>
       <w:r>
         <w:rPr/>
-        <w:t xml:space="preserve"> (R$ 3.799,19 em Miguel Alves e R$ 1.172,14 em União), com rateio proporcional entre os contratos e solidariedade dos Réus na observância do limite, oficiando-se à Secretaria Municipal de Educação de Miguel Alves e ao Município de União; (ii) determinar ao Banco do Brasil que se abstenha de debitar da conta corrente do Autor parcelas de empréstimos e de lançar novos “empréstimos” automáticos para cobertura de parcelas; (iii) determinar aos Réus que se abstenham de inscrever o nome do Autor em cadastros de inadimplentes, ou que excluam as inscrições existentes, quanto às dívidas objeto desta ação; e (iv) suspender a exigibilidade dos valores excedentes, sem encargos moratórios, tudo sob pena de multa por ato de descumprimento (art. 537 do CPC);</w:t>
+        <w:t xml:space="preserve"> (R$ 3.799,19 em Miguel Alves e R$ 1.172,14 em União), com rateio proporcional entre os contratos e solidariedade dos Réus na observância do limite, oficiando-se à Secretaria Municipal de Educação de Miguel Alves e ao Município de União; (ii) determinar ao Banco do Brasil que se abstenha de debitar da conta corrente do Autor parcelas de empréstimos, de reter seu 13º salário para quitação das antecipações contratadas e de lançar novos “empréstimos” automáticos para cobertura de parcelas; (iii) determinar aos Réus que se abstenham de inscrever o nome do Autor em cadastros de inadimplentes, ou que excluam as inscrições existentes, quanto às dívidas objeto desta ação; e (iv) suspender a exigibilidade dos valores excedentes, sem encargos moratórios, tudo sob pena de multa por ato de descumprimento (art. 537 do CPC);</w:t>
       </w:r>
     </w:p>
     <w:p>
@@ -1396,7 +1662,7 @@
       </w:r>
       <w:r>
         <w:rPr/>
-        <w:t xml:space="preserve"> (art. 6º, VIII, do CDC), determinando-se que os Réus apresentem, até 15 (quinze) dias antes da audiência, os contratos firmados com o Autor, os comprovantes de consulta e averbação de margem e o demonstrativo atualizado do saldo devedor de cada operação;</w:t>
+        <w:t xml:space="preserve"> (art. 6º, VIII, do CDC), determinando-se que os Réus apresentem, até 15 (quinze) dias antes da audiência, os contratos firmados com o Autor, inclusive, quanto ao Bradesco, o consignado averbado na folha de União e os contratos nº 503906781 e nº 504307147, os comprovantes de consulta e averbação de margem e o demonstrativo atualizado do saldo devedor de cada operação;</w:t>
       </w:r>
     </w:p>
     <w:p>
@@ -1432,7 +1698,7 @@
       </w:r>
       <w:r>
         <w:rPr/>
-        <w:t xml:space="preserve"> (art. 104-B do CDC), com a redução de juros e encargos prevista no art. 54-D, parágrafo único, do CDC e o pagamento do saldo remanescente sem acréscimo de juros moratórios;</w:t>
+        <w:t xml:space="preserve"> (art. 104-B do CDC), com a redução de juros e encargos prevista no art. 54-D, parágrafo único, do CDC e o pagamento do saldo remanescente ao final, sem juros de mora;</w:t>
       </w:r>
     </w:p>
     <w:p>
@@ -1475,19 +1741,11 @@
           <w:b/>
           <w:bCs/>
         </w:rPr>
-        <w:t xml:space="preserve">R$ </w:t>
-      </w:r>
-      <w:r>
-        <w:rPr>
-          <w:b/>
-          <w:bCs/>
-          <w:highlight w:val="yellow"/>
-        </w:rPr>
-        <w:t xml:space="preserve">[__]</w:t>
-      </w:r>
-      <w:r>
-        <w:rPr/>
-        <w:t xml:space="preserve">, correspondente à soma dos saldos devedores das dívidas submetidas ao procedimento.</w:t>
+        <w:t xml:space="preserve">R$ 438.429,63</w:t>
+      </w:r>
+      <w:r>
+        <w:rPr/>
+        <w:t xml:space="preserve">, correspondente à soma dos valores liberados nos contratos do Banco do Brasil (R$ 345.206,06) e do saldo vencido junto ao Bradesco (R$ 93.223,57), sem prejuízo de sua retificação após a exibição dos demonstrativos de saldo devedor.</w:t>
       </w:r>
     </w:p>
     <w:p>

</xml_diff>

<commit_message>
Inicial Francisco: débitos do BB no dia da liberação dos créditos de 13º (26/06/2026) e renegociação 212050896
Co-Authored-By: Claude Opus 5.5 <noreply@anthropic.com>
Claude-Session: https://claude.ai/code/session_01EVatDVNz5NJ1N9yNUnzyHx
</commit_message>
<xml_diff>
--- a/Francisco Bernardo Sousa Santos - Superendividamento/Inicial - Repactuação de dívidas - Francisco Bernardo Sousa Santos (minuta).docx
+++ b/Francisco Bernardo Sousa Santos - Superendividamento/Inicial - Repactuação de dívidas - Francisco Bernardo Sousa Santos (minuta).docx
@@ -1009,7 +1009,18 @@
       </w:r>
       <w:r>
         <w:rPr/>
-        <w:t xml:space="preserve"> ao final —, o Autor recebeu, em março de 2026, pouco mais de R$ 5.000,00 em dinheiro. Três meses depois, sem qualquer margem, recebeu mais quatro antecipações de 13º salário no mesmo dia. Os extratos de junho e agosto de 2026 registram ainda, nos lançamentos futuros, créditos automáticos sob a rubrica “EMPRÉSTIMO” destinados a cobrir as parcelas em atraso, acrescidas de encargos, dos consignados de União e do Crédito Salário: em 06/08/2026, por exemplo, débitos de R$ 1.156,24, R$ 1.155,10 e R$ 735,60, acompanhados de novos “empréstimos” de R$ 1.155,10 e R$ 19,73. O banco toma, em nome do consumidor, novo crédito para pagar o crédito anterior, num ciclo que só faz crescer a dívida.</w:t>
+        <w:t xml:space="preserve"> ao final —, o Autor recebeu, em março de 2026, pouco mais de R$ 5.000,00 em dinheiro. Três meses depois, sem qualquer margem, recebeu mais quatro antecipações de 13º salário no mesmo dia, e o padrão se repetiu: em 26/06/2026, mesma data em que creditou os R$ 21.846,71, o banco debitou </w:t>
+      </w:r>
+      <w:r>
+        <w:rPr>
+          <w:b/>
+          <w:bCs/>
+        </w:rPr>
+        <w:t xml:space="preserve">R$ 3.322,93</w:t>
+      </w:r>
+      <w:r>
+        <w:rPr/>
+        <w:t xml:space="preserve"> para cobrir parcelas em atraso de seus próprios contratos (R$ 1.196,73 e R$ 1.181,56 dos consignados de União, R$ 773,95 do Crédito Salário, R$ 163,09 da renegociação nº 212050896 e tarifas). Os extratos de junho e agosto de 2026 registram ainda, nos lançamentos futuros, créditos automáticos sob a rubrica “EMPRÉSTIMO” destinados a cobrir as parcelas em atraso, acrescidas de encargos, dos consignados de União e do Crédito Salário: em 06/08/2026, por exemplo, débitos de R$ 1.156,24, R$ 1.155,10 e R$ 735,60, acompanhados de novos “empréstimos” de R$ 1.155,10 e R$ 19,73. O banco toma, em nome do consumidor, novo crédito para pagar o crédito anterior, num ciclo que só faz crescer a dívida.</w:t>
       </w:r>
     </w:p>
     <w:p>
@@ -1662,7 +1673,7 @@
       </w:r>
       <w:r>
         <w:rPr/>
-        <w:t xml:space="preserve"> (art. 6º, VIII, do CDC), determinando-se que os Réus apresentem, até 15 (quinze) dias antes da audiência, os contratos firmados com o Autor, inclusive, quanto ao Bradesco, o consignado averbado na folha de União e os contratos nº 503906781 e nº 504307147, os comprovantes de consulta e averbação de margem e o demonstrativo atualizado do saldo devedor de cada operação;</w:t>
+        <w:t xml:space="preserve"> (art. 6º, VIII, do CDC), determinando-se que os Réus apresentem, até 15 (quinze) dias antes da audiência, os contratos firmados com o Autor, inclusive as renegociações nº 196434985 e nº 212050896 do Banco do Brasil e, quanto ao Bradesco, o consignado averbado na folha de União e os contratos nº 503906781 e nº 504307147, os comprovantes de consulta e averbação de margem e o demonstrativo atualizado do saldo devedor de cada operação;</w:t>
       </w:r>
     </w:p>
     <w:p>

</xml_diff>